<commit_message>
docs(video): cerrar cinco clips y regenerar entrega Word validada
</commit_message>
<xml_diff>
--- a/entregables/Seccion 4 - Validacion.docx
+++ b/entregables/Seccion 4 - Validacion.docx
@@ -1,6 +1,6 @@
 
 <file path=word/document.xml><?xml version="1.0" encoding="utf-8"?>
-<w:document xmlns:mc="http://schemas.openxmlformats.org/markup-compatibility/2006" xmlns:o="urn:schemas-microsoft-com:office:office" xmlns:r="http://schemas.openxmlformats.org/officeDocument/2006/relationships" xmlns:m="http://schemas.openxmlformats.org/officeDocument/2006/math" xmlns:v="urn:schemas-microsoft-com:vml" xmlns:wp="http://schemas.openxmlformats.org/drawingml/2006/wordprocessingDrawing" xmlns:w10="urn:schemas-microsoft-com:office:word" xmlns:w="http://schemas.openxmlformats.org/wordprocessingml/2006/main" xmlns:wne="http://schemas.microsoft.com/office/word/2006/wordml" xmlns:sl="http://schemas.openxmlformats.org/schemaLibrary/2006/main" xmlns:a="http://schemas.openxmlformats.org/drawingml/2006/main" xmlns:pic="http://schemas.openxmlformats.org/drawingml/2006/picture" xmlns:c="http://schemas.openxmlformats.org/drawingml/2006/chart" xmlns:lc="http://schemas.openxmlformats.org/drawingml/2006/lockedCanvas" xmlns:dgm="http://schemas.openxmlformats.org/drawingml/2006/diagram" xmlns:wps="http://schemas.microsoft.com/office/word/2010/wordprocessingShape" xmlns:wpg="http://schemas.microsoft.com/office/word/2010/wordprocessingGroup" xmlns:w14="http://schemas.microsoft.com/office/word/2010/wordml" xmlns:w15="http://schemas.microsoft.com/office/word/2012/wordml" xmlns:w16="http://schemas.microsoft.com/office/word/2018/wordml" xmlns:w16cex="http://schemas.microsoft.com/office/word/2018/wordml/cex" xmlns:w16cid="http://schemas.microsoft.com/office/word/2016/wordml/cid" xmlns="http://schemas.microsoft.com/office/tasks/2019/documenttasks" xmlns:cr="http://schemas.microsoft.com/office/comments/2020/reactions">
+<w:document xmlns:ns1="http://schemas.openxmlformats.org/drawingml/2006/wordprocessingDrawing" xmlns:ns2="http://schemas.openxmlformats.org/drawingml/2006/main" xmlns:ns3="http://schemas.openxmlformats.org/drawingml/2006/picture" xmlns:r="http://schemas.openxmlformats.org/officeDocument/2006/relationships" xmlns:w="http://schemas.openxmlformats.org/wordprocessingml/2006/main">
   <w:body>
     <w:p>
       <w:pPr>
@@ -12905,6 +12905,512 @@
       </w:r>
     </w:p>
     <w:p>
+      <w:pPr>
+        <w:spacing w:before="170" w:after="120"/>
+        <w:keepNext/>
+      </w:pPr>
+      <w:r>
+        <w:rPr>
+          <w:rFonts w:ascii="Calibri" w:hAnsi="Calibri" w:eastAsia="Calibri" w:cs="Calibri"/>
+          <w:sz w:val="28"/>
+          <w:szCs w:val="28"/>
+          <w:b/>
+          <w:bCs/>
+        </w:rPr>
+        <w:t>Adenda posterior al cierre técnico — 2026-10-30 UTC</w:t>
+      </w:r>
+    </w:p>
+    <w:p>
+      <w:pPr>
+        <w:spacing w:before="0" w:after="100" w:line="276" w:lineRule="auto"/>
+      </w:pPr>
+      <w:r>
+        <w:rPr>
+          <w:rFonts w:ascii="Calibri" w:hAnsi="Calibri" w:eastAsia="Calibri" w:cs="Calibri"/>
+          <w:sz w:val="22"/>
+          <w:szCs w:val="22"/>
+        </w:rPr>
+        <w:t xml:space="preserve">Esta adenda se agrega sin borrar ni reescribir el historial de 4.5–4.6. La cifra de </w:t>
+      </w:r>
+      <w:r>
+        <w:rPr>
+          <w:rFonts w:ascii="Calibri" w:hAnsi="Calibri" w:eastAsia="Calibri" w:cs="Calibri"/>
+          <w:sz w:val="22"/>
+          <w:szCs w:val="22"/>
+          <w:b/>
+          <w:bCs/>
+        </w:rPr>
+        <w:t>33/33 backend/API y 5/5 E2E</w:t>
+      </w:r>
+      <w:r>
+        <w:rPr>
+          <w:rFonts w:ascii="Calibri" w:hAnsi="Calibri" w:eastAsia="Calibri" w:cs="Calibri"/>
+          <w:sz w:val="22"/>
+          <w:szCs w:val="22"/>
+        </w:rPr>
+        <w:t xml:space="preserve"> que figura en los apartados anteriores describe la corrida reportada el 2026-10-27. El cierre posterior aceptado por coordinación informa </w:t>
+      </w:r>
+      <w:r>
+        <w:rPr>
+          <w:rFonts w:ascii="Calibri" w:hAnsi="Calibri" w:eastAsia="Calibri" w:cs="Calibri"/>
+          <w:sz w:val="22"/>
+          <w:szCs w:val="22"/>
+          <w:b/>
+          <w:bCs/>
+        </w:rPr>
+        <w:t>48/48 backend/API</w:t>
+      </w:r>
+      <w:r>
+        <w:rPr>
+          <w:rFonts w:ascii="Calibri" w:hAnsi="Calibri" w:eastAsia="Calibri" w:cs="Calibri"/>
+          <w:sz w:val="22"/>
+          <w:szCs w:val="22"/>
+        </w:rPr>
+        <w:t xml:space="preserve">, </w:t>
+      </w:r>
+      <w:r>
+        <w:rPr>
+          <w:rFonts w:ascii="Calibri" w:hAnsi="Calibri" w:eastAsia="Calibri" w:cs="Calibri"/>
+          <w:sz w:val="22"/>
+          <w:szCs w:val="22"/>
+          <w:b/>
+          <w:bCs/>
+        </w:rPr>
+        <w:t>build TypeScript/Vite correcto (1594 módulos)</w:t>
+      </w:r>
+      <w:r>
+        <w:rPr>
+          <w:rFonts w:ascii="Calibri" w:hAnsi="Calibri" w:eastAsia="Calibri" w:cs="Calibri"/>
+          <w:sz w:val="22"/>
+          <w:szCs w:val="22"/>
+        </w:rPr>
+        <w:t xml:space="preserve">, </w:t>
+      </w:r>
+      <w:r>
+        <w:rPr>
+          <w:rFonts w:ascii="Calibri" w:hAnsi="Calibri" w:eastAsia="Calibri" w:cs="Calibri"/>
+          <w:sz w:val="22"/>
+          <w:szCs w:val="22"/>
+          <w:b/>
+          <w:bCs/>
+        </w:rPr>
+        <w:t>50/50 E2E</w:t>
+      </w:r>
+      <w:r>
+        <w:rPr>
+          <w:rFonts w:ascii="Calibri" w:hAnsi="Calibri" w:eastAsia="Calibri" w:cs="Calibri"/>
+          <w:sz w:val="22"/>
+          <w:szCs w:val="22"/>
+        </w:rPr>
+        <w:t xml:space="preserve"> (27 navegador/UI y 23 API-only) y </w:t>
+      </w:r>
+      <w:r>
+        <w:rPr>
+          <w:rFonts w:ascii="Calibri" w:hAnsi="Calibri" w:eastAsia="Calibri" w:cs="Calibri"/>
+          <w:sz w:val="22"/>
+          <w:szCs w:val="22"/>
+          <w:b/>
+          <w:bCs/>
+        </w:rPr>
+        <w:t>3/3 harness</w:t>
+      </w:r>
+      <w:r>
+        <w:rPr>
+          <w:rFonts w:ascii="Calibri" w:hAnsi="Calibri" w:eastAsia="Calibri" w:cs="Calibri"/>
+          <w:sz w:val="22"/>
+          <w:szCs w:val="22"/>
+        </w:rPr>
+        <w:t xml:space="preserve">; la corrida completa documentada usó el puerto 3182 y una base temporal privada. Coordinación comunicó además una repetición posterior de </w:t>
+      </w:r>
+      <w:r>
+        <w:rPr>
+          <w:rFonts w:ascii="Calibri" w:hAnsi="Calibri" w:eastAsia="Calibri" w:cs="Calibri"/>
+          <w:sz w:val="22"/>
+          <w:szCs w:val="22"/>
+          <w:b/>
+          <w:bCs/>
+        </w:rPr>
+        <w:t>50/50 en el puerto 3183</w:t>
+      </w:r>
+      <w:r>
+        <w:rPr>
+          <w:rFonts w:ascii="Calibri" w:hAnsi="Calibri" w:eastAsia="Calibri" w:cs="Calibri"/>
+          <w:sz w:val="22"/>
+          <w:szCs w:val="22"/>
+        </w:rPr>
+        <w:t xml:space="preserve">, que aquí se registra como reporte de coordinación y no como una ejecución independiente. Esta etapa documental no volvió a ejecutar la aplicación. El detalle y las limitaciones permanecen en </w:t>
+      </w:r>
+      <w:r>
+        <w:rPr>
+          <w:rFonts w:ascii="Calibri" w:hAnsi="Calibri" w:eastAsia="Calibri" w:cs="Calibri"/>
+          <w:sz w:val="22"/>
+          <w:szCs w:val="22"/>
+        </w:rPr>
+        <w:t>documentacion/qa-final.md</w:t>
+      </w:r>
+      <w:r>
+        <w:rPr>
+          <w:rFonts w:ascii="Calibri" w:hAnsi="Calibri" w:eastAsia="Calibri" w:cs="Calibri"/>
+          <w:sz w:val="22"/>
+          <w:szCs w:val="22"/>
+        </w:rPr>
+        <w:t>; el JSON y los resultados históricos no se modifican.</w:t>
+      </w:r>
+    </w:p>
+    <w:p>
+      <w:pPr>
+        <w:spacing w:before="170" w:after="120"/>
+        <w:keepNext/>
+      </w:pPr>
+      <w:r>
+        <w:rPr>
+          <w:rFonts w:ascii="Calibri" w:hAnsi="Calibri" w:eastAsia="Calibri" w:cs="Calibri"/>
+          <w:sz w:val="28"/>
+          <w:szCs w:val="28"/>
+          <w:b/>
+          <w:bCs/>
+        </w:rPr>
+        <w:t>Observaciones técnicas puntuales de F17 y F18</w:t>
+      </w:r>
+    </w:p>
+    <w:p>
+      <w:pPr>
+        <w:spacing w:before="0" w:after="100" w:line="276" w:lineRule="auto"/>
+      </w:pPr>
+      <w:r>
+        <w:rPr>
+          <w:rFonts w:ascii="Calibri" w:hAnsi="Calibri" w:eastAsia="Calibri" w:cs="Calibri"/>
+          <w:sz w:val="22"/>
+          <w:szCs w:val="22"/>
+        </w:rPr>
+        <w:t xml:space="preserve">La fila F17 de la matriz histórica de pruebas ejecutadas informaba que la suite no tenía una aserción específica de la métrica de demora del Dashboard. Como seguimiento puntual fuera de la suite, coordinación reportó para F17 una instancia privada temporal de </w:t>
+      </w:r>
+      <w:r>
+        <w:rPr>
+          <w:rFonts w:ascii="Calibri" w:hAnsi="Calibri" w:eastAsia="Calibri" w:cs="Calibri"/>
+          <w:sz w:val="22"/>
+          <w:szCs w:val="22"/>
+        </w:rPr>
+        <w:t>createApp</w:t>
+      </w:r>
+      <w:r>
+        <w:rPr>
+          <w:rFonts w:ascii="Calibri" w:hAnsi="Calibri" w:eastAsia="Calibri" w:cs="Calibri"/>
+          <w:sz w:val="22"/>
+          <w:szCs w:val="22"/>
+        </w:rPr>
+        <w:t xml:space="preserve"> con SQLite temporal y un pedido con fecha de entrega de </w:t>
+      </w:r>
+      <w:r>
+        <w:rPr>
+          <w:rFonts w:ascii="Calibri" w:hAnsi="Calibri" w:eastAsia="Calibri" w:cs="Calibri"/>
+          <w:sz w:val="22"/>
+          <w:szCs w:val="22"/>
+          <w:b/>
+          <w:bCs/>
+        </w:rPr>
+        <w:t>ayer</w:t>
+      </w:r>
+      <w:r>
+        <w:rPr>
+          <w:rFonts w:ascii="Calibri" w:hAnsi="Calibri" w:eastAsia="Calibri" w:cs="Calibri"/>
+          <w:sz w:val="22"/>
+          <w:szCs w:val="22"/>
+        </w:rPr>
+        <w:t xml:space="preserve">, preparado </w:t>
+      </w:r>
+      <w:r>
+        <w:rPr>
+          <w:rFonts w:ascii="Calibri" w:hAnsi="Calibri" w:eastAsia="Calibri" w:cs="Calibri"/>
+          <w:sz w:val="22"/>
+          <w:szCs w:val="22"/>
+          <w:b/>
+          <w:bCs/>
+        </w:rPr>
+        <w:t>solo mediante fixture automatizada</w:t>
+      </w:r>
+      <w:r>
+        <w:rPr>
+          <w:rFonts w:ascii="Calibri" w:hAnsi="Calibri" w:eastAsia="Calibri" w:cs="Calibri"/>
+          <w:sz w:val="22"/>
+          <w:szCs w:val="22"/>
+        </w:rPr>
+        <w:t xml:space="preserve">. En Chromium headless, login </w:t>
+      </w:r>
+      <w:r>
+        <w:rPr>
+          <w:rFonts w:ascii="Calibri" w:hAnsi="Calibri" w:eastAsia="Calibri" w:cs="Calibri"/>
+          <w:sz w:val="22"/>
+          <w:szCs w:val="22"/>
+        </w:rPr>
+        <w:t>lorena</w:t>
+      </w:r>
+      <w:r>
+        <w:rPr>
+          <w:rFonts w:ascii="Calibri" w:hAnsi="Calibri" w:eastAsia="Calibri" w:cs="Calibri"/>
+          <w:sz w:val="22"/>
+          <w:szCs w:val="22"/>
+        </w:rPr>
+        <w:t xml:space="preserve"> → Resumen presentó </w:t>
+      </w:r>
+      <w:r>
+        <w:rPr>
+          <w:rFonts w:ascii="Calibri" w:hAnsi="Calibri" w:eastAsia="Calibri" w:cs="Calibri"/>
+          <w:sz w:val="22"/>
+          <w:szCs w:val="22"/>
+        </w:rPr>
+        <w:t>Pedidos demorados</w:t>
+      </w:r>
+      <w:r>
+        <w:rPr>
+          <w:rFonts w:ascii="Calibri" w:hAnsi="Calibri" w:eastAsia="Calibri" w:cs="Calibri"/>
+          <w:sz w:val="22"/>
+          <w:szCs w:val="22"/>
+        </w:rPr>
+        <w:t xml:space="preserve"> con </w:t>
+      </w:r>
+      <w:r>
+        <w:rPr>
+          <w:rFonts w:ascii="Calibri" w:hAnsi="Calibri" w:eastAsia="Calibri" w:cs="Calibri"/>
+          <w:sz w:val="22"/>
+          <w:szCs w:val="22"/>
+        </w:rPr>
+        <w:t>metric-value</w:t>
+      </w:r>
+      <w:r>
+        <w:rPr>
+          <w:rFonts w:ascii="Calibri" w:hAnsi="Calibri" w:eastAsia="Calibri" w:cs="Calibri"/>
+          <w:sz w:val="22"/>
+          <w:szCs w:val="22"/>
+        </w:rPr>
+        <w:t xml:space="preserve"> igual a </w:t>
+      </w:r>
+      <w:r>
+        <w:rPr>
+          <w:rFonts w:ascii="Calibri" w:hAnsi="Calibri" w:eastAsia="Calibri" w:cs="Calibri"/>
+          <w:sz w:val="22"/>
+          <w:szCs w:val="22"/>
+          <w:b/>
+          <w:bCs/>
+        </w:rPr>
+        <w:t>1</w:t>
+      </w:r>
+      <w:r>
+        <w:rPr>
+          <w:rFonts w:ascii="Calibri" w:hAnsi="Calibri" w:eastAsia="Calibri" w:cs="Calibri"/>
+          <w:sz w:val="22"/>
+          <w:szCs w:val="22"/>
+        </w:rPr>
+        <w:t xml:space="preserve"> y detalle </w:t>
+      </w:r>
+      <w:r>
+        <w:rPr>
+          <w:rFonts w:ascii="Calibri" w:hAnsi="Calibri" w:eastAsia="Calibri" w:cs="Calibri"/>
+          <w:sz w:val="22"/>
+          <w:szCs w:val="22"/>
+          <w:b/>
+          <w:bCs/>
+        </w:rPr>
+        <w:t>fecha vencida</w:t>
+      </w:r>
+      <w:r>
+        <w:rPr>
+          <w:rFonts w:ascii="Calibri" w:hAnsi="Calibri" w:eastAsia="Calibri" w:cs="Calibri"/>
+          <w:sz w:val="22"/>
+          <w:szCs w:val="22"/>
+        </w:rPr>
+        <w:t xml:space="preserve">; la comprobación API </w:t>
+      </w:r>
+      <w:r>
+        <w:rPr>
+          <w:rFonts w:ascii="Calibri" w:hAnsi="Calibri" w:eastAsia="Calibri" w:cs="Calibri"/>
+          <w:sz w:val="22"/>
+          <w:szCs w:val="22"/>
+        </w:rPr>
+        <w:t>orders.filter(delayed).length</w:t>
+      </w:r>
+      <w:r>
+        <w:rPr>
+          <w:rFonts w:ascii="Calibri" w:hAnsi="Calibri" w:eastAsia="Calibri" w:cs="Calibri"/>
+          <w:sz w:val="22"/>
+          <w:szCs w:val="22"/>
+        </w:rPr>
+        <w:t xml:space="preserve"> también fue </w:t>
+      </w:r>
+      <w:r>
+        <w:rPr>
+          <w:rFonts w:ascii="Calibri" w:hAnsi="Calibri" w:eastAsia="Calibri" w:cs="Calibri"/>
+          <w:sz w:val="22"/>
+          <w:szCs w:val="22"/>
+          <w:b/>
+          <w:bCs/>
+        </w:rPr>
+        <w:t>1</w:t>
+      </w:r>
+      <w:r>
+        <w:rPr>
+          <w:rFonts w:ascii="Calibri" w:hAnsi="Calibri" w:eastAsia="Calibri" w:cs="Calibri"/>
+          <w:sz w:val="22"/>
+          <w:szCs w:val="22"/>
+        </w:rPr>
+        <w:t>. Se reportaron cero errores JavaScript (</w:t>
+      </w:r>
+      <w:r>
+        <w:rPr>
+          <w:rFonts w:ascii="Calibri" w:hAnsi="Calibri" w:eastAsia="Calibri" w:cs="Calibri"/>
+          <w:sz w:val="22"/>
+          <w:szCs w:val="22"/>
+        </w:rPr>
+        <w:t>pageerror</w:t>
+      </w:r>
+      <w:r>
+        <w:rPr>
+          <w:rFonts w:ascii="Calibri" w:hAnsi="Calibri" w:eastAsia="Calibri" w:cs="Calibri"/>
+          <w:sz w:val="22"/>
+          <w:szCs w:val="22"/>
+        </w:rPr>
+        <w:t>) y limpieza completa. No se aportó captura. Este resultado puntual no constituye un caso E2E persistente ni reemplaza la limitación de cobertura de la suite.</w:t>
+      </w:r>
+    </w:p>
+    <w:p>
+      <w:pPr>
+        <w:spacing w:before="0" w:after="100" w:line="276" w:lineRule="auto"/>
+      </w:pPr>
+      <w:r>
+        <w:rPr>
+          <w:rFonts w:ascii="Calibri" w:hAnsi="Calibri" w:eastAsia="Calibri" w:cs="Calibri"/>
+          <w:sz w:val="22"/>
+          <w:szCs w:val="22"/>
+        </w:rPr>
+        <w:t xml:space="preserve">La observación puntual F18 del catálogo, comunicada por coordinación, queda asimismo separada del conteo: Chromium headless con </w:t>
+      </w:r>
+      <w:r>
+        <w:rPr>
+          <w:rFonts w:ascii="Calibri" w:hAnsi="Calibri" w:eastAsia="Calibri" w:cs="Calibri"/>
+          <w:sz w:val="22"/>
+          <w:szCs w:val="22"/>
+        </w:rPr>
+        <w:t>createApp</w:t>
+      </w:r>
+      <w:r>
+        <w:rPr>
+          <w:rFonts w:ascii="Calibri" w:hAnsi="Calibri" w:eastAsia="Calibri" w:cs="Calibri"/>
+          <w:sz w:val="22"/>
+          <w:szCs w:val="22"/>
+        </w:rPr>
+        <w:t xml:space="preserve">, SQLite </w:t>
+      </w:r>
+      <w:r>
+        <w:rPr>
+          <w:rFonts w:ascii="Calibri" w:hAnsi="Calibri" w:eastAsia="Calibri" w:cs="Calibri"/>
+          <w:sz w:val="22"/>
+          <w:szCs w:val="22"/>
+        </w:rPr>
+        <w:t>:memory:</w:t>
+      </w:r>
+      <w:r>
+        <w:rPr>
+          <w:rFonts w:ascii="Calibri" w:hAnsi="Calibri" w:eastAsia="Calibri" w:cs="Calibri"/>
+          <w:sz w:val="22"/>
+          <w:szCs w:val="22"/>
+        </w:rPr>
+        <w:t xml:space="preserve"> y </w:t>
+      </w:r>
+      <w:r>
+        <w:rPr>
+          <w:rFonts w:ascii="Calibri" w:hAnsi="Calibri" w:eastAsia="Calibri" w:cs="Calibri"/>
+          <w:sz w:val="22"/>
+          <w:szCs w:val="22"/>
+        </w:rPr>
+        <w:t>listen(0)</w:t>
+      </w:r>
+      <w:r>
+        <w:rPr>
+          <w:rFonts w:ascii="Calibri" w:hAnsi="Calibri" w:eastAsia="Calibri" w:cs="Calibri"/>
+          <w:sz w:val="22"/>
+          <w:szCs w:val="22"/>
+        </w:rPr>
+        <w:t xml:space="preserve"> mostró tres tarjetas; al filtrar ART-001 quedó una (costo 60 y BOM de 2 g de hilado negro), una búsqueda sin coincidencias mostró el estado vacío y limpiar filtros restauró las tres. Se reportaron cero </w:t>
+      </w:r>
+      <w:r>
+        <w:rPr>
+          <w:rFonts w:ascii="Calibri" w:hAnsi="Calibri" w:eastAsia="Calibri" w:cs="Calibri"/>
+          <w:sz w:val="22"/>
+          <w:szCs w:val="22"/>
+        </w:rPr>
+        <w:t>pageerror</w:t>
+      </w:r>
+      <w:r>
+        <w:rPr>
+          <w:rFonts w:ascii="Calibri" w:hAnsi="Calibri" w:eastAsia="Calibri" w:cs="Calibri"/>
+          <w:sz w:val="22"/>
+          <w:szCs w:val="22"/>
+        </w:rPr>
+        <w:t xml:space="preserve"> y limpieza completa, sin captura ni test E2E permanente.</w:t>
+      </w:r>
+    </w:p>
+    <w:p>
+      <w:pPr>
+        <w:spacing w:before="0" w:after="100" w:line="276" w:lineRule="auto"/>
+      </w:pPr>
+      <w:r>
+        <w:rPr>
+          <w:rFonts w:ascii="Calibri" w:hAnsi="Calibri" w:eastAsia="Calibri" w:cs="Calibri"/>
+          <w:sz w:val="22"/>
+          <w:szCs w:val="22"/>
+        </w:rPr>
+        <w:t xml:space="preserve">Ambas observaciones son reportes técnicos acotados, no evidencia de aceptación de RF por JACSA ni evaluación con usuarios. La evidencia por flujo y su procedencia se amplían en la adenda de </w:t>
+      </w:r>
+      <w:r>
+        <w:rPr>
+          <w:rFonts w:ascii="Calibri" w:hAnsi="Calibri" w:eastAsia="Calibri" w:cs="Calibri"/>
+          <w:sz w:val="22"/>
+          <w:szCs w:val="22"/>
+        </w:rPr>
+        <w:t>documentacion/matriz-validacion-flujos.md</w:t>
+      </w:r>
+      <w:r>
+        <w:rPr>
+          <w:rFonts w:ascii="Calibri" w:hAnsi="Calibri" w:eastAsia="Calibri" w:cs="Calibri"/>
+          <w:sz w:val="22"/>
+          <w:szCs w:val="22"/>
+        </w:rPr>
+        <w:t xml:space="preserve"> y en </w:t>
+      </w:r>
+      <w:r>
+        <w:rPr>
+          <w:rFonts w:ascii="Calibri" w:hAnsi="Calibri" w:eastAsia="Calibri" w:cs="Calibri"/>
+          <w:sz w:val="22"/>
+          <w:szCs w:val="22"/>
+        </w:rPr>
+        <w:t>documentacion/evidencias-prototipo.md</w:t>
+      </w:r>
+      <w:r>
+        <w:rPr>
+          <w:rFonts w:ascii="Calibri" w:hAnsi="Calibri" w:eastAsia="Calibri" w:cs="Calibri"/>
+          <w:sz w:val="22"/>
+          <w:szCs w:val="22"/>
+        </w:rPr>
+        <w:t xml:space="preserve">; no se altera </w:t>
+      </w:r>
+      <w:r>
+        <w:rPr>
+          <w:rFonts w:ascii="Calibri" w:hAnsi="Calibri" w:eastAsia="Calibri" w:cs="Calibri"/>
+          <w:sz w:val="22"/>
+          <w:szCs w:val="22"/>
+        </w:rPr>
+        <w:t>evidencias/qa-final/validation.json</w:t>
+      </w:r>
+      <w:r>
+        <w:rPr>
+          <w:rFonts w:ascii="Calibri" w:hAnsi="Calibri" w:eastAsia="Calibri" w:cs="Calibri"/>
+          <w:sz w:val="22"/>
+          <w:szCs w:val="22"/>
+        </w:rPr>
+        <w:t>.</w:t>
+      </w:r>
+    </w:p>
+    <w:p>
       <w:r>
         <w:br w:type="page"/>
       </w:r>
@@ -16569,6 +17075,588 @@
           <w:b/>
           <w:bCs/>
         </w:rPr>
+        <w:t>Adenda de cierre técnico — 2026-10-30 UTC</w:t>
+      </w:r>
+    </w:p>
+    <w:p>
+      <w:pPr>
+        <w:spacing w:before="0" w:after="100" w:line="276" w:lineRule="auto"/>
+      </w:pPr>
+      <w:r>
+        <w:rPr>
+          <w:rFonts w:ascii="Calibri" w:hAnsi="Calibri" w:eastAsia="Calibri" w:cs="Calibri"/>
+          <w:sz w:val="22"/>
+          <w:szCs w:val="22"/>
+        </w:rPr>
+        <w:t xml:space="preserve">Esta adenda conserva el registro original del 2026-10-27 y actualiza su estado a partir del cierre integrado informado por coordinación. Las cifras anteriores </w:t>
+      </w:r>
+      <w:r>
+        <w:rPr>
+          <w:rFonts w:ascii="Calibri" w:hAnsi="Calibri" w:eastAsia="Calibri" w:cs="Calibri"/>
+          <w:sz w:val="22"/>
+          <w:szCs w:val="22"/>
+          <w:b/>
+          <w:bCs/>
+        </w:rPr>
+        <w:t>33/33 backend y 5/5 E2E</w:t>
+      </w:r>
+      <w:r>
+        <w:rPr>
+          <w:rFonts w:ascii="Calibri" w:hAnsi="Calibri" w:eastAsia="Calibri" w:cs="Calibri"/>
+          <w:sz w:val="22"/>
+          <w:szCs w:val="22"/>
+        </w:rPr>
+        <w:t xml:space="preserve"> pertenecen a esa corrida histórica; el cierre más reciente informado es </w:t>
+      </w:r>
+      <w:r>
+        <w:rPr>
+          <w:rFonts w:ascii="Calibri" w:hAnsi="Calibri" w:eastAsia="Calibri" w:cs="Calibri"/>
+          <w:sz w:val="22"/>
+          <w:szCs w:val="22"/>
+          <w:b/>
+          <w:bCs/>
+        </w:rPr>
+        <w:t>48/48 backend/API</w:t>
+      </w:r>
+      <w:r>
+        <w:rPr>
+          <w:rFonts w:ascii="Calibri" w:hAnsi="Calibri" w:eastAsia="Calibri" w:cs="Calibri"/>
+          <w:sz w:val="22"/>
+          <w:szCs w:val="22"/>
+        </w:rPr>
+        <w:t xml:space="preserve">, </w:t>
+      </w:r>
+      <w:r>
+        <w:rPr>
+          <w:rFonts w:ascii="Calibri" w:hAnsi="Calibri" w:eastAsia="Calibri" w:cs="Calibri"/>
+          <w:sz w:val="22"/>
+          <w:szCs w:val="22"/>
+          <w:b/>
+          <w:bCs/>
+        </w:rPr>
+        <w:t>build correcto con 1594 módulos</w:t>
+      </w:r>
+      <w:r>
+        <w:rPr>
+          <w:rFonts w:ascii="Calibri" w:hAnsi="Calibri" w:eastAsia="Calibri" w:cs="Calibri"/>
+          <w:sz w:val="22"/>
+          <w:szCs w:val="22"/>
+        </w:rPr>
+        <w:t xml:space="preserve">, </w:t>
+      </w:r>
+      <w:r>
+        <w:rPr>
+          <w:rFonts w:ascii="Calibri" w:hAnsi="Calibri" w:eastAsia="Calibri" w:cs="Calibri"/>
+          <w:sz w:val="22"/>
+          <w:szCs w:val="22"/>
+          <w:b/>
+          <w:bCs/>
+        </w:rPr>
+        <w:t>50/50 E2E</w:t>
+      </w:r>
+      <w:r>
+        <w:rPr>
+          <w:rFonts w:ascii="Calibri" w:hAnsi="Calibri" w:eastAsia="Calibri" w:cs="Calibri"/>
+          <w:sz w:val="22"/>
+          <w:szCs w:val="22"/>
+        </w:rPr>
+        <w:t xml:space="preserve"> (27 casos de navegador/UI y 23 API-only) y </w:t>
+      </w:r>
+      <w:r>
+        <w:rPr>
+          <w:rFonts w:ascii="Calibri" w:hAnsi="Calibri" w:eastAsia="Calibri" w:cs="Calibri"/>
+          <w:sz w:val="22"/>
+          <w:szCs w:val="22"/>
+          <w:b/>
+          <w:bCs/>
+        </w:rPr>
+        <w:t>3/3 harness</w:t>
+      </w:r>
+      <w:r>
+        <w:rPr>
+          <w:rFonts w:ascii="Calibri" w:hAnsi="Calibri" w:eastAsia="Calibri" w:cs="Calibri"/>
+          <w:sz w:val="22"/>
+          <w:szCs w:val="22"/>
+        </w:rPr>
+        <w:t xml:space="preserve">. La corrida completa registrada usó el puerto 3182 y base temporal privada. Coordinación también comunicó una repetición posterior de </w:t>
+      </w:r>
+      <w:r>
+        <w:rPr>
+          <w:rFonts w:ascii="Calibri" w:hAnsi="Calibri" w:eastAsia="Calibri" w:cs="Calibri"/>
+          <w:sz w:val="22"/>
+          <w:szCs w:val="22"/>
+          <w:b/>
+          <w:bCs/>
+        </w:rPr>
+        <w:t>50/50 en el puerto 3183</w:t>
+      </w:r>
+      <w:r>
+        <w:rPr>
+          <w:rFonts w:ascii="Calibri" w:hAnsi="Calibri" w:eastAsia="Calibri" w:cs="Calibri"/>
+          <w:sz w:val="22"/>
+          <w:szCs w:val="22"/>
+        </w:rPr>
+        <w:t xml:space="preserve">; se consigna como reporte de coordinación, no como una ejecución independiente de esta adenda. No se volvió a ejecutar la aplicación para actualizar este registro. El detalle y los límites de la corrida aceptada siguen en </w:t>
+      </w:r>
+      <w:r>
+        <w:rPr>
+          <w:rFonts w:ascii="Calibri" w:hAnsi="Calibri" w:eastAsia="Calibri" w:cs="Calibri"/>
+          <w:sz w:val="22"/>
+          <w:szCs w:val="22"/>
+        </w:rPr>
+        <w:t>`qa-final.md` (qa-final.md)</w:t>
+      </w:r>
+      <w:r>
+        <w:rPr>
+          <w:rFonts w:ascii="Calibri" w:hAnsi="Calibri" w:eastAsia="Calibri" w:cs="Calibri"/>
+          <w:sz w:val="22"/>
+          <w:szCs w:val="22"/>
+        </w:rPr>
+        <w:t xml:space="preserve">; el JSON </w:t>
+      </w:r>
+      <w:r>
+        <w:rPr>
+          <w:rFonts w:ascii="Calibri" w:hAnsi="Calibri" w:eastAsia="Calibri" w:cs="Calibri"/>
+          <w:sz w:val="22"/>
+          <w:szCs w:val="22"/>
+        </w:rPr>
+        <w:t>validation.json</w:t>
+      </w:r>
+      <w:r>
+        <w:rPr>
+          <w:rFonts w:ascii="Calibri" w:hAnsi="Calibri" w:eastAsia="Calibri" w:cs="Calibri"/>
+          <w:sz w:val="22"/>
+          <w:szCs w:val="22"/>
+        </w:rPr>
+        <w:t xml:space="preserve"> y el historial de resultados no se alteran.</w:t>
+      </w:r>
+    </w:p>
+    <w:p>
+      <w:pPr>
+        <w:spacing w:before="170" w:after="120"/>
+        <w:keepNext/>
+      </w:pPr>
+      <w:r>
+        <w:rPr>
+          <w:rFonts w:ascii="Calibri" w:hAnsi="Calibri" w:eastAsia="Calibri" w:cs="Calibri"/>
+          <w:sz w:val="28"/>
+          <w:szCs w:val="28"/>
+          <w:b/>
+          <w:bCs/>
+        </w:rPr>
+        <w:t>Observaciones puntuales comunicadas por coordinación</w:t>
+      </w:r>
+    </w:p>
+    <w:p>
+      <w:pPr>
+        <w:spacing w:before="0" w:after="100" w:line="276" w:lineRule="auto"/>
+        <w:ind w:left="360" w:hanging="180"/>
+      </w:pPr>
+      <w:r>
+        <w:rPr>
+          <w:rFonts w:ascii="Calibri" w:hAnsi="Calibri" w:eastAsia="Calibri" w:cs="Calibri"/>
+          <w:sz w:val="22"/>
+          <w:szCs w:val="22"/>
+        </w:rPr>
+        <w:t xml:space="preserve">• </w:t>
+      </w:r>
+      <w:r>
+        <w:rPr>
+          <w:rFonts w:ascii="Calibri" w:hAnsi="Calibri" w:eastAsia="Calibri" w:cs="Calibri"/>
+          <w:sz w:val="22"/>
+          <w:szCs w:val="22"/>
+          <w:b/>
+          <w:bCs/>
+        </w:rPr>
+        <w:t>F18 — Catálogo interno:</w:t>
+      </w:r>
+      <w:r>
+        <w:rPr>
+          <w:rFonts w:ascii="Calibri" w:hAnsi="Calibri" w:eastAsia="Calibri" w:cs="Calibri"/>
+          <w:sz w:val="22"/>
+          <w:szCs w:val="22"/>
+        </w:rPr>
+        <w:t xml:space="preserve"> se conserva la revisión Chromium headless con </w:t>
+      </w:r>
+      <w:r>
+        <w:rPr>
+          <w:rFonts w:ascii="Calibri" w:hAnsi="Calibri" w:eastAsia="Calibri" w:cs="Calibri"/>
+          <w:sz w:val="22"/>
+          <w:szCs w:val="22"/>
+        </w:rPr>
+        <w:t>createApp</w:t>
+      </w:r>
+      <w:r>
+        <w:rPr>
+          <w:rFonts w:ascii="Calibri" w:hAnsi="Calibri" w:eastAsia="Calibri" w:cs="Calibri"/>
+          <w:sz w:val="22"/>
+          <w:szCs w:val="22"/>
+        </w:rPr>
+        <w:t xml:space="preserve">, SQLite </w:t>
+      </w:r>
+      <w:r>
+        <w:rPr>
+          <w:rFonts w:ascii="Calibri" w:hAnsi="Calibri" w:eastAsia="Calibri" w:cs="Calibri"/>
+          <w:sz w:val="22"/>
+          <w:szCs w:val="22"/>
+        </w:rPr>
+        <w:t>:memory:</w:t>
+      </w:r>
+      <w:r>
+        <w:rPr>
+          <w:rFonts w:ascii="Calibri" w:hAnsi="Calibri" w:eastAsia="Calibri" w:cs="Calibri"/>
+          <w:sz w:val="22"/>
+          <w:szCs w:val="22"/>
+        </w:rPr>
+        <w:t xml:space="preserve"> y </w:t>
+      </w:r>
+      <w:r>
+        <w:rPr>
+          <w:rFonts w:ascii="Calibri" w:hAnsi="Calibri" w:eastAsia="Calibri" w:cs="Calibri"/>
+          <w:sz w:val="22"/>
+          <w:szCs w:val="22"/>
+        </w:rPr>
+        <w:t>listen(0)</w:t>
+      </w:r>
+      <w:r>
+        <w:rPr>
+          <w:rFonts w:ascii="Calibri" w:hAnsi="Calibri" w:eastAsia="Calibri" w:cs="Calibri"/>
+          <w:sz w:val="22"/>
+          <w:szCs w:val="22"/>
+        </w:rPr>
+        <w:t xml:space="preserve">: login </w:t>
+      </w:r>
+      <w:r>
+        <w:rPr>
+          <w:rFonts w:ascii="Calibri" w:hAnsi="Calibri" w:eastAsia="Calibri" w:cs="Calibri"/>
+          <w:sz w:val="22"/>
+          <w:szCs w:val="22"/>
+        </w:rPr>
+        <w:t>rodrigo</w:t>
+      </w:r>
+      <w:r>
+        <w:rPr>
+          <w:rFonts w:ascii="Calibri" w:hAnsi="Calibri" w:eastAsia="Calibri" w:cs="Calibri"/>
+          <w:sz w:val="22"/>
+          <w:szCs w:val="22"/>
+        </w:rPr>
+        <w:t xml:space="preserve">, 3 tarjetas iniciales; filtro ART-001 deja 1 tarjeta (costo 60 y BOM de 2 g de hilado negro); búsqueda vacía y limpieza restauran el catálogo. Sin </w:t>
+      </w:r>
+      <w:r>
+        <w:rPr>
+          <w:rFonts w:ascii="Calibri" w:hAnsi="Calibri" w:eastAsia="Calibri" w:cs="Calibri"/>
+          <w:sz w:val="22"/>
+          <w:szCs w:val="22"/>
+        </w:rPr>
+        <w:t>pageerror</w:t>
+      </w:r>
+      <w:r>
+        <w:rPr>
+          <w:rFonts w:ascii="Calibri" w:hAnsi="Calibri" w:eastAsia="Calibri" w:cs="Calibri"/>
+          <w:sz w:val="22"/>
+          <w:szCs w:val="22"/>
+        </w:rPr>
+        <w:t>, limpieza completa. Fue una observación puntual, fuera de la suite, sin captura y sin E2E persistente.</w:t>
+      </w:r>
+    </w:p>
+    <w:p>
+      <w:pPr>
+        <w:spacing w:before="0" w:after="100" w:line="276" w:lineRule="auto"/>
+        <w:ind w:left="360" w:hanging="180"/>
+      </w:pPr>
+      <w:r>
+        <w:rPr>
+          <w:rFonts w:ascii="Calibri" w:hAnsi="Calibri" w:eastAsia="Calibri" w:cs="Calibri"/>
+          <w:sz w:val="22"/>
+          <w:szCs w:val="22"/>
+        </w:rPr>
+        <w:t xml:space="preserve">• </w:t>
+      </w:r>
+      <w:r>
+        <w:rPr>
+          <w:rFonts w:ascii="Calibri" w:hAnsi="Calibri" w:eastAsia="Calibri" w:cs="Calibri"/>
+          <w:sz w:val="22"/>
+          <w:szCs w:val="22"/>
+          <w:b/>
+          <w:bCs/>
+        </w:rPr>
+        <w:t>F17 — Métrica de pedidos demorados (reporte 2026-10-30 UTC):</w:t>
+      </w:r>
+      <w:r>
+        <w:rPr>
+          <w:rFonts w:ascii="Calibri" w:hAnsi="Calibri" w:eastAsia="Calibri" w:cs="Calibri"/>
+          <w:sz w:val="22"/>
+          <w:szCs w:val="22"/>
+        </w:rPr>
+        <w:t xml:space="preserve"> coordinación informó una instancia privada temporal con </w:t>
+      </w:r>
+      <w:r>
+        <w:rPr>
+          <w:rFonts w:ascii="Calibri" w:hAnsi="Calibri" w:eastAsia="Calibri" w:cs="Calibri"/>
+          <w:sz w:val="22"/>
+          <w:szCs w:val="22"/>
+        </w:rPr>
+        <w:t>createApp</w:t>
+      </w:r>
+      <w:r>
+        <w:rPr>
+          <w:rFonts w:ascii="Calibri" w:hAnsi="Calibri" w:eastAsia="Calibri" w:cs="Calibri"/>
+          <w:sz w:val="22"/>
+          <w:szCs w:val="22"/>
+        </w:rPr>
+        <w:t xml:space="preserve"> y SQLite temporal; un pedido quedó con fecha de entrega de </w:t>
+      </w:r>
+      <w:r>
+        <w:rPr>
+          <w:rFonts w:ascii="Calibri" w:hAnsi="Calibri" w:eastAsia="Calibri" w:cs="Calibri"/>
+          <w:sz w:val="22"/>
+          <w:szCs w:val="22"/>
+          <w:b/>
+          <w:bCs/>
+        </w:rPr>
+        <w:t>ayer</w:t>
+      </w:r>
+      <w:r>
+        <w:rPr>
+          <w:rFonts w:ascii="Calibri" w:hAnsi="Calibri" w:eastAsia="Calibri" w:cs="Calibri"/>
+          <w:sz w:val="22"/>
+          <w:szCs w:val="22"/>
+        </w:rPr>
+        <w:t xml:space="preserve"> por una </w:t>
+      </w:r>
+      <w:r>
+        <w:rPr>
+          <w:rFonts w:ascii="Calibri" w:hAnsi="Calibri" w:eastAsia="Calibri" w:cs="Calibri"/>
+          <w:sz w:val="22"/>
+          <w:szCs w:val="22"/>
+          <w:b/>
+          <w:bCs/>
+        </w:rPr>
+        <w:t>fixture automatizada únicamente</w:t>
+      </w:r>
+      <w:r>
+        <w:rPr>
+          <w:rFonts w:ascii="Calibri" w:hAnsi="Calibri" w:eastAsia="Calibri" w:cs="Calibri"/>
+          <w:sz w:val="22"/>
+          <w:szCs w:val="22"/>
+        </w:rPr>
+        <w:t xml:space="preserve">. En Chromium headless, login de </w:t>
+      </w:r>
+      <w:r>
+        <w:rPr>
+          <w:rFonts w:ascii="Calibri" w:hAnsi="Calibri" w:eastAsia="Calibri" w:cs="Calibri"/>
+          <w:sz w:val="22"/>
+          <w:szCs w:val="22"/>
+        </w:rPr>
+        <w:t>lorena</w:t>
+      </w:r>
+      <w:r>
+        <w:rPr>
+          <w:rFonts w:ascii="Calibri" w:hAnsi="Calibri" w:eastAsia="Calibri" w:cs="Calibri"/>
+          <w:sz w:val="22"/>
+          <w:szCs w:val="22"/>
+        </w:rPr>
+        <w:t xml:space="preserve"> → Resumen mostró </w:t>
+      </w:r>
+      <w:r>
+        <w:rPr>
+          <w:rFonts w:ascii="Calibri" w:hAnsi="Calibri" w:eastAsia="Calibri" w:cs="Calibri"/>
+          <w:sz w:val="22"/>
+          <w:szCs w:val="22"/>
+        </w:rPr>
+        <w:t>Pedidos demorados</w:t>
+      </w:r>
+      <w:r>
+        <w:rPr>
+          <w:rFonts w:ascii="Calibri" w:hAnsi="Calibri" w:eastAsia="Calibri" w:cs="Calibri"/>
+          <w:sz w:val="22"/>
+          <w:szCs w:val="22"/>
+        </w:rPr>
+        <w:t xml:space="preserve"> con </w:t>
+      </w:r>
+      <w:r>
+        <w:rPr>
+          <w:rFonts w:ascii="Calibri" w:hAnsi="Calibri" w:eastAsia="Calibri" w:cs="Calibri"/>
+          <w:sz w:val="22"/>
+          <w:szCs w:val="22"/>
+        </w:rPr>
+        <w:t>metric-value</w:t>
+      </w:r>
+      <w:r>
+        <w:rPr>
+          <w:rFonts w:ascii="Calibri" w:hAnsi="Calibri" w:eastAsia="Calibri" w:cs="Calibri"/>
+          <w:sz w:val="22"/>
+          <w:szCs w:val="22"/>
+        </w:rPr>
+        <w:t xml:space="preserve"> </w:t>
+      </w:r>
+      <w:r>
+        <w:rPr>
+          <w:rFonts w:ascii="Calibri" w:hAnsi="Calibri" w:eastAsia="Calibri" w:cs="Calibri"/>
+          <w:sz w:val="22"/>
+          <w:szCs w:val="22"/>
+          <w:b/>
+          <w:bCs/>
+        </w:rPr>
+        <w:t>1</w:t>
+      </w:r>
+      <w:r>
+        <w:rPr>
+          <w:rFonts w:ascii="Calibri" w:hAnsi="Calibri" w:eastAsia="Calibri" w:cs="Calibri"/>
+          <w:sz w:val="22"/>
+          <w:szCs w:val="22"/>
+        </w:rPr>
+        <w:t xml:space="preserve"> y detalle de </w:t>
+      </w:r>
+      <w:r>
+        <w:rPr>
+          <w:rFonts w:ascii="Calibri" w:hAnsi="Calibri" w:eastAsia="Calibri" w:cs="Calibri"/>
+          <w:sz w:val="22"/>
+          <w:szCs w:val="22"/>
+          <w:b/>
+          <w:bCs/>
+        </w:rPr>
+        <w:t>fecha vencida</w:t>
+      </w:r>
+      <w:r>
+        <w:rPr>
+          <w:rFonts w:ascii="Calibri" w:hAnsi="Calibri" w:eastAsia="Calibri" w:cs="Calibri"/>
+          <w:sz w:val="22"/>
+          <w:szCs w:val="22"/>
+        </w:rPr>
+        <w:t xml:space="preserve">. La comprobación API </w:t>
+      </w:r>
+      <w:r>
+        <w:rPr>
+          <w:rFonts w:ascii="Calibri" w:hAnsi="Calibri" w:eastAsia="Calibri" w:cs="Calibri"/>
+          <w:sz w:val="22"/>
+          <w:szCs w:val="22"/>
+        </w:rPr>
+        <w:t>orders.filter(delayed).length</w:t>
+      </w:r>
+      <w:r>
+        <w:rPr>
+          <w:rFonts w:ascii="Calibri" w:hAnsi="Calibri" w:eastAsia="Calibri" w:cs="Calibri"/>
+          <w:sz w:val="22"/>
+          <w:szCs w:val="22"/>
+        </w:rPr>
+        <w:t xml:space="preserve"> también dio </w:t>
+      </w:r>
+      <w:r>
+        <w:rPr>
+          <w:rFonts w:ascii="Calibri" w:hAnsi="Calibri" w:eastAsia="Calibri" w:cs="Calibri"/>
+          <w:sz w:val="22"/>
+          <w:szCs w:val="22"/>
+          <w:b/>
+          <w:bCs/>
+        </w:rPr>
+        <w:t>1</w:t>
+      </w:r>
+      <w:r>
+        <w:rPr>
+          <w:rFonts w:ascii="Calibri" w:hAnsi="Calibri" w:eastAsia="Calibri" w:cs="Calibri"/>
+          <w:sz w:val="22"/>
+          <w:szCs w:val="22"/>
+        </w:rPr>
+        <w:t xml:space="preserve">; hubo </w:t>
+      </w:r>
+      <w:r>
+        <w:rPr>
+          <w:rFonts w:ascii="Calibri" w:hAnsi="Calibri" w:eastAsia="Calibri" w:cs="Calibri"/>
+          <w:sz w:val="22"/>
+          <w:szCs w:val="22"/>
+          <w:b/>
+          <w:bCs/>
+        </w:rPr>
+        <w:t>cero errores JavaScript (</w:t>
+      </w:r>
+      <w:r>
+        <w:rPr>
+          <w:rFonts w:ascii="Calibri" w:hAnsi="Calibri" w:eastAsia="Calibri" w:cs="Calibri"/>
+          <w:sz w:val="22"/>
+          <w:szCs w:val="22"/>
+          <w:b/>
+          <w:bCs/>
+        </w:rPr>
+        <w:t>pageerror</w:t>
+      </w:r>
+      <w:r>
+        <w:rPr>
+          <w:rFonts w:ascii="Calibri" w:hAnsi="Calibri" w:eastAsia="Calibri" w:cs="Calibri"/>
+          <w:sz w:val="22"/>
+          <w:szCs w:val="22"/>
+          <w:b/>
+          <w:bCs/>
+        </w:rPr>
+        <w:t>)</w:t>
+      </w:r>
+      <w:r>
+        <w:rPr>
+          <w:rFonts w:ascii="Calibri" w:hAnsi="Calibri" w:eastAsia="Calibri" w:cs="Calibri"/>
+          <w:sz w:val="22"/>
+          <w:szCs w:val="22"/>
+        </w:rPr>
+        <w:t xml:space="preserve"> y limpieza completa. No se informó captura. Es una observación técnica puntual fuera de la suite, no un E2E persistente ni una nueva cobertura general del F17.</w:t>
+      </w:r>
+    </w:p>
+    <w:p>
+      <w:pPr>
+        <w:spacing w:before="0" w:after="100" w:line="276" w:lineRule="auto"/>
+      </w:pPr>
+      <w:r>
+        <w:rPr>
+          <w:rFonts w:ascii="Calibri" w:hAnsi="Calibri" w:eastAsia="Calibri" w:cs="Calibri"/>
+          <w:sz w:val="22"/>
+          <w:szCs w:val="22"/>
+        </w:rPr>
+        <w:t xml:space="preserve">Ambas observaciones se atribuyen a coordinación; no modifican el resultado histórico de suites ni acreditan aceptación de usuarios. La adenda no edita </w:t>
+      </w:r>
+      <w:r>
+        <w:rPr>
+          <w:rFonts w:ascii="Calibri" w:hAnsi="Calibri" w:eastAsia="Calibri" w:cs="Calibri"/>
+          <w:sz w:val="22"/>
+          <w:szCs w:val="22"/>
+        </w:rPr>
+        <w:t>evidencias/qa-final/validation.json</w:t>
+      </w:r>
+      <w:r>
+        <w:rPr>
+          <w:rFonts w:ascii="Calibri" w:hAnsi="Calibri" w:eastAsia="Calibri" w:cs="Calibri"/>
+          <w:sz w:val="22"/>
+          <w:szCs w:val="22"/>
+        </w:rPr>
+        <w:t xml:space="preserve"> ni </w:t>
+      </w:r>
+      <w:r>
+        <w:rPr>
+          <w:rFonts w:ascii="Calibri" w:hAnsi="Calibri" w:eastAsia="Calibri" w:cs="Calibri"/>
+          <w:sz w:val="22"/>
+          <w:szCs w:val="22"/>
+        </w:rPr>
+        <w:t>rehearsal.json</w:t>
+      </w:r>
+      <w:r>
+        <w:rPr>
+          <w:rFonts w:ascii="Calibri" w:hAnsi="Calibri" w:eastAsia="Calibri" w:cs="Calibri"/>
+          <w:sz w:val="22"/>
+          <w:szCs w:val="22"/>
+        </w:rPr>
+        <w:t>.</w:t>
+      </w:r>
+    </w:p>
+    <w:p>
+      <w:pPr>
+        <w:spacing w:before="170" w:after="120"/>
+        <w:keepNext/>
+      </w:pPr>
+      <w:r>
+        <w:rPr>
+          <w:rFonts w:ascii="Calibri" w:hAnsi="Calibri" w:eastAsia="Calibri" w:cs="Calibri"/>
+          <w:sz w:val="28"/>
+          <w:szCs w:val="28"/>
+          <w:b/>
+          <w:bCs/>
+        </w:rPr>
         <w:t>Anexo visual — capturas del prototipo</w:t>
       </w:r>
     </w:p>
@@ -16597,42 +17685,42 @@
         <w:jc w:val="center"/>
       </w:pPr>
       <w:r>
-        <w:drawing xmlns:w="http://schemas.openxmlformats.org/wordprocessingml/2006/main" xmlns:wp="http://schemas.openxmlformats.org/drawingml/2006/wordprocessingDrawing" xmlns:a="http://schemas.openxmlformats.org/drawingml/2006/main" xmlns:pic="http://schemas.openxmlformats.org/drawingml/2006/picture" xmlns:r="http://schemas.openxmlformats.org/officeDocument/2006/relationships">
-          <wp:inline distT="0" distB="0" distL="0" distR="0">
-            <wp:extent cx="5400040" cy="5605755"/>
-            <wp:effectExtent l="0" t="0" r="0" b="0"/>
-            <wp:docPr id="1" name="01cotizador.png" descr="Captura local del prototipo"/>
-            <wp:cNvGraphicFramePr>
-              <a:graphicFrameLocks noChangeAspect="1"/>
-            </wp:cNvGraphicFramePr>
-            <a:graphic>
-              <a:graphicData uri="http://schemas.openxmlformats.org/drawingml/2006/picture">
-                <pic:pic>
-                  <pic:nvPicPr>
-                    <pic:cNvPr id="1" name="01cotizador.png"/>
-                    <pic:cNvPicPr>
-                      <a:picLocks noChangeAspect="1"/>
-                    </pic:cNvPicPr>
-                  </pic:nvPicPr>
-                  <pic:blipFill>
-                    <a:blip r:embed="rId29"/>
-                    <a:stretch>
-                      <a:fillRect/>
-                    </a:stretch>
-                  </pic:blipFill>
-                  <pic:spPr>
-                    <a:xfrm>
-                      <a:off x="0" y="0"/>
-                      <a:ext cx="5400040" cy="5605755"/>
-                    </a:xfrm>
-                    <a:prstGeom prst="rect">
-                      <a:avLst/>
-                    </a:prstGeom>
-                  </pic:spPr>
-                </pic:pic>
-              </a:graphicData>
-            </a:graphic>
-          </wp:inline>
+        <w:drawing>
+          <ns1:inline distT="0" distB="0" distL="0" distR="0">
+            <ns1:extent cx="5400040" cy="5723307"/>
+            <ns1:effectExtent l="0" t="0" r="0" b="0"/>
+            <ns1:docPr id="1" name="01cotizador.png" descr="Captura local del prototipo"/>
+            <ns1:cNvGraphicFramePr>
+              <ns2:graphicFrameLocks noChangeAspect="1"/>
+            </ns1:cNvGraphicFramePr>
+            <ns2:graphic>
+              <ns2:graphicData uri="http://schemas.openxmlformats.org/drawingml/2006/picture">
+                <ns3:pic>
+                  <ns3:nvPicPr>
+                    <ns3:cNvPr id="1" name="01cotizador.png"/>
+                    <ns3:cNvPicPr>
+                      <ns2:picLocks noChangeAspect="1"/>
+                    </ns3:cNvPicPr>
+                  </ns3:nvPicPr>
+                  <ns3:blipFill>
+                    <ns2:blip r:embed="rId1"/>
+                    <ns2:stretch>
+                      <ns2:fillRect/>
+                    </ns2:stretch>
+                  </ns3:blipFill>
+                  <ns3:spPr>
+                    <ns2:xfrm>
+                      <ns2:off x="0" y="0"/>
+                      <ns2:ext cx="5400040" cy="5723307"/>
+                    </ns2:xfrm>
+                    <ns2:prstGeom prst="rect">
+                      <ns2:avLst/>
+                    </ns2:prstGeom>
+                  </ns3:spPr>
+                </ns3:pic>
+              </ns2:graphicData>
+            </ns2:graphic>
+          </ns1:inline>
         </w:drawing>
       </w:r>
     </w:p>
@@ -16661,42 +17749,42 @@
         <w:jc w:val="center"/>
       </w:pPr>
       <w:r>
-        <w:drawing xmlns:w="http://schemas.openxmlformats.org/wordprocessingml/2006/main" xmlns:wp="http://schemas.openxmlformats.org/drawingml/2006/wordprocessingDrawing" xmlns:a="http://schemas.openxmlformats.org/drawingml/2006/main" xmlns:pic="http://schemas.openxmlformats.org/drawingml/2006/picture" xmlns:r="http://schemas.openxmlformats.org/officeDocument/2006/relationships">
-          <wp:inline distT="0" distB="0" distL="0" distR="0">
-            <wp:extent cx="5400040" cy="4151051"/>
-            <wp:effectExtent l="0" t="0" r="0" b="0"/>
-            <wp:docPr id="2" name="02cotizacion.png" descr="Captura local del prototipo"/>
-            <wp:cNvGraphicFramePr>
-              <a:graphicFrameLocks noChangeAspect="1"/>
-            </wp:cNvGraphicFramePr>
-            <a:graphic>
-              <a:graphicData uri="http://schemas.openxmlformats.org/drawingml/2006/picture">
-                <pic:pic>
-                  <pic:nvPicPr>
-                    <pic:cNvPr id="2" name="02cotizacion.png"/>
-                    <pic:cNvPicPr>
-                      <a:picLocks noChangeAspect="1"/>
-                    </pic:cNvPicPr>
-                  </pic:nvPicPr>
-                  <pic:blipFill>
-                    <a:blip r:embed="rId30"/>
-                    <a:stretch>
-                      <a:fillRect/>
-                    </a:stretch>
-                  </pic:blipFill>
-                  <pic:spPr>
-                    <a:xfrm>
-                      <a:off x="0" y="0"/>
-                      <a:ext cx="5400040" cy="4151051"/>
-                    </a:xfrm>
-                    <a:prstGeom prst="rect">
-                      <a:avLst/>
-                    </a:prstGeom>
-                  </pic:spPr>
-                </pic:pic>
-              </a:graphicData>
-            </a:graphic>
-          </wp:inline>
+        <w:drawing>
+          <ns1:inline distT="0" distB="0" distL="0" distR="0">
+            <ns1:extent cx="5400040" cy="4382481"/>
+            <ns1:effectExtent l="0" t="0" r="0" b="0"/>
+            <ns1:docPr id="2" name="02cotizacion.png" descr="Captura local del prototipo"/>
+            <ns1:cNvGraphicFramePr>
+              <ns2:graphicFrameLocks noChangeAspect="1"/>
+            </ns1:cNvGraphicFramePr>
+            <ns2:graphic>
+              <ns2:graphicData uri="http://schemas.openxmlformats.org/drawingml/2006/picture">
+                <ns3:pic>
+                  <ns3:nvPicPr>
+                    <ns3:cNvPr id="2" name="02cotizacion.png"/>
+                    <ns3:cNvPicPr>
+                      <ns2:picLocks noChangeAspect="1"/>
+                    </ns3:cNvPicPr>
+                  </ns3:nvPicPr>
+                  <ns3:blipFill>
+                    <ns2:blip r:embed="rId2"/>
+                    <ns2:stretch>
+                      <ns2:fillRect/>
+                    </ns2:stretch>
+                  </ns3:blipFill>
+                  <ns3:spPr>
+                    <ns2:xfrm>
+                      <ns2:off x="0" y="0"/>
+                      <ns2:ext cx="5400040" cy="4382481"/>
+                    </ns2:xfrm>
+                    <ns2:prstGeom prst="rect">
+                      <ns2:avLst/>
+                    </ns2:prstGeom>
+                  </ns3:spPr>
+                </ns3:pic>
+              </ns2:graphicData>
+            </ns2:graphic>
+          </ns1:inline>
         </w:drawing>
       </w:r>
     </w:p>
@@ -16725,42 +17813,42 @@
         <w:jc w:val="center"/>
       </w:pPr>
       <w:r>
-        <w:drawing xmlns:w="http://schemas.openxmlformats.org/wordprocessingml/2006/main" xmlns:wp="http://schemas.openxmlformats.org/drawingml/2006/wordprocessingDrawing" xmlns:a="http://schemas.openxmlformats.org/drawingml/2006/main" xmlns:pic="http://schemas.openxmlformats.org/drawingml/2006/picture" xmlns:r="http://schemas.openxmlformats.org/officeDocument/2006/relationships">
-          <wp:inline distT="0" distB="0" distL="0" distR="0">
-            <wp:extent cx="5400040" cy="4411869"/>
-            <wp:effectExtent l="0" t="0" r="0" b="0"/>
-            <wp:docPr id="3" name="03stockfaltante.png" descr="Captura local del prototipo"/>
-            <wp:cNvGraphicFramePr>
-              <a:graphicFrameLocks noChangeAspect="1"/>
-            </wp:cNvGraphicFramePr>
-            <a:graphic>
-              <a:graphicData uri="http://schemas.openxmlformats.org/drawingml/2006/picture">
-                <pic:pic>
-                  <pic:nvPicPr>
-                    <pic:cNvPr id="3" name="03stockfaltante.png"/>
-                    <pic:cNvPicPr>
-                      <a:picLocks noChangeAspect="1"/>
-                    </pic:cNvPicPr>
-                  </pic:nvPicPr>
-                  <pic:blipFill>
-                    <a:blip r:embed="rId31"/>
-                    <a:stretch>
-                      <a:fillRect/>
-                    </a:stretch>
-                  </pic:blipFill>
-                  <pic:spPr>
-                    <a:xfrm>
-                      <a:off x="0" y="0"/>
-                      <a:ext cx="5400040" cy="4411869"/>
-                    </a:xfrm>
-                    <a:prstGeom prst="rect">
-                      <a:avLst/>
-                    </a:prstGeom>
-                  </pic:spPr>
-                </pic:pic>
-              </a:graphicData>
-            </a:graphic>
-          </wp:inline>
+        <w:drawing>
+          <ns1:inline distT="0" distB="0" distL="0" distR="0">
+            <ns1:extent cx="5400040" cy="4481665"/>
+            <ns1:effectExtent l="0" t="0" r="0" b="0"/>
+            <ns1:docPr id="3" name="03stockfaltante.png" descr="Captura local del prototipo"/>
+            <ns1:cNvGraphicFramePr>
+              <ns2:graphicFrameLocks noChangeAspect="1"/>
+            </ns1:cNvGraphicFramePr>
+            <ns2:graphic>
+              <ns2:graphicData uri="http://schemas.openxmlformats.org/drawingml/2006/picture">
+                <ns3:pic>
+                  <ns3:nvPicPr>
+                    <ns3:cNvPr id="3" name="03stockfaltante.png"/>
+                    <ns3:cNvPicPr>
+                      <ns2:picLocks noChangeAspect="1"/>
+                    </ns3:cNvPicPr>
+                  </ns3:nvPicPr>
+                  <ns3:blipFill>
+                    <ns2:blip r:embed="rId3"/>
+                    <ns2:stretch>
+                      <ns2:fillRect/>
+                    </ns2:stretch>
+                  </ns3:blipFill>
+                  <ns3:spPr>
+                    <ns2:xfrm>
+                      <ns2:off x="0" y="0"/>
+                      <ns2:ext cx="5400040" cy="4481665"/>
+                    </ns2:xfrm>
+                    <ns2:prstGeom prst="rect">
+                      <ns2:avLst/>
+                    </ns2:prstGeom>
+                  </ns3:spPr>
+                </ns3:pic>
+              </ns2:graphicData>
+            </ns2:graphic>
+          </ns1:inline>
         </w:drawing>
       </w:r>
     </w:p>
@@ -16789,42 +17877,42 @@
         <w:jc w:val="center"/>
       </w:pPr>
       <w:r>
-        <w:drawing xmlns:w="http://schemas.openxmlformats.org/wordprocessingml/2006/main" xmlns:wp="http://schemas.openxmlformats.org/drawingml/2006/wordprocessingDrawing" xmlns:a="http://schemas.openxmlformats.org/drawingml/2006/main" xmlns:pic="http://schemas.openxmlformats.org/drawingml/2006/picture" xmlns:r="http://schemas.openxmlformats.org/officeDocument/2006/relationships">
-          <wp:inline distT="0" distB="0" distL="0" distR="0">
-            <wp:extent cx="5400040" cy="3673496"/>
-            <wp:effectExtent l="0" t="0" r="0" b="0"/>
-            <wp:docPr id="4" name="04tableropedidos.png" descr="Captura local del prototipo"/>
-            <wp:cNvGraphicFramePr>
-              <a:graphicFrameLocks noChangeAspect="1"/>
-            </wp:cNvGraphicFramePr>
-            <a:graphic>
-              <a:graphicData uri="http://schemas.openxmlformats.org/drawingml/2006/picture">
-                <pic:pic>
-                  <pic:nvPicPr>
-                    <pic:cNvPr id="4" name="04tableropedidos.png"/>
-                    <pic:cNvPicPr>
-                      <a:picLocks noChangeAspect="1"/>
-                    </pic:cNvPicPr>
-                  </pic:nvPicPr>
-                  <pic:blipFill>
-                    <a:blip r:embed="rId32"/>
-                    <a:stretch>
-                      <a:fillRect/>
-                    </a:stretch>
-                  </pic:blipFill>
-                  <pic:spPr>
-                    <a:xfrm>
-                      <a:off x="0" y="0"/>
-                      <a:ext cx="5400040" cy="3673496"/>
-                    </a:xfrm>
-                    <a:prstGeom prst="rect">
-                      <a:avLst/>
-                    </a:prstGeom>
-                  </pic:spPr>
-                </pic:pic>
-              </a:graphicData>
-            </a:graphic>
-          </wp:inline>
+        <w:drawing>
+          <ns1:inline distT="0" distB="0" distL="0" distR="0">
+            <ns1:extent cx="5400040" cy="3673496"/>
+            <ns1:effectExtent l="0" t="0" r="0" b="0"/>
+            <ns1:docPr id="4" name="04tableropedidos.png" descr="Captura local del prototipo"/>
+            <ns1:cNvGraphicFramePr>
+              <ns2:graphicFrameLocks noChangeAspect="1"/>
+            </ns1:cNvGraphicFramePr>
+            <ns2:graphic>
+              <ns2:graphicData uri="http://schemas.openxmlformats.org/drawingml/2006/picture">
+                <ns3:pic>
+                  <ns3:nvPicPr>
+                    <ns3:cNvPr id="4" name="04tableropedidos.png"/>
+                    <ns3:cNvPicPr>
+                      <ns2:picLocks noChangeAspect="1"/>
+                    </ns3:cNvPicPr>
+                  </ns3:nvPicPr>
+                  <ns3:blipFill>
+                    <ns2:blip r:embed="rId4"/>
+                    <ns2:stretch>
+                      <ns2:fillRect/>
+                    </ns2:stretch>
+                  </ns3:blipFill>
+                  <ns3:spPr>
+                    <ns2:xfrm>
+                      <ns2:off x="0" y="0"/>
+                      <ns2:ext cx="5400040" cy="3673496"/>
+                    </ns2:xfrm>
+                    <ns2:prstGeom prst="rect">
+                      <ns2:avLst/>
+                    </ns2:prstGeom>
+                  </ns3:spPr>
+                </ns3:pic>
+              </ns2:graphicData>
+            </ns2:graphic>
+          </ns1:inline>
         </w:drawing>
       </w:r>
     </w:p>
@@ -16853,42 +17941,42 @@
         <w:jc w:val="center"/>
       </w:pPr>
       <w:r>
-        <w:drawing xmlns:w="http://schemas.openxmlformats.org/wordprocessingml/2006/main" xmlns:wp="http://schemas.openxmlformats.org/drawingml/2006/wordprocessingDrawing" xmlns:a="http://schemas.openxmlformats.org/drawingml/2006/main" xmlns:pic="http://schemas.openxmlformats.org/drawingml/2006/picture" xmlns:r="http://schemas.openxmlformats.org/officeDocument/2006/relationships">
-          <wp:inline distT="0" distB="0" distL="0" distR="0">
-            <wp:extent cx="5400040" cy="3673496"/>
-            <wp:effectExtent l="0" t="0" r="0" b="0"/>
-            <wp:docPr id="5" name="05operariocola.png" descr="Captura local del prototipo"/>
-            <wp:cNvGraphicFramePr>
-              <a:graphicFrameLocks noChangeAspect="1"/>
-            </wp:cNvGraphicFramePr>
-            <a:graphic>
-              <a:graphicData uri="http://schemas.openxmlformats.org/drawingml/2006/picture">
-                <pic:pic>
-                  <pic:nvPicPr>
-                    <pic:cNvPr id="5" name="05operariocola.png"/>
-                    <pic:cNvPicPr>
-                      <a:picLocks noChangeAspect="1"/>
-                    </pic:cNvPicPr>
-                  </pic:nvPicPr>
-                  <pic:blipFill>
-                    <a:blip r:embed="rId33"/>
-                    <a:stretch>
-                      <a:fillRect/>
-                    </a:stretch>
-                  </pic:blipFill>
-                  <pic:spPr>
-                    <a:xfrm>
-                      <a:off x="0" y="0"/>
-                      <a:ext cx="5400040" cy="3673496"/>
-                    </a:xfrm>
-                    <a:prstGeom prst="rect">
-                      <a:avLst/>
-                    </a:prstGeom>
-                  </pic:spPr>
-                </pic:pic>
-              </a:graphicData>
-            </a:graphic>
-          </wp:inline>
+        <w:drawing>
+          <ns1:inline distT="0" distB="0" distL="0" distR="0">
+            <ns1:extent cx="5400040" cy="4004111"/>
+            <ns1:effectExtent l="0" t="0" r="0" b="0"/>
+            <ns1:docPr id="5" name="05operariocola.png" descr="Captura local del prototipo"/>
+            <ns1:cNvGraphicFramePr>
+              <ns2:graphicFrameLocks noChangeAspect="1"/>
+            </ns1:cNvGraphicFramePr>
+            <ns2:graphic>
+              <ns2:graphicData uri="http://schemas.openxmlformats.org/drawingml/2006/picture">
+                <ns3:pic>
+                  <ns3:nvPicPr>
+                    <ns3:cNvPr id="5" name="05operariocola.png"/>
+                    <ns3:cNvPicPr>
+                      <ns2:picLocks noChangeAspect="1"/>
+                    </ns3:cNvPicPr>
+                  </ns3:nvPicPr>
+                  <ns3:blipFill>
+                    <ns2:blip r:embed="rId5"/>
+                    <ns2:stretch>
+                      <ns2:fillRect/>
+                    </ns2:stretch>
+                  </ns3:blipFill>
+                  <ns3:spPr>
+                    <ns2:xfrm>
+                      <ns2:off x="0" y="0"/>
+                      <ns2:ext cx="5400040" cy="4004111"/>
+                    </ns2:xfrm>
+                    <ns2:prstGeom prst="rect">
+                      <ns2:avLst/>
+                    </ns2:prstGeom>
+                  </ns3:spPr>
+                </ns3:pic>
+              </ns2:graphicData>
+            </ns2:graphic>
+          </ns1:inline>
         </w:drawing>
       </w:r>
     </w:p>
@@ -16917,42 +18005,42 @@
         <w:jc w:val="center"/>
       </w:pPr>
       <w:r>
-        <w:drawing xmlns:w="http://schemas.openxmlformats.org/wordprocessingml/2006/main" xmlns:wp="http://schemas.openxmlformats.org/drawingml/2006/wordprocessingDrawing" xmlns:a="http://schemas.openxmlformats.org/drawingml/2006/main" xmlns:pic="http://schemas.openxmlformats.org/drawingml/2006/picture" xmlns:r="http://schemas.openxmlformats.org/officeDocument/2006/relationships">
-          <wp:inline distT="0" distB="0" distL="0" distR="0">
-            <wp:extent cx="5400040" cy="5385346"/>
-            <wp:effectExtent l="0" t="0" r="0" b="0"/>
-            <wp:docPr id="6" name="06portalcliente.png" descr="Captura local del prototipo"/>
-            <wp:cNvGraphicFramePr>
-              <a:graphicFrameLocks noChangeAspect="1"/>
-            </wp:cNvGraphicFramePr>
-            <a:graphic>
-              <a:graphicData uri="http://schemas.openxmlformats.org/drawingml/2006/picture">
-                <pic:pic>
-                  <pic:nvPicPr>
-                    <pic:cNvPr id="6" name="06portalcliente.png"/>
-                    <pic:cNvPicPr>
-                      <a:picLocks noChangeAspect="1"/>
-                    </pic:cNvPicPr>
-                  </pic:nvPicPr>
-                  <pic:blipFill>
-                    <a:blip r:embed="rId34"/>
-                    <a:stretch>
-                      <a:fillRect/>
-                    </a:stretch>
-                  </pic:blipFill>
-                  <pic:spPr>
-                    <a:xfrm>
-                      <a:off x="0" y="0"/>
-                      <a:ext cx="5400040" cy="5385346"/>
-                    </a:xfrm>
-                    <a:prstGeom prst="rect">
-                      <a:avLst/>
-                    </a:prstGeom>
-                  </pic:spPr>
-                </pic:pic>
-              </a:graphicData>
-            </a:graphic>
-          </wp:inline>
+        <w:drawing>
+          <ns1:inline distT="0" distB="0" distL="0" distR="0">
+            <ns1:extent cx="5400040" cy="5385346"/>
+            <ns1:effectExtent l="0" t="0" r="0" b="0"/>
+            <ns1:docPr id="6" name="06portalcliente.png" descr="Captura local del prototipo"/>
+            <ns1:cNvGraphicFramePr>
+              <ns2:graphicFrameLocks noChangeAspect="1"/>
+            </ns1:cNvGraphicFramePr>
+            <ns2:graphic>
+              <ns2:graphicData uri="http://schemas.openxmlformats.org/drawingml/2006/picture">
+                <ns3:pic>
+                  <ns3:nvPicPr>
+                    <ns3:cNvPr id="6" name="06portalcliente.png"/>
+                    <ns3:cNvPicPr>
+                      <ns2:picLocks noChangeAspect="1"/>
+                    </ns3:cNvPicPr>
+                  </ns3:nvPicPr>
+                  <ns3:blipFill>
+                    <ns2:blip r:embed="rId6"/>
+                    <ns2:stretch>
+                      <ns2:fillRect/>
+                    </ns2:stretch>
+                  </ns3:blipFill>
+                  <ns3:spPr>
+                    <ns2:xfrm>
+                      <ns2:off x="0" y="0"/>
+                      <ns2:ext cx="5400040" cy="5385346"/>
+                    </ns2:xfrm>
+                    <ns2:prstGeom prst="rect">
+                      <ns2:avLst/>
+                    </ns2:prstGeom>
+                  </ns3:spPr>
+                </ns3:pic>
+              </ns2:graphicData>
+            </ns2:graphic>
+          </ns1:inline>
         </w:drawing>
       </w:r>
     </w:p>
@@ -16981,2372 +18069,50 @@
         <w:jc w:val="center"/>
       </w:pPr>
       <w:r>
-        <w:drawing xmlns:w="http://schemas.openxmlformats.org/wordprocessingml/2006/main" xmlns:wp="http://schemas.openxmlformats.org/drawingml/2006/wordprocessingDrawing" xmlns:a="http://schemas.openxmlformats.org/drawingml/2006/main" xmlns:pic="http://schemas.openxmlformats.org/drawingml/2006/picture" xmlns:r="http://schemas.openxmlformats.org/officeDocument/2006/relationships">
-          <wp:inline distT="0" distB="0" distL="0" distR="0">
-            <wp:extent cx="2526997" cy="6000000"/>
-            <wp:effectExtent l="0" t="0" r="0" b="0"/>
-            <wp:docPr id="7" name="07mobilelogin.png" descr="Captura local del prototipo"/>
-            <wp:cNvGraphicFramePr>
-              <a:graphicFrameLocks noChangeAspect="1"/>
-            </wp:cNvGraphicFramePr>
-            <a:graphic>
-              <a:graphicData uri="http://schemas.openxmlformats.org/drawingml/2006/picture">
-                <pic:pic>
-                  <pic:nvPicPr>
-                    <pic:cNvPr id="7" name="07mobilelogin.png"/>
-                    <pic:cNvPicPr>
-                      <a:picLocks noChangeAspect="1"/>
-                    </pic:cNvPicPr>
-                  </pic:nvPicPr>
-                  <pic:blipFill>
-                    <a:blip r:embed="rId35"/>
-                    <a:stretch>
-                      <a:fillRect/>
-                    </a:stretch>
-                  </pic:blipFill>
-                  <pic:spPr>
-                    <a:xfrm>
-                      <a:off x="0" y="0"/>
-                      <a:ext cx="2526997" cy="6000000"/>
-                    </a:xfrm>
-                    <a:prstGeom prst="rect">
-                      <a:avLst/>
-                    </a:prstGeom>
-                  </pic:spPr>
-                </pic:pic>
-              </a:graphicData>
-            </a:graphic>
-          </wp:inline>
+        <w:drawing>
+          <ns1:inline distT="0" distB="0" distL="0" distR="0">
+            <ns1:extent cx="2526997" cy="6000000"/>
+            <ns1:effectExtent l="0" t="0" r="0" b="0"/>
+            <ns1:docPr id="7" name="07mobilelogin.png" descr="Captura local del prototipo"/>
+            <ns1:cNvGraphicFramePr>
+              <ns2:graphicFrameLocks noChangeAspect="1"/>
+            </ns1:cNvGraphicFramePr>
+            <ns2:graphic>
+              <ns2:graphicData uri="http://schemas.openxmlformats.org/drawingml/2006/picture">
+                <ns3:pic>
+                  <ns3:nvPicPr>
+                    <ns3:cNvPr id="7" name="07mobilelogin.png"/>
+                    <ns3:cNvPicPr>
+                      <ns2:picLocks noChangeAspect="1"/>
+                    </ns3:cNvPicPr>
+                  </ns3:nvPicPr>
+                  <ns3:blipFill>
+                    <ns2:blip r:embed="rId7"/>
+                    <ns2:stretch>
+                      <ns2:fillRect/>
+                    </ns2:stretch>
+                  </ns3:blipFill>
+                  <ns3:spPr>
+                    <ns2:xfrm>
+                      <ns2:off x="0" y="0"/>
+                      <ns2:ext cx="2526997" cy="6000000"/>
+                    </ns2:xfrm>
+                    <ns2:prstGeom prst="rect">
+                      <ns2:avLst/>
+                    </ns2:prstGeom>
+                  </ns3:spPr>
+                </ns3:pic>
+              </ns2:graphicData>
+            </ns2:graphic>
+          </ns1:inline>
         </w:drawing>
       </w:r>
     </w:p>
     <w:sectPr>
-      <w:headerReference r:id="rId23" w:type="default"/>
-      <w:headerReference r:id="rId24" w:type="first"/>
-      <w:headerReference r:id="rId25" w:type="even"/>
-      <w:footerReference r:id="rId26" w:type="default"/>
-      <w:footerReference r:id="rId27" w:type="first"/>
-      <w:footerReference r:id="rId28" w:type="even"/>
       <w:pgSz w:h="16838" w:w="11906" w:orient="portrait"/>
       <w:pgMar w:bottom="1417" w:top="1417" w:left="1701" w:right="1701" w:header="708" w:footer="708"/>
       <w:pgNumType w:start="1"/>
     </w:sectPr>
   </w:body>
 </w:document>
-</file>
-
-<file path=word/footer1.xml><?xml version="1.0" encoding="utf-8"?>
-<w:ftr xmlns:mc="http://schemas.openxmlformats.org/markup-compatibility/2006" xmlns:o="urn:schemas-microsoft-com:office:office" xmlns:r="http://schemas.openxmlformats.org/officeDocument/2006/relationships" xmlns:m="http://schemas.openxmlformats.org/officeDocument/2006/math" xmlns:v="urn:schemas-microsoft-com:vml" xmlns:wp="http://schemas.openxmlformats.org/drawingml/2006/wordprocessingDrawing" xmlns:w10="urn:schemas-microsoft-com:office:word" xmlns:w="http://schemas.openxmlformats.org/wordprocessingml/2006/main" xmlns:wne="http://schemas.microsoft.com/office/word/2006/wordml" xmlns:sl="http://schemas.openxmlformats.org/schemaLibrary/2006/main" xmlns:a="http://schemas.openxmlformats.org/drawingml/2006/main" xmlns:pic="http://schemas.openxmlformats.org/drawingml/2006/picture" xmlns:c="http://schemas.openxmlformats.org/drawingml/2006/chart" xmlns:lc="http://schemas.openxmlformats.org/drawingml/2006/lockedCanvas" xmlns:dgm="http://schemas.openxmlformats.org/drawingml/2006/diagram" xmlns:wps="http://schemas.microsoft.com/office/word/2010/wordprocessingShape" xmlns:wpg="http://schemas.microsoft.com/office/word/2010/wordprocessingGroup" xmlns:w14="http://schemas.microsoft.com/office/word/2010/wordml" xmlns:w15="http://schemas.microsoft.com/office/word/2012/wordml" xmlns:w16="http://schemas.microsoft.com/office/word/2018/wordml" xmlns:w16cex="http://schemas.microsoft.com/office/word/2018/wordml/cex" xmlns:w16cid="http://schemas.microsoft.com/office/word/2016/wordml/cid" xmlns="http://schemas.microsoft.com/office/tasks/2019/documenttasks" xmlns:cr="http://schemas.microsoft.com/office/comments/2020/reactions">
-  <w:p>
-    <w:pPr>
-      <w:keepNext w:val="0"/>
-      <w:keepLines w:val="0"/>
-      <w:pageBreakBefore w:val="0"/>
-      <w:widowControl w:val="1"/>
-      <w:pBdr>
-        <w:top w:space="0" w:sz="0" w:val="nil"/>
-        <w:left w:space="0" w:sz="0" w:val="nil"/>
-        <w:bottom w:space="0" w:sz="0" w:val="nil"/>
-        <w:right w:space="0" w:sz="0" w:val="nil"/>
-        <w:between w:space="0" w:sz="0" w:val="nil"/>
-      </w:pBdr>
-      <w:shd w:fill="auto" w:val="clear"/>
-      <w:tabs>
-        <w:tab w:val="center" w:leader="none" w:pos="4252"/>
-        <w:tab w:val="right" w:leader="none" w:pos="8504"/>
-      </w:tabs>
-      <w:spacing w:after="0" w:before="0" w:line="240" w:lineRule="auto"/>
-      <w:ind w:left="0" w:right="0" w:firstLine="0"/>
-      <w:jc w:val="left"/>
-      <w:rPr>
-        <w:rFonts w:ascii="Aptos" w:cs="Aptos" w:eastAsia="Aptos" w:hAnsi="Aptos"/>
-        <w:b w:val="0"/>
-        <w:bCs w:val="0"/>
-        <w:i w:val="0"/>
-        <w:iCs w:val="0"/>
-        <w:smallCaps w:val="0"/>
-        <w:strike w:val="0"/>
-        <w:color w:val="000000"/>
-        <w:sz w:val="24"/>
-        <w:szCs w:val="24"/>
-        <w:u w:val="none"/>
-        <w:shd w:fill="auto" w:val="clear"/>
-        <w:vertAlign w:val="baseline"/>
-      </w:rPr>
-    </w:pPr>
-    <w:r>
-      <w:rPr>
-        <w:rtl w:val="0"/>
-      </w:rPr>
-    </w:r>
-  </w:p>
-</w:ftr>
-</file>
-
-<file path=word/footer2.xml><?xml version="1.0" encoding="utf-8"?>
-<w:ftr xmlns:mc="http://schemas.openxmlformats.org/markup-compatibility/2006" xmlns:o="urn:schemas-microsoft-com:office:office" xmlns:r="http://schemas.openxmlformats.org/officeDocument/2006/relationships" xmlns:m="http://schemas.openxmlformats.org/officeDocument/2006/math" xmlns:v="urn:schemas-microsoft-com:vml" xmlns:wp="http://schemas.openxmlformats.org/drawingml/2006/wordprocessingDrawing" xmlns:w10="urn:schemas-microsoft-com:office:word" xmlns:w="http://schemas.openxmlformats.org/wordprocessingml/2006/main" xmlns:wne="http://schemas.microsoft.com/office/word/2006/wordml" xmlns:sl="http://schemas.openxmlformats.org/schemaLibrary/2006/main" xmlns:a="http://schemas.openxmlformats.org/drawingml/2006/main" xmlns:pic="http://schemas.openxmlformats.org/drawingml/2006/picture" xmlns:c="http://schemas.openxmlformats.org/drawingml/2006/chart" xmlns:lc="http://schemas.openxmlformats.org/drawingml/2006/lockedCanvas" xmlns:dgm="http://schemas.openxmlformats.org/drawingml/2006/diagram" xmlns:wps="http://schemas.microsoft.com/office/word/2010/wordprocessingShape" xmlns:wpg="http://schemas.microsoft.com/office/word/2010/wordprocessingGroup" xmlns:w14="http://schemas.microsoft.com/office/word/2010/wordml" xmlns:w15="http://schemas.microsoft.com/office/word/2012/wordml" xmlns:w16="http://schemas.microsoft.com/office/word/2018/wordml" xmlns:w16cex="http://schemas.microsoft.com/office/word/2018/wordml/cex" xmlns:w16cid="http://schemas.microsoft.com/office/word/2016/wordml/cid" xmlns="http://schemas.microsoft.com/office/tasks/2019/documenttasks" xmlns:cr="http://schemas.microsoft.com/office/comments/2020/reactions">
-  <w:p>
-    <w:pPr>
-      <w:keepNext w:val="0"/>
-      <w:keepLines w:val="0"/>
-      <w:pageBreakBefore w:val="0"/>
-      <w:widowControl w:val="1"/>
-      <w:pBdr>
-        <w:top w:space="0" w:sz="0" w:val="nil"/>
-        <w:left w:space="0" w:sz="0" w:val="nil"/>
-        <w:bottom w:space="0" w:sz="0" w:val="nil"/>
-        <w:right w:space="0" w:sz="0" w:val="nil"/>
-        <w:between w:space="0" w:sz="0" w:val="nil"/>
-      </w:pBdr>
-      <w:shd w:fill="auto" w:val="clear"/>
-      <w:tabs>
-        <w:tab w:val="center" w:leader="none" w:pos="4252"/>
-        <w:tab w:val="right" w:leader="none" w:pos="8504"/>
-      </w:tabs>
-      <w:spacing w:after="0" w:before="0" w:line="240" w:lineRule="auto"/>
-      <w:ind w:left="0" w:right="0" w:firstLine="0"/>
-      <w:jc w:val="left"/>
-      <w:rPr>
-        <w:rFonts w:ascii="Aptos" w:cs="Aptos" w:eastAsia="Aptos" w:hAnsi="Aptos"/>
-        <w:b w:val="0"/>
-        <w:bCs w:val="0"/>
-        <w:i w:val="0"/>
-        <w:iCs w:val="0"/>
-        <w:smallCaps w:val="0"/>
-        <w:strike w:val="0"/>
-        <w:color w:val="000000"/>
-        <w:sz w:val="24"/>
-        <w:szCs w:val="24"/>
-        <w:u w:val="none"/>
-        <w:shd w:fill="auto" w:val="clear"/>
-        <w:vertAlign w:val="baseline"/>
-      </w:rPr>
-    </w:pPr>
-    <w:r>
-      <w:rPr>
-        <w:rtl w:val="0"/>
-      </w:rPr>
-    </w:r>
-  </w:p>
-</w:ftr>
-</file>
-
-<file path=word/footer3.xml><?xml version="1.0" encoding="utf-8"?>
-<w:ftr xmlns:mc="http://schemas.openxmlformats.org/markup-compatibility/2006" xmlns:o="urn:schemas-microsoft-com:office:office" xmlns:r="http://schemas.openxmlformats.org/officeDocument/2006/relationships" xmlns:m="http://schemas.openxmlformats.org/officeDocument/2006/math" xmlns:v="urn:schemas-microsoft-com:vml" xmlns:wp="http://schemas.openxmlformats.org/drawingml/2006/wordprocessingDrawing" xmlns:w10="urn:schemas-microsoft-com:office:word" xmlns:w="http://schemas.openxmlformats.org/wordprocessingml/2006/main" xmlns:wne="http://schemas.microsoft.com/office/word/2006/wordml" xmlns:sl="http://schemas.openxmlformats.org/schemaLibrary/2006/main" xmlns:a="http://schemas.openxmlformats.org/drawingml/2006/main" xmlns:pic="http://schemas.openxmlformats.org/drawingml/2006/picture" xmlns:c="http://schemas.openxmlformats.org/drawingml/2006/chart" xmlns:lc="http://schemas.openxmlformats.org/drawingml/2006/lockedCanvas" xmlns:dgm="http://schemas.openxmlformats.org/drawingml/2006/diagram" xmlns:wps="http://schemas.microsoft.com/office/word/2010/wordprocessingShape" xmlns:wpg="http://schemas.microsoft.com/office/word/2010/wordprocessingGroup" xmlns:w14="http://schemas.microsoft.com/office/word/2010/wordml" xmlns:w15="http://schemas.microsoft.com/office/word/2012/wordml" xmlns:w16="http://schemas.microsoft.com/office/word/2018/wordml" xmlns:w16cex="http://schemas.microsoft.com/office/word/2018/wordml/cex" xmlns:w16cid="http://schemas.microsoft.com/office/word/2016/wordml/cid" xmlns="http://schemas.microsoft.com/office/tasks/2019/documenttasks" xmlns:cr="http://schemas.microsoft.com/office/comments/2020/reactions">
-  <w:p>
-    <w:pPr>
-      <w:keepNext w:val="0"/>
-      <w:keepLines w:val="0"/>
-      <w:pageBreakBefore w:val="0"/>
-      <w:widowControl w:val="1"/>
-      <w:pBdr>
-        <w:top w:space="0" w:sz="0" w:val="nil"/>
-        <w:left w:space="0" w:sz="0" w:val="nil"/>
-        <w:bottom w:space="0" w:sz="0" w:val="nil"/>
-        <w:right w:space="0" w:sz="0" w:val="nil"/>
-        <w:between w:space="0" w:sz="0" w:val="nil"/>
-      </w:pBdr>
-      <w:shd w:fill="auto" w:val="clear"/>
-      <w:tabs>
-        <w:tab w:val="center" w:leader="none" w:pos="4252"/>
-        <w:tab w:val="right" w:leader="none" w:pos="8504"/>
-      </w:tabs>
-      <w:spacing w:after="0" w:before="0" w:line="240" w:lineRule="auto"/>
-      <w:ind w:left="0" w:right="0" w:firstLine="0"/>
-      <w:jc w:val="left"/>
-      <w:rPr>
-        <w:rFonts w:ascii="Aptos" w:cs="Aptos" w:eastAsia="Aptos" w:hAnsi="Aptos"/>
-        <w:b w:val="0"/>
-        <w:bCs w:val="0"/>
-        <w:i w:val="0"/>
-        <w:iCs w:val="0"/>
-        <w:smallCaps w:val="0"/>
-        <w:strike w:val="0"/>
-        <w:color w:val="000000"/>
-        <w:sz w:val="24"/>
-        <w:szCs w:val="24"/>
-        <w:u w:val="none"/>
-        <w:shd w:fill="auto" w:val="clear"/>
-        <w:vertAlign w:val="baseline"/>
-      </w:rPr>
-    </w:pPr>
-    <w:r>
-      <w:rPr>
-        <w:rtl w:val="0"/>
-      </w:rPr>
-    </w:r>
-  </w:p>
-</w:ftr>
-</file>
-
-<file path=word/header1.xml><?xml version="1.0" encoding="utf-8"?>
-<w:hdr xmlns:mc="http://schemas.openxmlformats.org/markup-compatibility/2006" xmlns:o="urn:schemas-microsoft-com:office:office" xmlns:r="http://schemas.openxmlformats.org/officeDocument/2006/relationships" xmlns:m="http://schemas.openxmlformats.org/officeDocument/2006/math" xmlns:v="urn:schemas-microsoft-com:vml" xmlns:wp="http://schemas.openxmlformats.org/drawingml/2006/wordprocessingDrawing" xmlns:w10="urn:schemas-microsoft-com:office:word" xmlns:w="http://schemas.openxmlformats.org/wordprocessingml/2006/main" xmlns:wne="http://schemas.microsoft.com/office/word/2006/wordml" xmlns:sl="http://schemas.openxmlformats.org/schemaLibrary/2006/main" xmlns:a="http://schemas.openxmlformats.org/drawingml/2006/main" xmlns:pic="http://schemas.openxmlformats.org/drawingml/2006/picture" xmlns:c="http://schemas.openxmlformats.org/drawingml/2006/chart" xmlns:lc="http://schemas.openxmlformats.org/drawingml/2006/lockedCanvas" xmlns:dgm="http://schemas.openxmlformats.org/drawingml/2006/diagram" xmlns:wps="http://schemas.microsoft.com/office/word/2010/wordprocessingShape" xmlns:wpg="http://schemas.microsoft.com/office/word/2010/wordprocessingGroup" xmlns:w14="http://schemas.microsoft.com/office/word/2010/wordml" xmlns:w15="http://schemas.microsoft.com/office/word/2012/wordml" xmlns:w16="http://schemas.microsoft.com/office/word/2018/wordml" xmlns:w16cex="http://schemas.microsoft.com/office/word/2018/wordml/cex" xmlns:w16cid="http://schemas.microsoft.com/office/word/2016/wordml/cid" xmlns="http://schemas.microsoft.com/office/tasks/2019/documenttasks" xmlns:cr="http://schemas.microsoft.com/office/comments/2020/reactions">
-  <w:p>
-    <w:pPr>
-      <w:keepNext w:val="0"/>
-      <w:keepLines w:val="0"/>
-      <w:pageBreakBefore w:val="0"/>
-      <w:widowControl w:val="1"/>
-      <w:pBdr>
-        <w:top w:space="0" w:sz="0" w:val="nil"/>
-        <w:left w:space="0" w:sz="0" w:val="nil"/>
-        <w:bottom w:space="0" w:sz="0" w:val="nil"/>
-        <w:right w:space="0" w:sz="0" w:val="nil"/>
-        <w:between w:space="0" w:sz="0" w:val="nil"/>
-      </w:pBdr>
-      <w:shd w:fill="auto" w:val="clear"/>
-      <w:tabs>
-        <w:tab w:val="center" w:leader="none" w:pos="4252"/>
-        <w:tab w:val="right" w:leader="none" w:pos="8504"/>
-      </w:tabs>
-      <w:spacing w:after="0" w:before="0" w:line="240" w:lineRule="auto"/>
-      <w:ind w:left="0" w:right="0" w:firstLine="0"/>
-      <w:jc w:val="left"/>
-      <w:rPr>
-        <w:rFonts w:ascii="Aptos" w:cs="Aptos" w:eastAsia="Aptos" w:hAnsi="Aptos"/>
-        <w:b w:val="0"/>
-        <w:bCs w:val="0"/>
-        <w:i w:val="0"/>
-        <w:iCs w:val="0"/>
-        <w:smallCaps w:val="0"/>
-        <w:strike w:val="0"/>
-        <w:color w:val="000000"/>
-        <w:sz w:val="24"/>
-        <w:szCs w:val="24"/>
-        <w:u w:val="none"/>
-        <w:shd w:fill="auto" w:val="clear"/>
-        <w:vertAlign w:val="baseline"/>
-      </w:rPr>
-    </w:pPr>
-    <w:r>
-      <w:rPr>
-        <w:rtl w:val="0"/>
-      </w:rPr>
-    </w:r>
-  </w:p>
-</w:hdr>
-</file>
-
-<file path=word/header2.xml><?xml version="1.0" encoding="utf-8"?>
-<w:hdr xmlns:mc="http://schemas.openxmlformats.org/markup-compatibility/2006" xmlns:o="urn:schemas-microsoft-com:office:office" xmlns:r="http://schemas.openxmlformats.org/officeDocument/2006/relationships" xmlns:m="http://schemas.openxmlformats.org/officeDocument/2006/math" xmlns:v="urn:schemas-microsoft-com:vml" xmlns:wp="http://schemas.openxmlformats.org/drawingml/2006/wordprocessingDrawing" xmlns:w10="urn:schemas-microsoft-com:office:word" xmlns:w="http://schemas.openxmlformats.org/wordprocessingml/2006/main" xmlns:wne="http://schemas.microsoft.com/office/word/2006/wordml" xmlns:sl="http://schemas.openxmlformats.org/schemaLibrary/2006/main" xmlns:a="http://schemas.openxmlformats.org/drawingml/2006/main" xmlns:pic="http://schemas.openxmlformats.org/drawingml/2006/picture" xmlns:c="http://schemas.openxmlformats.org/drawingml/2006/chart" xmlns:lc="http://schemas.openxmlformats.org/drawingml/2006/lockedCanvas" xmlns:dgm="http://schemas.openxmlformats.org/drawingml/2006/diagram" xmlns:wps="http://schemas.microsoft.com/office/word/2010/wordprocessingShape" xmlns:wpg="http://schemas.microsoft.com/office/word/2010/wordprocessingGroup" xmlns:w14="http://schemas.microsoft.com/office/word/2010/wordml" xmlns:w15="http://schemas.microsoft.com/office/word/2012/wordml" xmlns:w16="http://schemas.microsoft.com/office/word/2018/wordml" xmlns:w16cex="http://schemas.microsoft.com/office/word/2018/wordml/cex" xmlns:w16cid="http://schemas.microsoft.com/office/word/2016/wordml/cid" xmlns="http://schemas.microsoft.com/office/tasks/2019/documenttasks" xmlns:cr="http://schemas.microsoft.com/office/comments/2020/reactions">
-  <w:p>
-    <w:pPr>
-      <w:jc w:val="center"/>
-      <w:rPr/>
-    </w:pPr>
-    <w:r>
-      <w:rPr>
-        <w:rtl w:val="0"/>
-      </w:rPr>
-    </w:r>
-  </w:p>
-  <w:p>
-    <w:pPr>
-      <w:keepNext w:val="0"/>
-      <w:keepLines w:val="0"/>
-      <w:pageBreakBefore w:val="0"/>
-      <w:widowControl w:val="1"/>
-      <w:pBdr>
-        <w:top w:space="0" w:sz="0" w:val="nil"/>
-        <w:left w:space="0" w:sz="0" w:val="nil"/>
-        <w:bottom w:space="0" w:sz="0" w:val="nil"/>
-        <w:right w:space="0" w:sz="0" w:val="nil"/>
-        <w:between w:space="0" w:sz="0" w:val="nil"/>
-      </w:pBdr>
-      <w:shd w:fill="auto" w:val="clear"/>
-      <w:tabs>
-        <w:tab w:val="center" w:leader="none" w:pos="4252"/>
-        <w:tab w:val="right" w:leader="none" w:pos="8504"/>
-      </w:tabs>
-      <w:spacing w:after="0" w:before="0" w:line="240" w:lineRule="auto"/>
-      <w:ind w:left="0" w:right="0" w:firstLine="0"/>
-      <w:jc w:val="left"/>
-      <w:rPr/>
-    </w:pPr>
-    <w:r>
-      <w:rPr>
-        <w:rtl w:val="0"/>
-      </w:rPr>
-    </w:r>
-  </w:p>
-</w:hdr>
-</file>
-
-<file path=word/header3.xml><?xml version="1.0" encoding="utf-8"?>
-<w:hdr xmlns:mc="http://schemas.openxmlformats.org/markup-compatibility/2006" xmlns:o="urn:schemas-microsoft-com:office:office" xmlns:r="http://schemas.openxmlformats.org/officeDocument/2006/relationships" xmlns:m="http://schemas.openxmlformats.org/officeDocument/2006/math" xmlns:v="urn:schemas-microsoft-com:vml" xmlns:wp="http://schemas.openxmlformats.org/drawingml/2006/wordprocessingDrawing" xmlns:w10="urn:schemas-microsoft-com:office:word" xmlns:w="http://schemas.openxmlformats.org/wordprocessingml/2006/main" xmlns:wne="http://schemas.microsoft.com/office/word/2006/wordml" xmlns:sl="http://schemas.openxmlformats.org/schemaLibrary/2006/main" xmlns:a="http://schemas.openxmlformats.org/drawingml/2006/main" xmlns:pic="http://schemas.openxmlformats.org/drawingml/2006/picture" xmlns:c="http://schemas.openxmlformats.org/drawingml/2006/chart" xmlns:lc="http://schemas.openxmlformats.org/drawingml/2006/lockedCanvas" xmlns:dgm="http://schemas.openxmlformats.org/drawingml/2006/diagram" xmlns:wps="http://schemas.microsoft.com/office/word/2010/wordprocessingShape" xmlns:wpg="http://schemas.microsoft.com/office/word/2010/wordprocessingGroup" xmlns:w14="http://schemas.microsoft.com/office/word/2010/wordml" xmlns:w15="http://schemas.microsoft.com/office/word/2012/wordml" xmlns:w16="http://schemas.microsoft.com/office/word/2018/wordml" xmlns:w16cex="http://schemas.microsoft.com/office/word/2018/wordml/cex" xmlns:w16cid="http://schemas.microsoft.com/office/word/2016/wordml/cid" xmlns="http://schemas.microsoft.com/office/tasks/2019/documenttasks" xmlns:cr="http://schemas.microsoft.com/office/comments/2020/reactions">
-  <w:p>
-    <w:pPr>
-      <w:keepNext w:val="0"/>
-      <w:keepLines w:val="0"/>
-      <w:pageBreakBefore w:val="0"/>
-      <w:widowControl w:val="1"/>
-      <w:pBdr>
-        <w:top w:space="0" w:sz="0" w:val="nil"/>
-        <w:left w:space="0" w:sz="0" w:val="nil"/>
-        <w:bottom w:space="0" w:sz="0" w:val="nil"/>
-        <w:right w:space="0" w:sz="0" w:val="nil"/>
-        <w:between w:space="0" w:sz="0" w:val="nil"/>
-      </w:pBdr>
-      <w:shd w:fill="auto" w:val="clear"/>
-      <w:tabs>
-        <w:tab w:val="center" w:leader="none" w:pos="4252"/>
-        <w:tab w:val="right" w:leader="none" w:pos="8504"/>
-      </w:tabs>
-      <w:spacing w:after="0" w:before="0" w:line="240" w:lineRule="auto"/>
-      <w:ind w:left="0" w:right="0" w:firstLine="0"/>
-      <w:jc w:val="left"/>
-      <w:rPr>
-        <w:rFonts w:ascii="Aptos" w:cs="Aptos" w:eastAsia="Aptos" w:hAnsi="Aptos"/>
-        <w:b w:val="0"/>
-        <w:bCs w:val="0"/>
-        <w:i w:val="0"/>
-        <w:iCs w:val="0"/>
-        <w:smallCaps w:val="0"/>
-        <w:strike w:val="0"/>
-        <w:color w:val="000000"/>
-        <w:sz w:val="24"/>
-        <w:szCs w:val="24"/>
-        <w:u w:val="none"/>
-        <w:shd w:fill="auto" w:val="clear"/>
-        <w:vertAlign w:val="baseline"/>
-      </w:rPr>
-    </w:pPr>
-    <w:r>
-      <w:rPr>
-        <w:rtl w:val="0"/>
-      </w:rPr>
-    </w:r>
-  </w:p>
-</w:hdr>
-</file>
-
-<file path=word/numbering.xml><?xml version="1.0" encoding="utf-8"?>
-<w:numbering xmlns:mc="http://schemas.openxmlformats.org/markup-compatibility/2006" xmlns:o="urn:schemas-microsoft-com:office:office" xmlns:r="http://schemas.openxmlformats.org/officeDocument/2006/relationships" xmlns:m="http://schemas.openxmlformats.org/officeDocument/2006/math" xmlns:v="urn:schemas-microsoft-com:vml" xmlns:wp="http://schemas.openxmlformats.org/drawingml/2006/wordprocessingDrawing" xmlns:w10="urn:schemas-microsoft-com:office:word" xmlns:w="http://schemas.openxmlformats.org/wordprocessingml/2006/main" xmlns:wne="http://schemas.microsoft.com/office/word/2006/wordml" xmlns:sl="http://schemas.openxmlformats.org/schemaLibrary/2006/main" xmlns:a="http://schemas.openxmlformats.org/drawingml/2006/main" xmlns:pic="http://schemas.openxmlformats.org/drawingml/2006/picture" xmlns:c="http://schemas.openxmlformats.org/drawingml/2006/chart" xmlns:lc="http://schemas.openxmlformats.org/drawingml/2006/lockedCanvas" xmlns:dgm="http://schemas.openxmlformats.org/drawingml/2006/diagram" xmlns:wps="http://schemas.microsoft.com/office/word/2010/wordprocessingShape" xmlns:wpg="http://schemas.microsoft.com/office/word/2010/wordprocessingGroup" xmlns:w14="http://schemas.microsoft.com/office/word/2010/wordml" xmlns:w15="http://schemas.microsoft.com/office/word/2012/wordml" xmlns:w16="http://schemas.microsoft.com/office/word/2018/wordml" xmlns:w16cex="http://schemas.microsoft.com/office/word/2018/wordml/cex" xmlns:w16cid="http://schemas.microsoft.com/office/word/2016/wordml/cid" xmlns="http://schemas.microsoft.com/office/tasks/2019/documenttasks" xmlns:cr="http://schemas.microsoft.com/office/comments/2020/reactions">
-  <w:abstractNum w:abstractNumId="1">
-    <w:lvl w:ilvl="0">
-      <w:start w:val="1"/>
-      <w:numFmt w:val="bullet"/>
-      <w:lvlText w:val="●"/>
-      <w:lvlJc w:val="left"/>
-      <w:pPr>
-        <w:ind w:left="720" w:hanging="360"/>
-      </w:pPr>
-      <w:rPr>
-        <w:u w:val="none"/>
-      </w:rPr>
-    </w:lvl>
-    <w:lvl w:ilvl="1">
-      <w:start w:val="1"/>
-      <w:numFmt w:val="bullet"/>
-      <w:lvlText w:val="○"/>
-      <w:lvlJc w:val="left"/>
-      <w:pPr>
-        <w:ind w:left="1440" w:hanging="360"/>
-      </w:pPr>
-      <w:rPr>
-        <w:u w:val="none"/>
-      </w:rPr>
-    </w:lvl>
-    <w:lvl w:ilvl="2">
-      <w:start w:val="1"/>
-      <w:numFmt w:val="bullet"/>
-      <w:lvlText w:val="■"/>
-      <w:lvlJc w:val="left"/>
-      <w:pPr>
-        <w:ind w:left="2160" w:hanging="360"/>
-      </w:pPr>
-      <w:rPr>
-        <w:u w:val="none"/>
-      </w:rPr>
-    </w:lvl>
-    <w:lvl w:ilvl="3">
-      <w:start w:val="1"/>
-      <w:numFmt w:val="bullet"/>
-      <w:lvlText w:val="●"/>
-      <w:lvlJc w:val="left"/>
-      <w:pPr>
-        <w:ind w:left="2880" w:hanging="360"/>
-      </w:pPr>
-      <w:rPr>
-        <w:u w:val="none"/>
-      </w:rPr>
-    </w:lvl>
-    <w:lvl w:ilvl="4">
-      <w:start w:val="1"/>
-      <w:numFmt w:val="bullet"/>
-      <w:lvlText w:val="○"/>
-      <w:lvlJc w:val="left"/>
-      <w:pPr>
-        <w:ind w:left="3600" w:hanging="360"/>
-      </w:pPr>
-      <w:rPr>
-        <w:u w:val="none"/>
-      </w:rPr>
-    </w:lvl>
-    <w:lvl w:ilvl="5">
-      <w:start w:val="1"/>
-      <w:numFmt w:val="bullet"/>
-      <w:lvlText w:val="■"/>
-      <w:lvlJc w:val="left"/>
-      <w:pPr>
-        <w:ind w:left="4320" w:hanging="360"/>
-      </w:pPr>
-      <w:rPr>
-        <w:u w:val="none"/>
-      </w:rPr>
-    </w:lvl>
-    <w:lvl w:ilvl="6">
-      <w:start w:val="1"/>
-      <w:numFmt w:val="bullet"/>
-      <w:lvlText w:val="●"/>
-      <w:lvlJc w:val="left"/>
-      <w:pPr>
-        <w:ind w:left="5040" w:hanging="360"/>
-      </w:pPr>
-      <w:rPr>
-        <w:u w:val="none"/>
-      </w:rPr>
-    </w:lvl>
-    <w:lvl w:ilvl="7">
-      <w:start w:val="1"/>
-      <w:numFmt w:val="bullet"/>
-      <w:lvlText w:val="○"/>
-      <w:lvlJc w:val="left"/>
-      <w:pPr>
-        <w:ind w:left="5760" w:hanging="360"/>
-      </w:pPr>
-      <w:rPr>
-        <w:u w:val="none"/>
-      </w:rPr>
-    </w:lvl>
-    <w:lvl w:ilvl="8">
-      <w:start w:val="1"/>
-      <w:numFmt w:val="bullet"/>
-      <w:lvlText w:val="■"/>
-      <w:lvlJc w:val="left"/>
-      <w:pPr>
-        <w:ind w:left="6480" w:hanging="360"/>
-      </w:pPr>
-      <w:rPr>
-        <w:u w:val="none"/>
-      </w:rPr>
-    </w:lvl>
-  </w:abstractNum>
-  <w:abstractNum w:abstractNumId="2">
-    <w:lvl w:ilvl="0">
-      <w:start w:val="1"/>
-      <w:numFmt w:val="bullet"/>
-      <w:lvlText w:val="●"/>
-      <w:lvlJc w:val="left"/>
-      <w:pPr>
-        <w:ind w:left="720" w:hanging="360"/>
-      </w:pPr>
-      <w:rPr>
-        <w:u w:val="none"/>
-      </w:rPr>
-    </w:lvl>
-    <w:lvl w:ilvl="1">
-      <w:start w:val="1"/>
-      <w:numFmt w:val="bullet"/>
-      <w:lvlText w:val="○"/>
-      <w:lvlJc w:val="left"/>
-      <w:pPr>
-        <w:ind w:left="1440" w:hanging="360"/>
-      </w:pPr>
-      <w:rPr>
-        <w:u w:val="none"/>
-      </w:rPr>
-    </w:lvl>
-    <w:lvl w:ilvl="2">
-      <w:start w:val="1"/>
-      <w:numFmt w:val="bullet"/>
-      <w:lvlText w:val="■"/>
-      <w:lvlJc w:val="left"/>
-      <w:pPr>
-        <w:ind w:left="2160" w:hanging="360"/>
-      </w:pPr>
-      <w:rPr>
-        <w:u w:val="none"/>
-      </w:rPr>
-    </w:lvl>
-    <w:lvl w:ilvl="3">
-      <w:start w:val="1"/>
-      <w:numFmt w:val="bullet"/>
-      <w:lvlText w:val="●"/>
-      <w:lvlJc w:val="left"/>
-      <w:pPr>
-        <w:ind w:left="2880" w:hanging="360"/>
-      </w:pPr>
-      <w:rPr>
-        <w:u w:val="none"/>
-      </w:rPr>
-    </w:lvl>
-    <w:lvl w:ilvl="4">
-      <w:start w:val="1"/>
-      <w:numFmt w:val="bullet"/>
-      <w:lvlText w:val="○"/>
-      <w:lvlJc w:val="left"/>
-      <w:pPr>
-        <w:ind w:left="3600" w:hanging="360"/>
-      </w:pPr>
-      <w:rPr>
-        <w:u w:val="none"/>
-      </w:rPr>
-    </w:lvl>
-    <w:lvl w:ilvl="5">
-      <w:start w:val="1"/>
-      <w:numFmt w:val="bullet"/>
-      <w:lvlText w:val="■"/>
-      <w:lvlJc w:val="left"/>
-      <w:pPr>
-        <w:ind w:left="4320" w:hanging="360"/>
-      </w:pPr>
-      <w:rPr>
-        <w:u w:val="none"/>
-      </w:rPr>
-    </w:lvl>
-    <w:lvl w:ilvl="6">
-      <w:start w:val="1"/>
-      <w:numFmt w:val="bullet"/>
-      <w:lvlText w:val="●"/>
-      <w:lvlJc w:val="left"/>
-      <w:pPr>
-        <w:ind w:left="5040" w:hanging="360"/>
-      </w:pPr>
-      <w:rPr>
-        <w:u w:val="none"/>
-      </w:rPr>
-    </w:lvl>
-    <w:lvl w:ilvl="7">
-      <w:start w:val="1"/>
-      <w:numFmt w:val="bullet"/>
-      <w:lvlText w:val="○"/>
-      <w:lvlJc w:val="left"/>
-      <w:pPr>
-        <w:ind w:left="5760" w:hanging="360"/>
-      </w:pPr>
-      <w:rPr>
-        <w:u w:val="none"/>
-      </w:rPr>
-    </w:lvl>
-    <w:lvl w:ilvl="8">
-      <w:start w:val="1"/>
-      <w:numFmt w:val="bullet"/>
-      <w:lvlText w:val="■"/>
-      <w:lvlJc w:val="left"/>
-      <w:pPr>
-        <w:ind w:left="6480" w:hanging="360"/>
-      </w:pPr>
-      <w:rPr>
-        <w:u w:val="none"/>
-      </w:rPr>
-    </w:lvl>
-  </w:abstractNum>
-  <w:abstractNum w:abstractNumId="3">
-    <w:lvl w:ilvl="0">
-      <w:start w:val="1"/>
-      <w:numFmt w:val="bullet"/>
-      <w:lvlText w:val="●"/>
-      <w:lvlJc w:val="left"/>
-      <w:pPr>
-        <w:ind w:left="720" w:hanging="360"/>
-      </w:pPr>
-      <w:rPr>
-        <w:rFonts w:ascii="Noto Sans Symbols" w:cs="Noto Sans Symbols" w:eastAsia="Noto Sans Symbols" w:hAnsi="Noto Sans Symbols"/>
-      </w:rPr>
-    </w:lvl>
-    <w:lvl w:ilvl="1">
-      <w:start w:val="1"/>
-      <w:numFmt w:val="bullet"/>
-      <w:lvlText w:val="ο"/>
-      <w:lvlJc w:val="left"/>
-      <w:pPr>
-        <w:ind w:left="1440" w:hanging="360"/>
-      </w:pPr>
-      <w:rPr>
-        <w:rFonts w:ascii="Noto Sans Symbols" w:cs="Noto Sans Symbols" w:eastAsia="Noto Sans Symbols" w:hAnsi="Noto Sans Symbols"/>
-      </w:rPr>
-    </w:lvl>
-    <w:lvl w:ilvl="2">
-      <w:start w:val="0"/>
-      <w:numFmt w:val="decimal"/>
-      <w:lvlText w:val=""/>
-      <w:lvlJc w:val="left"/>
-      <w:pPr>
-        <w:ind w:left="0" w:firstLine="0"/>
-      </w:pPr>
-      <w:rPr/>
-    </w:lvl>
-    <w:lvl w:ilvl="3">
-      <w:start w:val="0"/>
-      <w:numFmt w:val="decimal"/>
-      <w:lvlText w:val=""/>
-      <w:lvlJc w:val="left"/>
-      <w:pPr>
-        <w:ind w:left="0" w:firstLine="0"/>
-      </w:pPr>
-      <w:rPr/>
-    </w:lvl>
-    <w:lvl w:ilvl="4">
-      <w:start w:val="0"/>
-      <w:numFmt w:val="decimal"/>
-      <w:lvlText w:val=""/>
-      <w:lvlJc w:val="left"/>
-      <w:pPr>
-        <w:ind w:left="0" w:firstLine="0"/>
-      </w:pPr>
-      <w:rPr/>
-    </w:lvl>
-    <w:lvl w:ilvl="5">
-      <w:start w:val="0"/>
-      <w:numFmt w:val="decimal"/>
-      <w:lvlText w:val=""/>
-      <w:lvlJc w:val="left"/>
-      <w:pPr>
-        <w:ind w:left="0" w:firstLine="0"/>
-      </w:pPr>
-      <w:rPr/>
-    </w:lvl>
-    <w:lvl w:ilvl="6">
-      <w:start w:val="0"/>
-      <w:numFmt w:val="decimal"/>
-      <w:lvlText w:val=""/>
-      <w:lvlJc w:val="left"/>
-      <w:pPr>
-        <w:ind w:left="0" w:firstLine="0"/>
-      </w:pPr>
-      <w:rPr/>
-    </w:lvl>
-    <w:lvl w:ilvl="7">
-      <w:start w:val="0"/>
-      <w:numFmt w:val="decimal"/>
-      <w:lvlText w:val=""/>
-      <w:lvlJc w:val="left"/>
-      <w:pPr>
-        <w:ind w:left="0" w:firstLine="0"/>
-      </w:pPr>
-      <w:rPr/>
-    </w:lvl>
-    <w:lvl w:ilvl="8">
-      <w:start w:val="0"/>
-      <w:numFmt w:val="decimal"/>
-      <w:lvlText w:val=""/>
-      <w:lvlJc w:val="left"/>
-      <w:pPr>
-        <w:ind w:left="0" w:firstLine="0"/>
-      </w:pPr>
-      <w:rPr/>
-    </w:lvl>
-  </w:abstractNum>
-  <w:abstractNum w:abstractNumId="4">
-    <w:lvl w:ilvl="0">
-      <w:start w:val="1"/>
-      <w:numFmt w:val="bullet"/>
-      <w:lvlText w:val="●"/>
-      <w:lvlJc w:val="left"/>
-      <w:pPr>
-        <w:ind w:left="720" w:hanging="360"/>
-      </w:pPr>
-      <w:rPr>
-        <w:u w:val="none"/>
-      </w:rPr>
-    </w:lvl>
-    <w:lvl w:ilvl="1">
-      <w:start w:val="1"/>
-      <w:numFmt w:val="bullet"/>
-      <w:lvlText w:val="○"/>
-      <w:lvlJc w:val="left"/>
-      <w:pPr>
-        <w:ind w:left="1440" w:hanging="360"/>
-      </w:pPr>
-      <w:rPr>
-        <w:u w:val="none"/>
-      </w:rPr>
-    </w:lvl>
-    <w:lvl w:ilvl="2">
-      <w:start w:val="1"/>
-      <w:numFmt w:val="bullet"/>
-      <w:lvlText w:val="■"/>
-      <w:lvlJc w:val="left"/>
-      <w:pPr>
-        <w:ind w:left="2160" w:hanging="360"/>
-      </w:pPr>
-      <w:rPr>
-        <w:u w:val="none"/>
-      </w:rPr>
-    </w:lvl>
-    <w:lvl w:ilvl="3">
-      <w:start w:val="1"/>
-      <w:numFmt w:val="bullet"/>
-      <w:lvlText w:val="●"/>
-      <w:lvlJc w:val="left"/>
-      <w:pPr>
-        <w:ind w:left="2880" w:hanging="360"/>
-      </w:pPr>
-      <w:rPr>
-        <w:u w:val="none"/>
-      </w:rPr>
-    </w:lvl>
-    <w:lvl w:ilvl="4">
-      <w:start w:val="1"/>
-      <w:numFmt w:val="bullet"/>
-      <w:lvlText w:val="○"/>
-      <w:lvlJc w:val="left"/>
-      <w:pPr>
-        <w:ind w:left="3600" w:hanging="360"/>
-      </w:pPr>
-      <w:rPr>
-        <w:u w:val="none"/>
-      </w:rPr>
-    </w:lvl>
-    <w:lvl w:ilvl="5">
-      <w:start w:val="1"/>
-      <w:numFmt w:val="bullet"/>
-      <w:lvlText w:val="■"/>
-      <w:lvlJc w:val="left"/>
-      <w:pPr>
-        <w:ind w:left="4320" w:hanging="360"/>
-      </w:pPr>
-      <w:rPr>
-        <w:u w:val="none"/>
-      </w:rPr>
-    </w:lvl>
-    <w:lvl w:ilvl="6">
-      <w:start w:val="1"/>
-      <w:numFmt w:val="bullet"/>
-      <w:lvlText w:val="●"/>
-      <w:lvlJc w:val="left"/>
-      <w:pPr>
-        <w:ind w:left="5040" w:hanging="360"/>
-      </w:pPr>
-      <w:rPr>
-        <w:u w:val="none"/>
-      </w:rPr>
-    </w:lvl>
-    <w:lvl w:ilvl="7">
-      <w:start w:val="1"/>
-      <w:numFmt w:val="bullet"/>
-      <w:lvlText w:val="○"/>
-      <w:lvlJc w:val="left"/>
-      <w:pPr>
-        <w:ind w:left="5760" w:hanging="360"/>
-      </w:pPr>
-      <w:rPr>
-        <w:u w:val="none"/>
-      </w:rPr>
-    </w:lvl>
-    <w:lvl w:ilvl="8">
-      <w:start w:val="1"/>
-      <w:numFmt w:val="bullet"/>
-      <w:lvlText w:val="■"/>
-      <w:lvlJc w:val="left"/>
-      <w:pPr>
-        <w:ind w:left="6480" w:hanging="360"/>
-      </w:pPr>
-      <w:rPr>
-        <w:u w:val="none"/>
-      </w:rPr>
-    </w:lvl>
-  </w:abstractNum>
-  <w:abstractNum w:abstractNumId="5">
-    <w:lvl w:ilvl="0">
-      <w:start w:val="1"/>
-      <w:numFmt w:val="bullet"/>
-      <w:lvlText w:val="●"/>
-      <w:lvlJc w:val="left"/>
-      <w:pPr>
-        <w:ind w:left="720" w:hanging="360"/>
-      </w:pPr>
-      <w:rPr>
-        <w:u w:val="none"/>
-      </w:rPr>
-    </w:lvl>
-    <w:lvl w:ilvl="1">
-      <w:start w:val="1"/>
-      <w:numFmt w:val="bullet"/>
-      <w:lvlText w:val="○"/>
-      <w:lvlJc w:val="left"/>
-      <w:pPr>
-        <w:ind w:left="1440" w:hanging="360"/>
-      </w:pPr>
-      <w:rPr>
-        <w:u w:val="none"/>
-      </w:rPr>
-    </w:lvl>
-    <w:lvl w:ilvl="2">
-      <w:start w:val="1"/>
-      <w:numFmt w:val="bullet"/>
-      <w:lvlText w:val="■"/>
-      <w:lvlJc w:val="left"/>
-      <w:pPr>
-        <w:ind w:left="2160" w:hanging="360"/>
-      </w:pPr>
-      <w:rPr>
-        <w:u w:val="none"/>
-      </w:rPr>
-    </w:lvl>
-    <w:lvl w:ilvl="3">
-      <w:start w:val="1"/>
-      <w:numFmt w:val="bullet"/>
-      <w:lvlText w:val="●"/>
-      <w:lvlJc w:val="left"/>
-      <w:pPr>
-        <w:ind w:left="2880" w:hanging="360"/>
-      </w:pPr>
-      <w:rPr>
-        <w:u w:val="none"/>
-      </w:rPr>
-    </w:lvl>
-    <w:lvl w:ilvl="4">
-      <w:start w:val="1"/>
-      <w:numFmt w:val="bullet"/>
-      <w:lvlText w:val="○"/>
-      <w:lvlJc w:val="left"/>
-      <w:pPr>
-        <w:ind w:left="3600" w:hanging="360"/>
-      </w:pPr>
-      <w:rPr>
-        <w:u w:val="none"/>
-      </w:rPr>
-    </w:lvl>
-    <w:lvl w:ilvl="5">
-      <w:start w:val="1"/>
-      <w:numFmt w:val="bullet"/>
-      <w:lvlText w:val="■"/>
-      <w:lvlJc w:val="left"/>
-      <w:pPr>
-        <w:ind w:left="4320" w:hanging="360"/>
-      </w:pPr>
-      <w:rPr>
-        <w:u w:val="none"/>
-      </w:rPr>
-    </w:lvl>
-    <w:lvl w:ilvl="6">
-      <w:start w:val="1"/>
-      <w:numFmt w:val="bullet"/>
-      <w:lvlText w:val="●"/>
-      <w:lvlJc w:val="left"/>
-      <w:pPr>
-        <w:ind w:left="5040" w:hanging="360"/>
-      </w:pPr>
-      <w:rPr>
-        <w:u w:val="none"/>
-      </w:rPr>
-    </w:lvl>
-    <w:lvl w:ilvl="7">
-      <w:start w:val="1"/>
-      <w:numFmt w:val="bullet"/>
-      <w:lvlText w:val="○"/>
-      <w:lvlJc w:val="left"/>
-      <w:pPr>
-        <w:ind w:left="5760" w:hanging="360"/>
-      </w:pPr>
-      <w:rPr>
-        <w:u w:val="none"/>
-      </w:rPr>
-    </w:lvl>
-    <w:lvl w:ilvl="8">
-      <w:start w:val="1"/>
-      <w:numFmt w:val="bullet"/>
-      <w:lvlText w:val="■"/>
-      <w:lvlJc w:val="left"/>
-      <w:pPr>
-        <w:ind w:left="6480" w:hanging="360"/>
-      </w:pPr>
-      <w:rPr>
-        <w:u w:val="none"/>
-      </w:rPr>
-    </w:lvl>
-  </w:abstractNum>
-  <w:abstractNum w:abstractNumId="6">
-    <w:lvl w:ilvl="0">
-      <w:start w:val="1"/>
-      <w:numFmt w:val="bullet"/>
-      <w:lvlText w:val="●"/>
-      <w:lvlJc w:val="left"/>
-      <w:pPr>
-        <w:ind w:left="720" w:hanging="360"/>
-      </w:pPr>
-      <w:rPr>
-        <w:u w:val="none"/>
-      </w:rPr>
-    </w:lvl>
-    <w:lvl w:ilvl="1">
-      <w:start w:val="1"/>
-      <w:numFmt w:val="bullet"/>
-      <w:lvlText w:val="○"/>
-      <w:lvlJc w:val="left"/>
-      <w:pPr>
-        <w:ind w:left="1440" w:hanging="360"/>
-      </w:pPr>
-      <w:rPr>
-        <w:u w:val="none"/>
-      </w:rPr>
-    </w:lvl>
-    <w:lvl w:ilvl="2">
-      <w:start w:val="1"/>
-      <w:numFmt w:val="bullet"/>
-      <w:lvlText w:val="■"/>
-      <w:lvlJc w:val="left"/>
-      <w:pPr>
-        <w:ind w:left="2160" w:hanging="360"/>
-      </w:pPr>
-      <w:rPr>
-        <w:u w:val="none"/>
-      </w:rPr>
-    </w:lvl>
-    <w:lvl w:ilvl="3">
-      <w:start w:val="1"/>
-      <w:numFmt w:val="bullet"/>
-      <w:lvlText w:val="●"/>
-      <w:lvlJc w:val="left"/>
-      <w:pPr>
-        <w:ind w:left="2880" w:hanging="360"/>
-      </w:pPr>
-      <w:rPr>
-        <w:u w:val="none"/>
-      </w:rPr>
-    </w:lvl>
-    <w:lvl w:ilvl="4">
-      <w:start w:val="1"/>
-      <w:numFmt w:val="bullet"/>
-      <w:lvlText w:val="○"/>
-      <w:lvlJc w:val="left"/>
-      <w:pPr>
-        <w:ind w:left="3600" w:hanging="360"/>
-      </w:pPr>
-      <w:rPr>
-        <w:u w:val="none"/>
-      </w:rPr>
-    </w:lvl>
-    <w:lvl w:ilvl="5">
-      <w:start w:val="1"/>
-      <w:numFmt w:val="bullet"/>
-      <w:lvlText w:val="■"/>
-      <w:lvlJc w:val="left"/>
-      <w:pPr>
-        <w:ind w:left="4320" w:hanging="360"/>
-      </w:pPr>
-      <w:rPr>
-        <w:u w:val="none"/>
-      </w:rPr>
-    </w:lvl>
-    <w:lvl w:ilvl="6">
-      <w:start w:val="1"/>
-      <w:numFmt w:val="bullet"/>
-      <w:lvlText w:val="●"/>
-      <w:lvlJc w:val="left"/>
-      <w:pPr>
-        <w:ind w:left="5040" w:hanging="360"/>
-      </w:pPr>
-      <w:rPr>
-        <w:u w:val="none"/>
-      </w:rPr>
-    </w:lvl>
-    <w:lvl w:ilvl="7">
-      <w:start w:val="1"/>
-      <w:numFmt w:val="bullet"/>
-      <w:lvlText w:val="○"/>
-      <w:lvlJc w:val="left"/>
-      <w:pPr>
-        <w:ind w:left="5760" w:hanging="360"/>
-      </w:pPr>
-      <w:rPr>
-        <w:u w:val="none"/>
-      </w:rPr>
-    </w:lvl>
-    <w:lvl w:ilvl="8">
-      <w:start w:val="1"/>
-      <w:numFmt w:val="bullet"/>
-      <w:lvlText w:val="■"/>
-      <w:lvlJc w:val="left"/>
-      <w:pPr>
-        <w:ind w:left="6480" w:hanging="360"/>
-      </w:pPr>
-      <w:rPr>
-        <w:u w:val="none"/>
-      </w:rPr>
-    </w:lvl>
-  </w:abstractNum>
-  <w:abstractNum w:abstractNumId="7">
-    <w:lvl w:ilvl="0">
-      <w:start w:val="1"/>
-      <w:numFmt w:val="bullet"/>
-      <w:lvlText w:val="●"/>
-      <w:lvlJc w:val="left"/>
-      <w:pPr>
-        <w:ind w:left="720" w:hanging="360"/>
-      </w:pPr>
-      <w:rPr>
-        <w:u w:val="none"/>
-      </w:rPr>
-    </w:lvl>
-    <w:lvl w:ilvl="1">
-      <w:start w:val="1"/>
-      <w:numFmt w:val="bullet"/>
-      <w:lvlText w:val="○"/>
-      <w:lvlJc w:val="left"/>
-      <w:pPr>
-        <w:ind w:left="1440" w:hanging="360"/>
-      </w:pPr>
-      <w:rPr>
-        <w:u w:val="none"/>
-      </w:rPr>
-    </w:lvl>
-    <w:lvl w:ilvl="2">
-      <w:start w:val="1"/>
-      <w:numFmt w:val="bullet"/>
-      <w:lvlText w:val="■"/>
-      <w:lvlJc w:val="left"/>
-      <w:pPr>
-        <w:ind w:left="2160" w:hanging="360"/>
-      </w:pPr>
-      <w:rPr>
-        <w:u w:val="none"/>
-      </w:rPr>
-    </w:lvl>
-    <w:lvl w:ilvl="3">
-      <w:start w:val="1"/>
-      <w:numFmt w:val="bullet"/>
-      <w:lvlText w:val="●"/>
-      <w:lvlJc w:val="left"/>
-      <w:pPr>
-        <w:ind w:left="2880" w:hanging="360"/>
-      </w:pPr>
-      <w:rPr>
-        <w:u w:val="none"/>
-      </w:rPr>
-    </w:lvl>
-    <w:lvl w:ilvl="4">
-      <w:start w:val="1"/>
-      <w:numFmt w:val="bullet"/>
-      <w:lvlText w:val="○"/>
-      <w:lvlJc w:val="left"/>
-      <w:pPr>
-        <w:ind w:left="3600" w:hanging="360"/>
-      </w:pPr>
-      <w:rPr>
-        <w:u w:val="none"/>
-      </w:rPr>
-    </w:lvl>
-    <w:lvl w:ilvl="5">
-      <w:start w:val="1"/>
-      <w:numFmt w:val="bullet"/>
-      <w:lvlText w:val="■"/>
-      <w:lvlJc w:val="left"/>
-      <w:pPr>
-        <w:ind w:left="4320" w:hanging="360"/>
-      </w:pPr>
-      <w:rPr>
-        <w:u w:val="none"/>
-      </w:rPr>
-    </w:lvl>
-    <w:lvl w:ilvl="6">
-      <w:start w:val="1"/>
-      <w:numFmt w:val="bullet"/>
-      <w:lvlText w:val="●"/>
-      <w:lvlJc w:val="left"/>
-      <w:pPr>
-        <w:ind w:left="5040" w:hanging="360"/>
-      </w:pPr>
-      <w:rPr>
-        <w:u w:val="none"/>
-      </w:rPr>
-    </w:lvl>
-    <w:lvl w:ilvl="7">
-      <w:start w:val="1"/>
-      <w:numFmt w:val="bullet"/>
-      <w:lvlText w:val="○"/>
-      <w:lvlJc w:val="left"/>
-      <w:pPr>
-        <w:ind w:left="5760" w:hanging="360"/>
-      </w:pPr>
-      <w:rPr>
-        <w:u w:val="none"/>
-      </w:rPr>
-    </w:lvl>
-    <w:lvl w:ilvl="8">
-      <w:start w:val="1"/>
-      <w:numFmt w:val="bullet"/>
-      <w:lvlText w:val="■"/>
-      <w:lvlJc w:val="left"/>
-      <w:pPr>
-        <w:ind w:left="6480" w:hanging="360"/>
-      </w:pPr>
-      <w:rPr>
-        <w:u w:val="none"/>
-      </w:rPr>
-    </w:lvl>
-  </w:abstractNum>
-  <w:abstractNum w:abstractNumId="8">
-    <w:lvl w:ilvl="0">
-      <w:start w:val="1"/>
-      <w:numFmt w:val="bullet"/>
-      <w:lvlText w:val="●"/>
-      <w:lvlJc w:val="left"/>
-      <w:pPr>
-        <w:ind w:left="720" w:hanging="360"/>
-      </w:pPr>
-      <w:rPr>
-        <w:u w:val="none"/>
-      </w:rPr>
-    </w:lvl>
-    <w:lvl w:ilvl="1">
-      <w:start w:val="1"/>
-      <w:numFmt w:val="bullet"/>
-      <w:lvlText w:val="○"/>
-      <w:lvlJc w:val="left"/>
-      <w:pPr>
-        <w:ind w:left="1440" w:hanging="360"/>
-      </w:pPr>
-      <w:rPr>
-        <w:u w:val="none"/>
-      </w:rPr>
-    </w:lvl>
-    <w:lvl w:ilvl="2">
-      <w:start w:val="1"/>
-      <w:numFmt w:val="bullet"/>
-      <w:lvlText w:val="■"/>
-      <w:lvlJc w:val="left"/>
-      <w:pPr>
-        <w:ind w:left="2160" w:hanging="360"/>
-      </w:pPr>
-      <w:rPr>
-        <w:u w:val="none"/>
-      </w:rPr>
-    </w:lvl>
-    <w:lvl w:ilvl="3">
-      <w:start w:val="1"/>
-      <w:numFmt w:val="bullet"/>
-      <w:lvlText w:val="●"/>
-      <w:lvlJc w:val="left"/>
-      <w:pPr>
-        <w:ind w:left="2880" w:hanging="360"/>
-      </w:pPr>
-      <w:rPr>
-        <w:u w:val="none"/>
-      </w:rPr>
-    </w:lvl>
-    <w:lvl w:ilvl="4">
-      <w:start w:val="1"/>
-      <w:numFmt w:val="bullet"/>
-      <w:lvlText w:val="○"/>
-      <w:lvlJc w:val="left"/>
-      <w:pPr>
-        <w:ind w:left="3600" w:hanging="360"/>
-      </w:pPr>
-      <w:rPr>
-        <w:u w:val="none"/>
-      </w:rPr>
-    </w:lvl>
-    <w:lvl w:ilvl="5">
-      <w:start w:val="1"/>
-      <w:numFmt w:val="bullet"/>
-      <w:lvlText w:val="■"/>
-      <w:lvlJc w:val="left"/>
-      <w:pPr>
-        <w:ind w:left="4320" w:hanging="360"/>
-      </w:pPr>
-      <w:rPr>
-        <w:u w:val="none"/>
-      </w:rPr>
-    </w:lvl>
-    <w:lvl w:ilvl="6">
-      <w:start w:val="1"/>
-      <w:numFmt w:val="bullet"/>
-      <w:lvlText w:val="●"/>
-      <w:lvlJc w:val="left"/>
-      <w:pPr>
-        <w:ind w:left="5040" w:hanging="360"/>
-      </w:pPr>
-      <w:rPr>
-        <w:u w:val="none"/>
-      </w:rPr>
-    </w:lvl>
-    <w:lvl w:ilvl="7">
-      <w:start w:val="1"/>
-      <w:numFmt w:val="bullet"/>
-      <w:lvlText w:val="○"/>
-      <w:lvlJc w:val="left"/>
-      <w:pPr>
-        <w:ind w:left="5760" w:hanging="360"/>
-      </w:pPr>
-      <w:rPr>
-        <w:u w:val="none"/>
-      </w:rPr>
-    </w:lvl>
-    <w:lvl w:ilvl="8">
-      <w:start w:val="1"/>
-      <w:numFmt w:val="bullet"/>
-      <w:lvlText w:val="■"/>
-      <w:lvlJc w:val="left"/>
-      <w:pPr>
-        <w:ind w:left="6480" w:hanging="360"/>
-      </w:pPr>
-      <w:rPr>
-        <w:u w:val="none"/>
-      </w:rPr>
-    </w:lvl>
-  </w:abstractNum>
-  <w:num w:numId="1">
-    <w:abstractNumId w:val="1"/>
-  </w:num>
-  <w:num w:numId="2">
-    <w:abstractNumId w:val="2"/>
-  </w:num>
-  <w:num w:numId="3">
-    <w:abstractNumId w:val="3"/>
-  </w:num>
-  <w:num w:numId="4">
-    <w:abstractNumId w:val="4"/>
-  </w:num>
-  <w:num w:numId="5">
-    <w:abstractNumId w:val="5"/>
-  </w:num>
-  <w:num w:numId="6">
-    <w:abstractNumId w:val="6"/>
-  </w:num>
-  <w:num w:numId="7">
-    <w:abstractNumId w:val="7"/>
-  </w:num>
-  <w:num w:numId="8">
-    <w:abstractNumId w:val="8"/>
-  </w:num>
-</w:numbering>
-</file>
-
-<file path=word/styles.xml><?xml version="1.0" encoding="utf-8"?>
-<w:styles xmlns:mc="http://schemas.openxmlformats.org/markup-compatibility/2006" xmlns:o="urn:schemas-microsoft-com:office:office" xmlns:r="http://schemas.openxmlformats.org/officeDocument/2006/relationships" xmlns:m="http://schemas.openxmlformats.org/officeDocument/2006/math" xmlns:v="urn:schemas-microsoft-com:vml" xmlns:wp="http://schemas.openxmlformats.org/drawingml/2006/wordprocessingDrawing" xmlns:w10="urn:schemas-microsoft-com:office:word" xmlns:w="http://schemas.openxmlformats.org/wordprocessingml/2006/main" xmlns:wne="http://schemas.microsoft.com/office/word/2006/wordml" xmlns:sl="http://schemas.openxmlformats.org/schemaLibrary/2006/main" xmlns:a="http://schemas.openxmlformats.org/drawingml/2006/main" xmlns:pic="http://schemas.openxmlformats.org/drawingml/2006/picture" xmlns:c="http://schemas.openxmlformats.org/drawingml/2006/chart" xmlns:lc="http://schemas.openxmlformats.org/drawingml/2006/lockedCanvas" xmlns:dgm="http://schemas.openxmlformats.org/drawingml/2006/diagram" xmlns:wps="http://schemas.microsoft.com/office/word/2010/wordprocessingShape" xmlns:wpg="http://schemas.microsoft.com/office/word/2010/wordprocessingGroup" xmlns:w14="http://schemas.microsoft.com/office/word/2010/wordml" xmlns:w15="http://schemas.microsoft.com/office/word/2012/wordml" xmlns:w16="http://schemas.microsoft.com/office/word/2018/wordml" xmlns:w16cex="http://schemas.microsoft.com/office/word/2018/wordml/cex" xmlns:w16cid="http://schemas.microsoft.com/office/word/2016/wordml/cid" xmlns="http://schemas.microsoft.com/office/tasks/2019/documenttasks" xmlns:cr="http://schemas.microsoft.com/office/comments/2020/reactions">
-  <w:docDefaults>
-    <w:rPrDefault>
-      <w:rPr>
-        <w:rFonts w:ascii="Aptos" w:cs="Aptos" w:eastAsia="Aptos" w:hAnsi="Aptos"/>
-        <w:sz w:val="24"/>
-        <w:szCs w:val="24"/>
-        <w:lang w:val="es-AR"/>
-      </w:rPr>
-    </w:rPrDefault>
-    <w:pPrDefault>
-      <w:pPr>
-        <w:spacing w:after="160" w:line="278.00000000000006" w:lineRule="auto"/>
-      </w:pPr>
-    </w:pPrDefault>
-  </w:docDefaults>
-  <w:style w:type="table" w:styleId="TableNormal" w:default="1">
-    <w:name w:val="TableNormal"/>
-    <w:tblPr>
-      <w:tblCellMar>
-        <w:top w:w="100.0" w:type="dxa"/>
-        <w:left w:w="100.0" w:type="dxa"/>
-        <w:bottom w:w="100.0" w:type="dxa"/>
-        <w:right w:w="100.0" w:type="dxa"/>
-      </w:tblCellMar>
-    </w:tblPr>
-  </w:style>
-  <w:style w:type="paragraph" w:styleId="Normal" w:default="1">
-    <w:name w:val="normal"/>
-  </w:style>
-  <w:style w:type="paragraph" w:styleId="Heading1">
-    <w:name w:val="heading 1"/>
-    <w:basedOn w:val="Normal"/>
-    <w:next w:val="Normal"/>
-    <w:pPr>
-      <w:keepNext w:val="1"/>
-      <w:keepLines w:val="1"/>
-      <w:spacing w:after="80" w:before="360" w:lineRule="auto"/>
-    </w:pPr>
-    <w:rPr>
-      <w:rFonts w:ascii="Play" w:cs="Play" w:eastAsia="Play" w:hAnsi="Play"/>
-      <w:color w:val="0f4761"/>
-      <w:sz w:val="40"/>
-      <w:szCs w:val="40"/>
-    </w:rPr>
-  </w:style>
-  <w:style w:type="paragraph" w:styleId="Heading2">
-    <w:name w:val="heading 2"/>
-    <w:basedOn w:val="Normal"/>
-    <w:next w:val="Normal"/>
-    <w:pPr>
-      <w:keepNext w:val="1"/>
-      <w:keepLines w:val="1"/>
-      <w:spacing w:after="80" w:before="160" w:lineRule="auto"/>
-    </w:pPr>
-    <w:rPr>
-      <w:rFonts w:ascii="Play" w:cs="Play" w:eastAsia="Play" w:hAnsi="Play"/>
-      <w:color w:val="0f4761"/>
-      <w:sz w:val="32"/>
-      <w:szCs w:val="32"/>
-    </w:rPr>
-  </w:style>
-  <w:style w:type="paragraph" w:styleId="Heading3">
-    <w:name w:val="heading 3"/>
-    <w:basedOn w:val="Normal"/>
-    <w:next w:val="Normal"/>
-    <w:pPr>
-      <w:keepNext w:val="1"/>
-      <w:keepLines w:val="1"/>
-      <w:spacing w:after="80" w:before="160" w:lineRule="auto"/>
-    </w:pPr>
-    <w:rPr>
-      <w:color w:val="0f4761"/>
-      <w:sz w:val="28"/>
-      <w:szCs w:val="28"/>
-    </w:rPr>
-  </w:style>
-  <w:style w:type="paragraph" w:styleId="Heading4">
-    <w:name w:val="heading 4"/>
-    <w:basedOn w:val="Normal"/>
-    <w:next w:val="Normal"/>
-    <w:pPr>
-      <w:keepNext w:val="1"/>
-      <w:keepLines w:val="1"/>
-      <w:spacing w:after="40" w:before="80" w:lineRule="auto"/>
-    </w:pPr>
-    <w:rPr>
-      <w:i w:val="1"/>
-      <w:iCs w:val="1"/>
-      <w:color w:val="0f4761"/>
-    </w:rPr>
-  </w:style>
-  <w:style w:type="paragraph" w:styleId="Heading5">
-    <w:name w:val="heading 5"/>
-    <w:basedOn w:val="Normal"/>
-    <w:next w:val="Normal"/>
-    <w:pPr>
-      <w:keepNext w:val="1"/>
-      <w:keepLines w:val="1"/>
-      <w:spacing w:after="40" w:before="80" w:lineRule="auto"/>
-    </w:pPr>
-    <w:rPr>
-      <w:color w:val="0f4761"/>
-    </w:rPr>
-  </w:style>
-  <w:style w:type="paragraph" w:styleId="Heading6">
-    <w:name w:val="heading 6"/>
-    <w:basedOn w:val="Normal"/>
-    <w:next w:val="Normal"/>
-    <w:pPr>
-      <w:keepNext w:val="1"/>
-      <w:keepLines w:val="1"/>
-      <w:spacing w:after="0" w:before="40" w:lineRule="auto"/>
-    </w:pPr>
-    <w:rPr>
-      <w:i w:val="1"/>
-      <w:iCs w:val="1"/>
-      <w:color w:val="595959"/>
-    </w:rPr>
-  </w:style>
-  <w:style w:type="paragraph" w:styleId="Title">
-    <w:name w:val="Title"/>
-    <w:basedOn w:val="Normal"/>
-    <w:next w:val="Normal"/>
-    <w:pPr>
-      <w:spacing w:after="80" w:line="240" w:lineRule="auto"/>
-    </w:pPr>
-    <w:rPr>
-      <w:rFonts w:ascii="Play" w:cs="Play" w:eastAsia="Play" w:hAnsi="Play"/>
-      <w:sz w:val="56"/>
-      <w:szCs w:val="56"/>
-    </w:rPr>
-  </w:style>
-  <w:style w:type="paragraph" w:styleId="Ttulo7">
-    <w:name w:val="heading 7"/>
-    <w:basedOn w:val="Normal"/>
-    <w:next w:val="Normal"/>
-    <w:link w:val="Ttulo7Car"/>
-    <w:uiPriority w:val="9"/>
-    <w:semiHidden w:val="1"/>
-    <w:unhideWhenUsed w:val="1"/>
-    <w:qFormat w:val="1"/>
-    <w:rsid w:val="00D35007"/>
-    <w:pPr>
-      <w:keepNext w:val="1"/>
-      <w:keepLines w:val="1"/>
-      <w:spacing w:after="0" w:before="40"/>
-      <w:outlineLvl w:val="6"/>
-    </w:pPr>
-    <w:rPr>
-      <w:rFonts w:cstheme="majorBidi" w:eastAsiaTheme="majorEastAsia"/>
-      <w:color w:val="595959" w:themeColor="text1" w:themeTint="0000A6"/>
-    </w:rPr>
-  </w:style>
-  <w:style w:type="paragraph" w:styleId="Ttulo8">
-    <w:name w:val="heading 8"/>
-    <w:basedOn w:val="Normal"/>
-    <w:next w:val="Normal"/>
-    <w:link w:val="Ttulo8Car"/>
-    <w:uiPriority w:val="9"/>
-    <w:semiHidden w:val="1"/>
-    <w:unhideWhenUsed w:val="1"/>
-    <w:qFormat w:val="1"/>
-    <w:rsid w:val="00D35007"/>
-    <w:pPr>
-      <w:keepNext w:val="1"/>
-      <w:keepLines w:val="1"/>
-      <w:spacing w:after="0"/>
-      <w:outlineLvl w:val="7"/>
-    </w:pPr>
-    <w:rPr>
-      <w:rFonts w:cstheme="majorBidi" w:eastAsiaTheme="majorEastAsia"/>
-      <w:i w:val="1"/>
-      <w:iCs w:val="1"/>
-      <w:color w:val="272727" w:themeColor="text1" w:themeTint="0000D8"/>
-    </w:rPr>
-  </w:style>
-  <w:style w:type="paragraph" w:styleId="Ttulo9">
-    <w:name w:val="heading 9"/>
-    <w:basedOn w:val="Normal"/>
-    <w:next w:val="Normal"/>
-    <w:link w:val="Ttulo9Car"/>
-    <w:uiPriority w:val="9"/>
-    <w:semiHidden w:val="1"/>
-    <w:unhideWhenUsed w:val="1"/>
-    <w:qFormat w:val="1"/>
-    <w:rsid w:val="00D35007"/>
-    <w:pPr>
-      <w:keepNext w:val="1"/>
-      <w:keepLines w:val="1"/>
-      <w:spacing w:after="0"/>
-      <w:outlineLvl w:val="8"/>
-    </w:pPr>
-    <w:rPr>
-      <w:rFonts w:cstheme="majorBidi" w:eastAsiaTheme="majorEastAsia"/>
-      <w:color w:val="272727" w:themeColor="text1" w:themeTint="0000D8"/>
-    </w:rPr>
-  </w:style>
-  <w:style w:type="character" w:styleId="Fuentedeprrafopredeter" w:default="1">
-    <w:name w:val="Default Paragraph Font"/>
-    <w:uiPriority w:val="1"/>
-    <w:unhideWhenUsed w:val="1"/>
-  </w:style>
-  <w:style w:type="table" w:styleId="Tablanormal" w:default="1">
-    <w:name w:val="Normal Table"/>
-    <w:uiPriority w:val="99"/>
-    <w:semiHidden w:val="1"/>
-    <w:unhideWhenUsed w:val="1"/>
-    <w:tblPr>
-      <w:tblInd w:w="0.0" w:type="dxa"/>
-      <w:tblCellMar>
-        <w:top w:w="0.0" w:type="dxa"/>
-        <w:left w:w="108.0" w:type="dxa"/>
-        <w:bottom w:w="0.0" w:type="dxa"/>
-        <w:right w:w="108.0" w:type="dxa"/>
-      </w:tblCellMar>
-    </w:tblPr>
-  </w:style>
-  <w:style w:type="numbering" w:styleId="Sinlista" w:default="1">
-    <w:name w:val="No List"/>
-    <w:uiPriority w:val="99"/>
-    <w:semiHidden w:val="1"/>
-    <w:unhideWhenUsed w:val="1"/>
-  </w:style>
-  <w:style w:type="character" w:styleId="Ttulo1Car" w:customStyle="1">
-    <w:name w:val="Título 1 Car"/>
-    <w:basedOn w:val="Fuentedeprrafopredeter"/>
-    <w:link w:val="Ttulo1"/>
-    <w:uiPriority w:val="9"/>
-    <w:rsid w:val="00D35007"/>
-    <w:rPr>
-      <w:rFonts w:asciiTheme="majorHAnsi" w:cstheme="majorBidi" w:eastAsiaTheme="majorEastAsia" w:hAnsiTheme="majorHAnsi"/>
-      <w:color w:val="0f4761" w:themeColor="accent1" w:themeShade="0000BF"/>
-      <w:sz w:val="40"/>
-      <w:szCs w:val="40"/>
-    </w:rPr>
-  </w:style>
-  <w:style w:type="character" w:styleId="Ttulo2Car" w:customStyle="1">
-    <w:name w:val="Título 2 Car"/>
-    <w:basedOn w:val="Fuentedeprrafopredeter"/>
-    <w:link w:val="Ttulo2"/>
-    <w:uiPriority w:val="9"/>
-    <w:rsid w:val="00D35007"/>
-    <w:rPr>
-      <w:rFonts w:asciiTheme="majorHAnsi" w:cstheme="majorBidi" w:eastAsiaTheme="majorEastAsia" w:hAnsiTheme="majorHAnsi"/>
-      <w:color w:val="0f4761" w:themeColor="accent1" w:themeShade="0000BF"/>
-      <w:sz w:val="32"/>
-      <w:szCs w:val="32"/>
-    </w:rPr>
-  </w:style>
-  <w:style w:type="character" w:styleId="Ttulo3Car" w:customStyle="1">
-    <w:name w:val="Título 3 Car"/>
-    <w:basedOn w:val="Fuentedeprrafopredeter"/>
-    <w:link w:val="Ttulo3"/>
-    <w:uiPriority w:val="9"/>
-    <w:semiHidden w:val="1"/>
-    <w:rsid w:val="00D35007"/>
-    <w:rPr>
-      <w:rFonts w:cstheme="majorBidi" w:eastAsiaTheme="majorEastAsia"/>
-      <w:color w:val="0f4761" w:themeColor="accent1" w:themeShade="0000BF"/>
-      <w:sz w:val="28"/>
-      <w:szCs w:val="28"/>
-    </w:rPr>
-  </w:style>
-  <w:style w:type="character" w:styleId="Ttulo4Car" w:customStyle="1">
-    <w:name w:val="Título 4 Car"/>
-    <w:basedOn w:val="Fuentedeprrafopredeter"/>
-    <w:link w:val="Ttulo4"/>
-    <w:uiPriority w:val="9"/>
-    <w:semiHidden w:val="1"/>
-    <w:rsid w:val="00D35007"/>
-    <w:rPr>
-      <w:rFonts w:cstheme="majorBidi" w:eastAsiaTheme="majorEastAsia"/>
-      <w:i w:val="1"/>
-      <w:iCs w:val="1"/>
-      <w:color w:val="0f4761" w:themeColor="accent1" w:themeShade="0000BF"/>
-    </w:rPr>
-  </w:style>
-  <w:style w:type="character" w:styleId="Ttulo5Car" w:customStyle="1">
-    <w:name w:val="Título 5 Car"/>
-    <w:basedOn w:val="Fuentedeprrafopredeter"/>
-    <w:link w:val="Ttulo5"/>
-    <w:uiPriority w:val="9"/>
-    <w:semiHidden w:val="1"/>
-    <w:rsid w:val="00D35007"/>
-    <w:rPr>
-      <w:rFonts w:cstheme="majorBidi" w:eastAsiaTheme="majorEastAsia"/>
-      <w:color w:val="0f4761" w:themeColor="accent1" w:themeShade="0000BF"/>
-    </w:rPr>
-  </w:style>
-  <w:style w:type="character" w:styleId="Ttulo6Car" w:customStyle="1">
-    <w:name w:val="Título 6 Car"/>
-    <w:basedOn w:val="Fuentedeprrafopredeter"/>
-    <w:link w:val="Ttulo6"/>
-    <w:uiPriority w:val="9"/>
-    <w:semiHidden w:val="1"/>
-    <w:rsid w:val="00D35007"/>
-    <w:rPr>
-      <w:rFonts w:cstheme="majorBidi" w:eastAsiaTheme="majorEastAsia"/>
-      <w:i w:val="1"/>
-      <w:iCs w:val="1"/>
-      <w:color w:val="595959" w:themeColor="text1" w:themeTint="0000A6"/>
-    </w:rPr>
-  </w:style>
-  <w:style w:type="character" w:styleId="Ttulo7Car" w:customStyle="1">
-    <w:name w:val="Título 7 Car"/>
-    <w:basedOn w:val="Fuentedeprrafopredeter"/>
-    <w:link w:val="Ttulo7"/>
-    <w:uiPriority w:val="9"/>
-    <w:semiHidden w:val="1"/>
-    <w:rsid w:val="00D35007"/>
-    <w:rPr>
-      <w:rFonts w:cstheme="majorBidi" w:eastAsiaTheme="majorEastAsia"/>
-      <w:color w:val="595959" w:themeColor="text1" w:themeTint="0000A6"/>
-    </w:rPr>
-  </w:style>
-  <w:style w:type="character" w:styleId="Ttulo8Car" w:customStyle="1">
-    <w:name w:val="Título 8 Car"/>
-    <w:basedOn w:val="Fuentedeprrafopredeter"/>
-    <w:link w:val="Ttulo8"/>
-    <w:uiPriority w:val="9"/>
-    <w:semiHidden w:val="1"/>
-    <w:rsid w:val="00D35007"/>
-    <w:rPr>
-      <w:rFonts w:cstheme="majorBidi" w:eastAsiaTheme="majorEastAsia"/>
-      <w:i w:val="1"/>
-      <w:iCs w:val="1"/>
-      <w:color w:val="272727" w:themeColor="text1" w:themeTint="0000D8"/>
-    </w:rPr>
-  </w:style>
-  <w:style w:type="character" w:styleId="Ttulo9Car" w:customStyle="1">
-    <w:name w:val="Título 9 Car"/>
-    <w:basedOn w:val="Fuentedeprrafopredeter"/>
-    <w:link w:val="Ttulo9"/>
-    <w:uiPriority w:val="9"/>
-    <w:semiHidden w:val="1"/>
-    <w:rsid w:val="00D35007"/>
-    <w:rPr>
-      <w:rFonts w:cstheme="majorBidi" w:eastAsiaTheme="majorEastAsia"/>
-      <w:color w:val="272727" w:themeColor="text1" w:themeTint="0000D8"/>
-    </w:rPr>
-  </w:style>
-  <w:style w:type="character" w:styleId="TtuloCar" w:customStyle="1">
-    <w:name w:val="Título Car"/>
-    <w:basedOn w:val="Fuentedeprrafopredeter"/>
-    <w:link w:val="Ttulo"/>
-    <w:uiPriority w:val="10"/>
-    <w:rsid w:val="00D35007"/>
-    <w:rPr>
-      <w:rFonts w:asciiTheme="majorHAnsi" w:cstheme="majorBidi" w:eastAsiaTheme="majorEastAsia" w:hAnsiTheme="majorHAnsi"/>
-      <w:spacing w:val="-10"/>
-      <w:kern w:val="28"/>
-      <w:sz w:val="56"/>
-      <w:szCs w:val="56"/>
-    </w:rPr>
-  </w:style>
-  <w:style w:type="character" w:styleId="SubttuloCar" w:customStyle="1">
-    <w:name w:val="Subtítulo Car"/>
-    <w:basedOn w:val="Fuentedeprrafopredeter"/>
-    <w:link w:val="Subttulo"/>
-    <w:uiPriority w:val="11"/>
-    <w:rsid w:val="00D35007"/>
-    <w:rPr>
-      <w:rFonts w:cstheme="majorBidi" w:eastAsiaTheme="majorEastAsia"/>
-      <w:color w:val="595959" w:themeColor="text1" w:themeTint="0000A6"/>
-      <w:spacing w:val="15"/>
-      <w:sz w:val="28"/>
-      <w:szCs w:val="28"/>
-    </w:rPr>
-  </w:style>
-  <w:style w:type="paragraph" w:styleId="Cita">
-    <w:name w:val="Quote"/>
-    <w:basedOn w:val="Normal"/>
-    <w:next w:val="Normal"/>
-    <w:link w:val="CitaCar"/>
-    <w:uiPriority w:val="29"/>
-    <w:qFormat w:val="1"/>
-    <w:rsid w:val="00D35007"/>
-    <w:pPr>
-      <w:spacing w:before="160"/>
-      <w:jc w:val="center"/>
-    </w:pPr>
-    <w:rPr>
-      <w:i w:val="1"/>
-      <w:iCs w:val="1"/>
-      <w:color w:val="404040" w:themeColor="text1" w:themeTint="0000BF"/>
-    </w:rPr>
-  </w:style>
-  <w:style w:type="character" w:styleId="CitaCar" w:customStyle="1">
-    <w:name w:val="Cita Car"/>
-    <w:basedOn w:val="Fuentedeprrafopredeter"/>
-    <w:link w:val="Cita"/>
-    <w:uiPriority w:val="29"/>
-    <w:rsid w:val="00D35007"/>
-    <w:rPr>
-      <w:i w:val="1"/>
-      <w:iCs w:val="1"/>
-      <w:color w:val="404040" w:themeColor="text1" w:themeTint="0000BF"/>
-    </w:rPr>
-  </w:style>
-  <w:style w:type="paragraph" w:styleId="Prrafodelista">
-    <w:name w:val="List Paragraph"/>
-    <w:basedOn w:val="Normal"/>
-    <w:uiPriority w:val="34"/>
-    <w:qFormat w:val="1"/>
-    <w:rsid w:val="00D35007"/>
-    <w:pPr>
-      <w:ind w:left="720"/>
-      <w:contextualSpacing w:val="1"/>
-    </w:pPr>
-  </w:style>
-  <w:style w:type="character" w:styleId="nfasisintenso">
-    <w:name w:val="Intense Emphasis"/>
-    <w:basedOn w:val="Fuentedeprrafopredeter"/>
-    <w:uiPriority w:val="21"/>
-    <w:qFormat w:val="1"/>
-    <w:rsid w:val="00D35007"/>
-    <w:rPr>
-      <w:i w:val="1"/>
-      <w:iCs w:val="1"/>
-      <w:color w:val="0f4761" w:themeColor="accent1" w:themeShade="0000BF"/>
-    </w:rPr>
-  </w:style>
-  <w:style w:type="paragraph" w:styleId="Citadestacada">
-    <w:name w:val="Intense Quote"/>
-    <w:basedOn w:val="Normal"/>
-    <w:next w:val="Normal"/>
-    <w:link w:val="CitadestacadaCar"/>
-    <w:uiPriority w:val="30"/>
-    <w:qFormat w:val="1"/>
-    <w:rsid w:val="00D35007"/>
-    <w:pPr>
-      <w:pBdr>
-        <w:top w:color="0f4761" w:space="10" w:sz="4" w:themeColor="accent1" w:themeShade="0000BF" w:val="single"/>
-        <w:bottom w:color="0f4761" w:space="10" w:sz="4" w:themeColor="accent1" w:themeShade="0000BF" w:val="single"/>
-      </w:pBdr>
-      <w:spacing w:after="360" w:before="360"/>
-      <w:ind w:left="864" w:right="864"/>
-      <w:jc w:val="center"/>
-    </w:pPr>
-    <w:rPr>
-      <w:i w:val="1"/>
-      <w:iCs w:val="1"/>
-      <w:color w:val="0f4761" w:themeColor="accent1" w:themeShade="0000BF"/>
-    </w:rPr>
-  </w:style>
-  <w:style w:type="character" w:styleId="CitadestacadaCar" w:customStyle="1">
-    <w:name w:val="Cita destacada Car"/>
-    <w:basedOn w:val="Fuentedeprrafopredeter"/>
-    <w:link w:val="Citadestacada"/>
-    <w:uiPriority w:val="30"/>
-    <w:rsid w:val="00D35007"/>
-    <w:rPr>
-      <w:i w:val="1"/>
-      <w:iCs w:val="1"/>
-      <w:color w:val="0f4761" w:themeColor="accent1" w:themeShade="0000BF"/>
-    </w:rPr>
-  </w:style>
-  <w:style w:type="character" w:styleId="Referenciaintensa">
-    <w:name w:val="Intense Reference"/>
-    <w:basedOn w:val="Fuentedeprrafopredeter"/>
-    <w:uiPriority w:val="32"/>
-    <w:qFormat w:val="1"/>
-    <w:rsid w:val="00D35007"/>
-    <w:rPr>
-      <w:b w:val="1"/>
-      <w:bCs w:val="1"/>
-      <w:smallCaps w:val="1"/>
-      <w:color w:val="0f4761" w:themeColor="accent1" w:themeShade="0000BF"/>
-      <w:spacing w:val="5"/>
-    </w:rPr>
-  </w:style>
-  <w:style w:type="paragraph" w:styleId="Encabezado">
-    <w:name w:val="header"/>
-    <w:basedOn w:val="Normal"/>
-    <w:link w:val="EncabezadoCar"/>
-    <w:uiPriority w:val="99"/>
-    <w:unhideWhenUsed w:val="1"/>
-    <w:rsid w:val="005C33BF"/>
-    <w:pPr>
-      <w:tabs>
-        <w:tab w:val="center" w:pos="4252"/>
-        <w:tab w:val="right" w:pos="8504"/>
-      </w:tabs>
-      <w:spacing w:after="0" w:line="240" w:lineRule="auto"/>
-    </w:pPr>
-  </w:style>
-  <w:style w:type="character" w:styleId="EncabezadoCar" w:customStyle="1">
-    <w:name w:val="Encabezado Car"/>
-    <w:basedOn w:val="Fuentedeprrafopredeter"/>
-    <w:link w:val="Encabezado"/>
-    <w:uiPriority w:val="99"/>
-    <w:rsid w:val="005C33BF"/>
-  </w:style>
-  <w:style w:type="paragraph" w:styleId="Piedepgina">
-    <w:name w:val="footer"/>
-    <w:basedOn w:val="Normal"/>
-    <w:link w:val="PiedepginaCar"/>
-    <w:uiPriority w:val="99"/>
-    <w:unhideWhenUsed w:val="1"/>
-    <w:rsid w:val="005C33BF"/>
-    <w:pPr>
-      <w:tabs>
-        <w:tab w:val="center" w:pos="4252"/>
-        <w:tab w:val="right" w:pos="8504"/>
-      </w:tabs>
-      <w:spacing w:after="0" w:line="240" w:lineRule="auto"/>
-    </w:pPr>
-  </w:style>
-  <w:style w:type="character" w:styleId="PiedepginaCar" w:customStyle="1">
-    <w:name w:val="Pie de página Car"/>
-    <w:basedOn w:val="Fuentedeprrafopredeter"/>
-    <w:link w:val="Piedepgina"/>
-    <w:uiPriority w:val="99"/>
-    <w:rsid w:val="005C33BF"/>
-  </w:style>
-  <w:style w:type="paragraph" w:styleId="Subtitle">
-    <w:name w:val="Subtitle"/>
-    <w:basedOn w:val="Normal"/>
-    <w:next w:val="Normal"/>
-    <w:pPr/>
-    <w:rPr>
-      <w:color w:val="595959"/>
-      <w:sz w:val="28"/>
-      <w:szCs w:val="28"/>
-    </w:rPr>
-  </w:style>
-  <w:style w:type="table" w:styleId="Table1">
-    <w:basedOn w:val="TableNormal"/>
-    <w:tblPr>
-      <w:tblStyleRowBandSize w:val="1"/>
-      <w:tblStyleColBandSize w:val="1"/>
-      <w:tblCellMar/>
-    </w:tblPr>
-  </w:style>
-  <w:style w:type="table" w:styleId="Table2">
-    <w:basedOn w:val="TableNormal"/>
-    <w:tblPr>
-      <w:tblStyleRowBandSize w:val="1"/>
-      <w:tblStyleColBandSize w:val="1"/>
-      <w:tblCellMar>
-        <w:top w:w="0.0" w:type="dxa"/>
-        <w:left w:w="10.0" w:type="dxa"/>
-        <w:bottom w:w="0.0" w:type="dxa"/>
-        <w:right w:w="10.0" w:type="dxa"/>
-      </w:tblCellMar>
-    </w:tblPr>
-  </w:style>
-  <w:style w:type="table" w:styleId="Table3">
-    <w:basedOn w:val="TableNormal"/>
-    <w:tblPr>
-      <w:tblStyleRowBandSize w:val="1"/>
-      <w:tblStyleColBandSize w:val="1"/>
-      <w:tblCellMar/>
-    </w:tblPr>
-  </w:style>
-  <w:style w:type="table" w:styleId="Table4">
-    <w:basedOn w:val="TableNormal"/>
-    <w:tblPr>
-      <w:tblStyleRowBandSize w:val="1"/>
-      <w:tblStyleColBandSize w:val="1"/>
-      <w:tblCellMar/>
-    </w:tblPr>
-  </w:style>
-  <w:style w:type="table" w:styleId="Table5">
-    <w:basedOn w:val="TableNormal"/>
-    <w:tblPr>
-      <w:tblStyleRowBandSize w:val="1"/>
-      <w:tblStyleColBandSize w:val="1"/>
-      <w:tblCellMar/>
-    </w:tblPr>
-  </w:style>
-  <w:style w:type="table" w:styleId="Table6">
-    <w:basedOn w:val="TableNormal"/>
-    <w:tblPr>
-      <w:tblStyleRowBandSize w:val="1"/>
-      <w:tblStyleColBandSize w:val="1"/>
-      <w:tblCellMar/>
-    </w:tblPr>
-  </w:style>
-  <w:style w:type="table" w:styleId="Table7">
-    <w:basedOn w:val="TableNormal"/>
-    <w:tblPr>
-      <w:tblStyleRowBandSize w:val="1"/>
-      <w:tblStyleColBandSize w:val="1"/>
-      <w:tblCellMar/>
-    </w:tblPr>
-  </w:style>
-  <w:style w:type="table" w:styleId="Table8">
-    <w:basedOn w:val="TableNormal"/>
-    <w:tblPr>
-      <w:tblStyleRowBandSize w:val="1"/>
-      <w:tblStyleColBandSize w:val="1"/>
-      <w:tblCellMar/>
-    </w:tblPr>
-  </w:style>
-  <w:style w:type="table" w:styleId="Table9">
-    <w:basedOn w:val="TableNormal"/>
-    <w:tblPr>
-      <w:tblStyleRowBandSize w:val="1"/>
-      <w:tblStyleColBandSize w:val="1"/>
-      <w:tblCellMar/>
-    </w:tblPr>
-  </w:style>
-  <w:style w:type="table" w:styleId="Table10">
-    <w:basedOn w:val="TableNormal"/>
-    <w:tblPr>
-      <w:tblStyleRowBandSize w:val="1"/>
-      <w:tblStyleColBandSize w:val="1"/>
-      <w:tblCellMar/>
-    </w:tblPr>
-  </w:style>
-  <w:style w:type="table" w:styleId="Table11">
-    <w:basedOn w:val="TableNormal"/>
-    <w:tblPr>
-      <w:tblStyleRowBandSize w:val="1"/>
-      <w:tblStyleColBandSize w:val="1"/>
-      <w:tblCellMar/>
-    </w:tblPr>
-  </w:style>
-  <w:style w:type="table" w:styleId="Table12">
-    <w:basedOn w:val="TableNormal"/>
-    <w:tblPr>
-      <w:tblStyleRowBandSize w:val="1"/>
-      <w:tblStyleColBandSize w:val="1"/>
-      <w:tblCellMar/>
-    </w:tblPr>
-  </w:style>
-  <w:style w:type="table" w:styleId="Table13">
-    <w:basedOn w:val="TableNormal"/>
-    <w:tblPr>
-      <w:tblStyleRowBandSize w:val="1"/>
-      <w:tblStyleColBandSize w:val="1"/>
-      <w:tblCellMar/>
-    </w:tblPr>
-  </w:style>
-  <w:style w:type="table" w:styleId="Table14">
-    <w:basedOn w:val="TableNormal"/>
-    <w:tblPr>
-      <w:tblStyleRowBandSize w:val="1"/>
-      <w:tblStyleColBandSize w:val="1"/>
-      <w:tblCellMar/>
-    </w:tblPr>
-    <w:tcPr>
-      <w:shd w:fill="ffffff" w:val="clear"/>
-    </w:tcPr>
-  </w:style>
-  <w:style w:type="table" w:styleId="Table15">
-    <w:basedOn w:val="TableNormal"/>
-    <w:tblPr>
-      <w:tblStyleRowBandSize w:val="1"/>
-      <w:tblStyleColBandSize w:val="1"/>
-      <w:tblCellMar/>
-    </w:tblPr>
-  </w:style>
-  <w:style w:type="table" w:styleId="Table16">
-    <w:basedOn w:val="TableNormal"/>
-    <w:tblPr>
-      <w:tblStyleRowBandSize w:val="1"/>
-      <w:tblStyleColBandSize w:val="1"/>
-    </w:tblPr>
-  </w:style>
-  <w:style w:type="table" w:styleId="Table17">
-    <w:basedOn w:val="TableNormal"/>
-    <w:tblPr>
-      <w:tblStyleRowBandSize w:val="1"/>
-      <w:tblStyleColBandSize w:val="1"/>
-      <w:tblCellMar/>
-    </w:tblPr>
-  </w:style>
-  <w:style w:type="table" w:styleId="Table18">
-    <w:basedOn w:val="TableNormal"/>
-    <w:tblPr>
-      <w:tblStyleRowBandSize w:val="1"/>
-      <w:tblStyleColBandSize w:val="1"/>
-      <w:tblCellMar/>
-    </w:tblPr>
-  </w:style>
-  <w:style w:type="table" w:styleId="Table19">
-    <w:basedOn w:val="TableNormal"/>
-    <w:tblPr>
-      <w:tblStyleRowBandSize w:val="1"/>
-      <w:tblStyleColBandSize w:val="1"/>
-      <w:tblCellMar/>
-    </w:tblPr>
-  </w:style>
-  <w:style w:type="table" w:styleId="Table20">
-    <w:basedOn w:val="TableNormal"/>
-    <w:tblPr>
-      <w:tblStyleRowBandSize w:val="1"/>
-      <w:tblStyleColBandSize w:val="1"/>
-      <w:tblCellMar/>
-    </w:tblPr>
-  </w:style>
-  <w:style w:type="table" w:styleId="Table21">
-    <w:basedOn w:val="TableNormal"/>
-    <w:tblPr>
-      <w:tblStyleRowBandSize w:val="1"/>
-      <w:tblStyleColBandSize w:val="1"/>
-      <w:tblCellMar/>
-    </w:tblPr>
-  </w:style>
-  <w:style w:type="table" w:styleId="Table22">
-    <w:basedOn w:val="TableNormal"/>
-    <w:tblPr>
-      <w:tblStyleRowBandSize w:val="1"/>
-      <w:tblStyleColBandSize w:val="1"/>
-      <w:tblCellMar/>
-    </w:tblPr>
-  </w:style>
-  <w:style w:type="table" w:styleId="Table23">
-    <w:basedOn w:val="TableNormal"/>
-    <w:tblPr>
-      <w:tblStyleRowBandSize w:val="1"/>
-      <w:tblStyleColBandSize w:val="1"/>
-      <w:tblCellMar/>
-    </w:tblPr>
-  </w:style>
-  <w:style w:type="table" w:styleId="Table24">
-    <w:basedOn w:val="TableNormal"/>
-    <w:tblPr>
-      <w:tblStyleRowBandSize w:val="1"/>
-      <w:tblStyleColBandSize w:val="1"/>
-      <w:tblCellMar/>
-    </w:tblPr>
-  </w:style>
-  <w:style w:type="table" w:styleId="Table25">
-    <w:basedOn w:val="TableNormal"/>
-    <w:tblPr>
-      <w:tblStyleRowBandSize w:val="1"/>
-      <w:tblStyleColBandSize w:val="1"/>
-      <w:tblCellMar/>
-    </w:tblPr>
-  </w:style>
-  <w:style w:type="table" w:styleId="Table26">
-    <w:basedOn w:val="TableNormal"/>
-    <w:tblPr>
-      <w:tblStyleRowBandSize w:val="1"/>
-      <w:tblStyleColBandSize w:val="1"/>
-      <w:tblCellMar/>
-    </w:tblPr>
-  </w:style>
-  <w:style w:type="table" w:styleId="Table27">
-    <w:basedOn w:val="TableNormal"/>
-    <w:tblPr>
-      <w:tblStyleRowBandSize w:val="1"/>
-      <w:tblStyleColBandSize w:val="1"/>
-      <w:tblCellMar/>
-    </w:tblPr>
-  </w:style>
-  <w:style w:type="table" w:styleId="Table28">
-    <w:basedOn w:val="TableNormal"/>
-    <w:tblPr>
-      <w:tblStyleRowBandSize w:val="1"/>
-      <w:tblStyleColBandSize w:val="1"/>
-      <w:tblCellMar/>
-    </w:tblPr>
-  </w:style>
-  <w:style w:type="table" w:styleId="Table29">
-    <w:basedOn w:val="TableNormal"/>
-    <w:tblPr>
-      <w:tblStyleRowBandSize w:val="1"/>
-      <w:tblStyleColBandSize w:val="1"/>
-      <w:tblCellMar/>
-    </w:tblPr>
-  </w:style>
-  <w:style w:type="table" w:styleId="Table30">
-    <w:basedOn w:val="TableNormal"/>
-    <w:tblPr>
-      <w:tblStyleRowBandSize w:val="1"/>
-      <w:tblStyleColBandSize w:val="1"/>
-      <w:tblCellMar/>
-    </w:tblPr>
-  </w:style>
-  <w:style w:type="table" w:styleId="Table31">
-    <w:basedOn w:val="TableNormal"/>
-    <w:tblPr>
-      <w:tblStyleRowBandSize w:val="1"/>
-      <w:tblStyleColBandSize w:val="1"/>
-      <w:tblCellMar/>
-    </w:tblPr>
-  </w:style>
-  <w:style w:type="table" w:styleId="Table32">
-    <w:basedOn w:val="TableNormal"/>
-    <w:tblPr>
-      <w:tblStyleRowBandSize w:val="1"/>
-      <w:tblStyleColBandSize w:val="1"/>
-      <w:tblCellMar/>
-    </w:tblPr>
-  </w:style>
-  <w:style w:type="table" w:styleId="Table33">
-    <w:basedOn w:val="TableNormal"/>
-    <w:tblPr>
-      <w:tblStyleRowBandSize w:val="1"/>
-      <w:tblStyleColBandSize w:val="1"/>
-      <w:tblCellMar/>
-    </w:tblPr>
-  </w:style>
-  <w:style w:type="table" w:styleId="Table34">
-    <w:basedOn w:val="TableNormal"/>
-    <w:tblPr>
-      <w:tblStyleRowBandSize w:val="1"/>
-      <w:tblStyleColBandSize w:val="1"/>
-      <w:tblCellMar/>
-    </w:tblPr>
-  </w:style>
-  <w:style w:type="table" w:styleId="Table35">
-    <w:basedOn w:val="TableNormal"/>
-    <w:tblPr>
-      <w:tblStyleRowBandSize w:val="1"/>
-      <w:tblStyleColBandSize w:val="1"/>
-      <w:tblCellMar/>
-    </w:tblPr>
-  </w:style>
-  <w:style w:type="table" w:styleId="Table36">
-    <w:basedOn w:val="TableNormal"/>
-    <w:tblPr>
-      <w:tblStyleRowBandSize w:val="1"/>
-      <w:tblStyleColBandSize w:val="1"/>
-      <w:tblCellMar/>
-    </w:tblPr>
-  </w:style>
-</w:styles>
-</file>
-
-<file path=word/theme/theme1.xml><?xml version="1.0" encoding="utf-8"?>
-<a:theme xmlns:a="http://schemas.openxmlformats.org/drawingml/2006/main" name="Tema de Office">
-  <a:themeElements>
-    <a:clrScheme name="Office">
-      <a:dk1>
-        <a:sysClr val="windowText" lastClr="000000"/>
-      </a:dk1>
-      <a:lt1>
-        <a:sysClr val="window" lastClr="FFFFFF"/>
-      </a:lt1>
-      <a:dk2>
-        <a:srgbClr val="0E2841"/>
-      </a:dk2>
-      <a:lt2>
-        <a:srgbClr val="E8E8E8"/>
-      </a:lt2>
-      <a:accent1>
-        <a:srgbClr val="156082"/>
-      </a:accent1>
-      <a:accent2>
-        <a:srgbClr val="E97132"/>
-      </a:accent2>
-      <a:accent3>
-        <a:srgbClr val="196B24"/>
-      </a:accent3>
-      <a:accent4>
-        <a:srgbClr val="0F9ED5"/>
-      </a:accent4>
-      <a:accent5>
-        <a:srgbClr val="A02B93"/>
-      </a:accent5>
-      <a:accent6>
-        <a:srgbClr val="4EA72E"/>
-      </a:accent6>
-      <a:hlink>
-        <a:srgbClr val="467886"/>
-      </a:hlink>
-      <a:folHlink>
-        <a:srgbClr val="96607D"/>
-      </a:folHlink>
-    </a:clrScheme>
-    <a:fontScheme name="Office">
-      <a:majorFont>
-        <a:latin typeface="Aptos Display" panose="02110004020202020204"/>
-        <a:ea typeface=""/>
-        <a:cs typeface=""/>
-        <a:font script="Jpan" typeface="游ゴシック Light"/>
-        <a:font script="Hang" typeface="맑은 고딕"/>
-        <a:font script="Hans" typeface="等线 Light"/>
-        <a:font script="Hant" typeface="新細明體"/>
-        <a:font script="Arab" typeface="Times New Roman"/>
-        <a:font script="Hebr" typeface="Times New Roman"/>
-        <a:font script="Thai" typeface="Angsana New"/>
-        <a:font script="Ethi" typeface="Nyala"/>
-        <a:font script="Beng" typeface="Vrinda"/>
-        <a:font script="Gujr" typeface="Shruti"/>
-        <a:font script="Khmr" typeface="MoolBoran"/>
-        <a:font script="Knda" typeface="Tunga"/>
-        <a:font script="Guru" typeface="Raavi"/>
-        <a:font script="Cans" typeface="Euphemia"/>
-        <a:font script="Cher" typeface="Plantagenet Cherokee"/>
-        <a:font script="Yiii" typeface="Microsoft Yi Baiti"/>
-        <a:font script="Tibt" typeface="Microsoft Himalaya"/>
-        <a:font script="Thaa" typeface="MV Boli"/>
-        <a:font script="Deva" typeface="Mangal"/>
-        <a:font script="Telu" typeface="Gautami"/>
-        <a:font script="Taml" typeface="Latha"/>
-        <a:font script="Syrc" typeface="Estrangelo Edessa"/>
-        <a:font script="Orya" typeface="Kalinga"/>
-        <a:font script="Mlym" typeface="Kartika"/>
-        <a:font script="Laoo" typeface="DokChampa"/>
-        <a:font script="Sinh" typeface="Iskoola Pota"/>
-        <a:font script="Mong" typeface="Mongolian Baiti"/>
-        <a:font script="Viet" typeface="Times New Roman"/>
-        <a:font script="Uigh" typeface="Microsoft Uighur"/>
-        <a:font script="Geor" typeface="Sylfaen"/>
-        <a:font script="Armn" typeface="Arial"/>
-        <a:font script="Bugi" typeface="Leelawadee UI"/>
-        <a:font script="Bopo" typeface="Microsoft JhengHei"/>
-        <a:font script="Java" typeface="Javanese Text"/>
-        <a:font script="Lisu" typeface="Segoe UI"/>
-        <a:font script="Mymr" typeface="Myanmar Text"/>
-        <a:font script="Nkoo" typeface="Ebrima"/>
-        <a:font script="Olck" typeface="Nirmala UI"/>
-        <a:font script="Osma" typeface="Ebrima"/>
-        <a:font script="Phag" typeface="Phagspa"/>
-        <a:font script="Syrn" typeface="Estrangelo Edessa"/>
-        <a:font script="Syrj" typeface="Estrangelo Edessa"/>
-        <a:font script="Syre" typeface="Estrangelo Edessa"/>
-        <a:font script="Sora" typeface="Nirmala UI"/>
-        <a:font script="Tale" typeface="Microsoft Tai Le"/>
-        <a:font script="Talu" typeface="Microsoft New Tai Lue"/>
-        <a:font script="Tfng" typeface="Ebrima"/>
-      </a:majorFont>
-      <a:minorFont>
-        <a:latin typeface="Aptos" panose="02110004020202020204"/>
-        <a:ea typeface=""/>
-        <a:cs typeface=""/>
-        <a:font script="Jpan" typeface="游明朝"/>
-        <a:font script="Hang" typeface="맑은 고딕"/>
-        <a:font script="Hans" typeface="等线"/>
-        <a:font script="Hant" typeface="新細明體"/>
-        <a:font script="Arab" typeface="Arial"/>
-        <a:font script="Hebr" typeface="Arial"/>
-        <a:font script="Thai" typeface="Cordia New"/>
-        <a:font script="Ethi" typeface="Nyala"/>
-        <a:font script="Beng" typeface="Vrinda"/>
-        <a:font script="Gujr" typeface="Shruti"/>
-        <a:font script="Khmr" typeface="DaunPenh"/>
-        <a:font script="Knda" typeface="Tunga"/>
-        <a:font script="Guru" typeface="Raavi"/>
-        <a:font script="Cans" typeface="Euphemia"/>
-        <a:font script="Cher" typeface="Plantagenet Cherokee"/>
-        <a:font script="Yiii" typeface="Microsoft Yi Baiti"/>
-        <a:font script="Tibt" typeface="Microsoft Himalaya"/>
-        <a:font script="Thaa" typeface="MV Boli"/>
-        <a:font script="Deva" typeface="Mangal"/>
-        <a:font script="Telu" typeface="Gautami"/>
-        <a:font script="Taml" typeface="Latha"/>
-        <a:font script="Syrc" typeface="Estrangelo Edessa"/>
-        <a:font script="Orya" typeface="Kalinga"/>
-        <a:font script="Mlym" typeface="Kartika"/>
-        <a:font script="Laoo" typeface="DokChampa"/>
-        <a:font script="Sinh" typeface="Iskoola Pota"/>
-        <a:font script="Mong" typeface="Mongolian Baiti"/>
-        <a:font script="Viet" typeface="Arial"/>
-        <a:font script="Uigh" typeface="Microsoft Uighur"/>
-        <a:font script="Geor" typeface="Sylfaen"/>
-        <a:font script="Armn" typeface="Arial"/>
-        <a:font script="Bugi" typeface="Leelawadee UI"/>
-        <a:font script="Bopo" typeface="Microsoft JhengHei"/>
-        <a:font script="Java" typeface="Javanese Text"/>
-        <a:font script="Lisu" typeface="Segoe UI"/>
-        <a:font script="Mymr" typeface="Myanmar Text"/>
-        <a:font script="Nkoo" typeface="Ebrima"/>
-        <a:font script="Olck" typeface="Nirmala UI"/>
-        <a:font script="Osma" typeface="Ebrima"/>
-        <a:font script="Phag" typeface="Phagspa"/>
-        <a:font script="Syrn" typeface="Estrangelo Edessa"/>
-        <a:font script="Syrj" typeface="Estrangelo Edessa"/>
-        <a:font script="Syre" typeface="Estrangelo Edessa"/>
-        <a:font script="Sora" typeface="Nirmala UI"/>
-        <a:font script="Tale" typeface="Microsoft Tai Le"/>
-        <a:font script="Talu" typeface="Microsoft New Tai Lue"/>
-        <a:font script="Tfng" typeface="Ebrima"/>
-      </a:minorFont>
-    </a:fontScheme>
-    <a:fmtScheme name="Office">
-      <a:fillStyleLst>
-        <a:solidFill>
-          <a:schemeClr val="phClr"/>
-        </a:solidFill>
-        <a:gradFill rotWithShape="1">
-          <a:gsLst>
-            <a:gs pos="0">
-              <a:schemeClr val="phClr">
-                <a:lumMod val="110000"/>
-                <a:satMod val="105000"/>
-                <a:tint val="67000"/>
-              </a:schemeClr>
-            </a:gs>
-            <a:gs pos="50000">
-              <a:schemeClr val="phClr">
-                <a:lumMod val="105000"/>
-                <a:satMod val="103000"/>
-                <a:tint val="73000"/>
-              </a:schemeClr>
-            </a:gs>
-            <a:gs pos="100000">
-              <a:schemeClr val="phClr">
-                <a:lumMod val="105000"/>
-                <a:satMod val="109000"/>
-                <a:tint val="81000"/>
-              </a:schemeClr>
-            </a:gs>
-          </a:gsLst>
-          <a:lin ang="5400000" scaled="0"/>
-        </a:gradFill>
-        <a:gradFill rotWithShape="1">
-          <a:gsLst>
-            <a:gs pos="0">
-              <a:schemeClr val="phClr">
-                <a:satMod val="103000"/>
-                <a:lumMod val="102000"/>
-                <a:tint val="94000"/>
-              </a:schemeClr>
-            </a:gs>
-            <a:gs pos="50000">
-              <a:schemeClr val="phClr">
-                <a:satMod val="110000"/>
-                <a:lumMod val="100000"/>
-                <a:shade val="100000"/>
-              </a:schemeClr>
-            </a:gs>
-            <a:gs pos="100000">
-              <a:schemeClr val="phClr">
-                <a:lumMod val="99000"/>
-                <a:satMod val="120000"/>
-                <a:shade val="78000"/>
-              </a:schemeClr>
-            </a:gs>
-          </a:gsLst>
-          <a:lin ang="5400000" scaled="0"/>
-        </a:gradFill>
-      </a:fillStyleLst>
-      <a:lnStyleLst>
-        <a:ln w="6350" cap="flat" cmpd="sng" algn="ctr">
-          <a:solidFill>
-            <a:schemeClr val="phClr"/>
-          </a:solidFill>
-          <a:prstDash val="solid"/>
-          <a:miter lim="800000"/>
-        </a:ln>
-        <a:ln w="12700" cap="flat" cmpd="sng" algn="ctr">
-          <a:solidFill>
-            <a:schemeClr val="phClr"/>
-          </a:solidFill>
-          <a:prstDash val="solid"/>
-          <a:miter lim="800000"/>
-        </a:ln>
-        <a:ln w="19050" cap="flat" cmpd="sng" algn="ctr">
-          <a:solidFill>
-            <a:schemeClr val="phClr"/>
-          </a:solidFill>
-          <a:prstDash val="solid"/>
-          <a:miter lim="800000"/>
-        </a:ln>
-      </a:lnStyleLst>
-      <a:effectStyleLst>
-        <a:effectStyle>
-          <a:effectLst/>
-        </a:effectStyle>
-        <a:effectStyle>
-          <a:effectLst/>
-        </a:effectStyle>
-        <a:effectStyle>
-          <a:effectLst>
-            <a:outerShdw blurRad="57150" dist="19050" dir="5400000" algn="ctr" rotWithShape="0">
-              <a:srgbClr val="000000">
-                <a:alpha val="63000"/>
-              </a:srgbClr>
-            </a:outerShdw>
-          </a:effectLst>
-        </a:effectStyle>
-      </a:effectStyleLst>
-      <a:bgFillStyleLst>
-        <a:solidFill>
-          <a:schemeClr val="phClr"/>
-        </a:solidFill>
-        <a:solidFill>
-          <a:schemeClr val="phClr">
-            <a:tint val="95000"/>
-            <a:satMod val="170000"/>
-          </a:schemeClr>
-        </a:solidFill>
-        <a:gradFill rotWithShape="1">
-          <a:gsLst>
-            <a:gs pos="0">
-              <a:schemeClr val="phClr">
-                <a:tint val="93000"/>
-                <a:satMod val="150000"/>
-                <a:shade val="98000"/>
-                <a:lumMod val="102000"/>
-              </a:schemeClr>
-            </a:gs>
-            <a:gs pos="50000">
-              <a:schemeClr val="phClr">
-                <a:tint val="98000"/>
-                <a:satMod val="130000"/>
-                <a:shade val="90000"/>
-                <a:lumMod val="103000"/>
-              </a:schemeClr>
-            </a:gs>
-            <a:gs pos="100000">
-              <a:schemeClr val="phClr">
-                <a:shade val="63000"/>
-                <a:satMod val="120000"/>
-              </a:schemeClr>
-            </a:gs>
-          </a:gsLst>
-          <a:lin ang="5400000" scaled="0"/>
-        </a:gradFill>
-      </a:bgFillStyleLst>
-    </a:fmtScheme>
-  </a:themeElements>
-  <a:objectDefaults/>
-  <a:extraClrSchemeLst/>
-  <a:extLst>
-    <a:ext uri="{05A4C25C-085E-4340-85A3-A5531E510DB2}">
-      <thm15:themeFamily xmlns:thm15="http://schemas.microsoft.com/office/thememl/2012/main" name="Office Theme" id="{2E142A2C-CD16-42D6-873A-C26D2A0506FA}" vid="{1BDDFF52-6CD6-40A5-AB3C-68EB2F1E4D0A}"/>
-    </a:ext>
-  </a:extLst>
-</a:theme>
-</file>
-
-<file path=customXML/item1.xml><?xml version="1.0" encoding="utf-8"?>
-<go:gDocsCustomXmlDataStorage xmlns:go="http://customooxmlschemas.google.com/" xmlns:r="http://schemas.openxmlformats.org/officeDocument/2006/relationships" uri="GoogleDocsCustomDataVersion2">
-  <go:docsCustomData xmlns:go="http://customooxmlschemas.google.com/" roundtripDataSignature="AMtx7miItmYuehClntY0tIEMEKJMDiFYFw==">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</go:docsCustomData>
-</go:gDocsCustomXmlDataStorage>
-</file>
-
-<file path=customXML/itemProps1.xml><?xml version="1.0" encoding="utf-8"?>
-<ds:datastoreItem xmlns:ds="http://schemas.openxmlformats.org/officeDocument/2006/customXml" ds:itemID="{11111111-1234-1234-1234-123412341234}">
-  <ds:schemaRefs>
-    <ds:schemaRef ds:uri="http://schemas.openxmlformats.org/officeDocument/2006/relationships"/>
-    <ds:schemaRef ds:uri="http://customooxmlschemas.google.com/"/>
-  </ds:schemaRefs>
-</ds:datastoreItem>
 </file>
</xml_diff>

<commit_message>
docs(demo): despliegue Vercel jacsa-gestion-tpo y entregables
URL pública https://jacsa-gestion-tpo.vercel.app, límites de datos por
navegador/origen, QA local y en producción; README, 4.5 y Word regenerados.

Co-Authored-By: Claude Opus 5.5 <noreply@anthropic.com>
</commit_message>
<xml_diff>
--- a/entregables/Seccion 4 - Validacion.docx
+++ b/entregables/Seccion 4 - Validacion.docx
@@ -5733,7 +5733,73 @@
           <w:sz w:val="22"/>
           <w:szCs w:val="22"/>
         </w:rPr>
-        <w:t xml:space="preserve">, accesible únicamente mientras el servicio de demo está iniciado en el equipo local. No existe URL pública. La app no debe exponerse fuera de loopback. </w:t>
+        <w:t xml:space="preserve">, accesible únicamente mientras el servicio de demo está iniciado en el equipo local. El modo completo con Express y SQLite no se expone fuera de loopback. </w:t>
+      </w:r>
+      <w:r>
+        <w:rPr>
+          <w:rFonts w:ascii="Calibri" w:hAnsi="Calibri" w:eastAsia="Calibri" w:cs="Calibri"/>
+          <w:sz w:val="22"/>
+          <w:szCs w:val="22"/>
+          <w:b/>
+          <w:bCs/>
+        </w:rPr>
+        <w:t>URL pública (demo de navegador):</w:t>
+      </w:r>
+      <w:r>
+        <w:rPr>
+          <w:rFonts w:ascii="Calibri" w:hAnsi="Calibri" w:eastAsia="Calibri" w:cs="Calibri"/>
+          <w:sz w:val="22"/>
+          <w:szCs w:val="22"/>
+        </w:rPr>
+        <w:t xml:space="preserve"> </w:t>
+      </w:r>
+      <w:r>
+        <w:rPr>
+          <w:rFonts w:ascii="Calibri" w:hAnsi="Calibri" w:eastAsia="Calibri" w:cs="Calibri"/>
+          <w:sz w:val="22"/>
+          <w:szCs w:val="22"/>
+        </w:rPr>
+        <w:t>https://jacsa-gestion-tpo.vercel.app</w:t>
+      </w:r>
+      <w:r>
+        <w:rPr>
+          <w:rFonts w:ascii="Calibri" w:hAnsi="Calibri" w:eastAsia="Calibri" w:cs="Calibri"/>
+          <w:sz w:val="22"/>
+          <w:szCs w:val="22"/>
+        </w:rPr>
+        <w:t xml:space="preserve">, publicada en Vercel el 2026-10-30. Es un build estático sin servidor ni base en la nube: los datos se guardan en el </w:t>
+      </w:r>
+      <w:r>
+        <w:rPr>
+          <w:rFonts w:ascii="Calibri" w:hAnsi="Calibri" w:eastAsia="Calibri" w:cs="Calibri"/>
+          <w:sz w:val="22"/>
+          <w:szCs w:val="22"/>
+        </w:rPr>
+        <w:t>localStorage</w:t>
+      </w:r>
+      <w:r>
+        <w:rPr>
+          <w:rFonts w:ascii="Calibri" w:hAnsi="Calibri" w:eastAsia="Calibri" w:cs="Calibri"/>
+          <w:sz w:val="22"/>
+          <w:szCs w:val="22"/>
+        </w:rPr>
+        <w:t xml:space="preserve"> de cada navegador y origen, no se comparten entre dispositivos y el perfil activo es por pestaña. Los perfiles son de demostración, no un control de seguridad; usar solo datos ficticios. Se verificó con Playwright en un contexto nuevo: carga, cinco recorridos, persistencia tras recargar, reinicio confirmado y pestañas con roles distintos, sin llamadas a la API. Las cifras de QA del modo servidor no se atribuyen a esta demo. Detalle en </w:t>
+      </w:r>
+      <w:r>
+        <w:rPr>
+          <w:rFonts w:ascii="Calibri" w:hAnsi="Calibri" w:eastAsia="Calibri" w:cs="Calibri"/>
+          <w:sz w:val="22"/>
+          <w:szCs w:val="22"/>
+        </w:rPr>
+        <w:t>documentacion/despliegue-vercel.md</w:t>
+      </w:r>
+      <w:r>
+        <w:rPr>
+          <w:rFonts w:ascii="Calibri" w:hAnsi="Calibri" w:eastAsia="Calibri" w:cs="Calibri"/>
+          <w:sz w:val="22"/>
+          <w:szCs w:val="22"/>
+        </w:rPr>
+        <w:t xml:space="preserve">. </w:t>
       </w:r>
       <w:r>
         <w:rPr>

</xml_diff>

<commit_message>
docs(tpo): documentar demo estatica publicada en Vercel
</commit_message>
<xml_diff>
--- a/entregables/Seccion 4 - Validacion.docx
+++ b/entregables/Seccion 4 - Validacion.docx
@@ -5644,7 +5644,7 @@
           <w:sz w:val="22"/>
           <w:szCs w:val="22"/>
         </w:rPr>
-        <w:t xml:space="preserve">La corrida reportada comprende </w:t>
+        <w:t xml:space="preserve">En la </w:t>
       </w:r>
       <w:r>
         <w:rPr>
@@ -5654,7 +5654,25 @@
           <w:b/>
           <w:bCs/>
         </w:rPr>
-        <w:t>33/33 pruebas backend/API y 5/5 pruebas E2E Playwright</w:t>
+        <w:t>corrida vigente del modo servidor</w:t>
+      </w:r>
+      <w:r>
+        <w:rPr>
+          <w:rFonts w:ascii="Calibri" w:hAnsi="Calibri" w:eastAsia="Calibri" w:cs="Calibri"/>
+          <w:sz w:val="22"/>
+          <w:szCs w:val="22"/>
+        </w:rPr>
+        <w:t xml:space="preserve"> (Express + SQLite) se aprobaron </w:t>
+      </w:r>
+      <w:r>
+        <w:rPr>
+          <w:rFonts w:ascii="Calibri" w:hAnsi="Calibri" w:eastAsia="Calibri" w:cs="Calibri"/>
+          <w:sz w:val="22"/>
+          <w:szCs w:val="22"/>
+          <w:b/>
+          <w:bCs/>
+        </w:rPr>
+        <w:t>48/48 pruebas backend/API, 50/50 casos E2E y 3/3 pruebas del harness</w:t>
       </w:r>
       <w:r>
         <w:rPr>
@@ -5678,15 +5696,83 @@
           <w:sz w:val="22"/>
           <w:szCs w:val="22"/>
         </w:rPr>
-        <w:t xml:space="preserve"> terminó correctamente con TypeScript y Vite. El registro de ejecución, rutas probadas y datos observados está en </w:t>
-      </w:r>
-      <w:r>
-        <w:rPr>
-          <w:rFonts w:ascii="Calibri" w:hAnsi="Calibri" w:eastAsia="Calibri" w:cs="Calibri"/>
-          <w:sz w:val="22"/>
-          <w:szCs w:val="22"/>
-        </w:rPr>
-        <w:t>documentacion/evidencias-prototipo.md</w:t>
+        <w:t xml:space="preserve"> terminó correctamente con TypeScript y Vite. La suite E2E contiene 27 casos de navegador y 23 API-only. Las cifras anteriores de </w:t>
+      </w:r>
+      <w:r>
+        <w:rPr>
+          <w:rFonts w:ascii="Calibri" w:hAnsi="Calibri" w:eastAsia="Calibri" w:cs="Calibri"/>
+          <w:sz w:val="22"/>
+          <w:szCs w:val="22"/>
+          <w:b/>
+          <w:bCs/>
+        </w:rPr>
+        <w:t>33/33 backend y 5/5 E2E</w:t>
+      </w:r>
+      <w:r>
+        <w:rPr>
+          <w:rFonts w:ascii="Calibri" w:hAnsi="Calibri" w:eastAsia="Calibri" w:cs="Calibri"/>
+          <w:sz w:val="22"/>
+          <w:szCs w:val="22"/>
+        </w:rPr>
+        <w:t xml:space="preserve"> pertenecen a una corrida de referencia previa. Por separado, la demo estática </w:t>
+      </w:r>
+      <w:r>
+        <w:rPr>
+          <w:rFonts w:ascii="Calibri" w:hAnsi="Calibri" w:eastAsia="Calibri" w:cs="Calibri"/>
+          <w:sz w:val="22"/>
+          <w:szCs w:val="22"/>
+        </w:rPr>
+        <w:t>browser-demo</w:t>
+      </w:r>
+      <w:r>
+        <w:rPr>
+          <w:rFonts w:ascii="Calibri" w:hAnsi="Calibri" w:eastAsia="Calibri" w:cs="Calibri"/>
+          <w:sz w:val="22"/>
+          <w:szCs w:val="22"/>
+        </w:rPr>
+        <w:t xml:space="preserve"> aprobó </w:t>
+      </w:r>
+      <w:r>
+        <w:rPr>
+          <w:rFonts w:ascii="Calibri" w:hAnsi="Calibri" w:eastAsia="Calibri" w:cs="Calibri"/>
+          <w:sz w:val="22"/>
+          <w:szCs w:val="22"/>
+          <w:b/>
+          <w:bCs/>
+        </w:rPr>
+        <w:t>3/3 pruebas Playwright en local y 3/3 contra Vercel</w:t>
+      </w:r>
+      <w:r>
+        <w:rPr>
+          <w:rFonts w:ascii="Calibri" w:hAnsi="Calibri" w:eastAsia="Calibri" w:cs="Calibri"/>
+          <w:sz w:val="22"/>
+          <w:szCs w:val="22"/>
+        </w:rPr>
+        <w:t xml:space="preserve">, sin llamadas al backend. Los registros y límites de cada modalidad se detallan en </w:t>
+      </w:r>
+      <w:r>
+        <w:rPr>
+          <w:rFonts w:ascii="Calibri" w:hAnsi="Calibri" w:eastAsia="Calibri" w:cs="Calibri"/>
+          <w:sz w:val="22"/>
+          <w:szCs w:val="22"/>
+        </w:rPr>
+        <w:t>documentacion/qa-final.md</w:t>
+      </w:r>
+      <w:r>
+        <w:rPr>
+          <w:rFonts w:ascii="Calibri" w:hAnsi="Calibri" w:eastAsia="Calibri" w:cs="Calibri"/>
+          <w:sz w:val="22"/>
+          <w:szCs w:val="22"/>
+        </w:rPr>
+        <w:t xml:space="preserve"> y </w:t>
+      </w:r>
+      <w:r>
+        <w:rPr>
+          <w:rFonts w:ascii="Calibri" w:hAnsi="Calibri" w:eastAsia="Calibri" w:cs="Calibri"/>
+          <w:sz w:val="22"/>
+          <w:szCs w:val="22"/>
+        </w:rPr>
+        <w:t>documentacion/despliegue-vercel.md</w:t>
       </w:r>
       <w:r>
         <w:rPr>
@@ -5709,7 +5795,7 @@
           <w:b/>
           <w:bCs/>
         </w:rPr>
-        <w:t>URL local:</w:t>
+        <w:t>URL local (modo servidor):</w:t>
       </w:r>
       <w:r>
         <w:rPr>
@@ -5733,8 +5819,13 @@
           <w:sz w:val="22"/>
           <w:szCs w:val="22"/>
         </w:rPr>
-        <w:t xml:space="preserve">, accesible únicamente mientras el servicio de demo está iniciado en el equipo local. El modo completo con Express y SQLite no se expone fuera de loopback. </w:t>
-      </w:r>
+        <w:t>, accesible solo mientras se inicia localmente Express y SQLite. No debe exponerse fuera de loopback.</w:t>
+      </w:r>
+    </w:p>
+    <w:p>
+      <w:pPr>
+        <w:spacing w:before="0" w:after="100" w:line="276" w:lineRule="auto"/>
+      </w:pPr>
       <w:r>
         <w:rPr>
           <w:rFonts w:ascii="Calibri" w:hAnsi="Calibri" w:eastAsia="Calibri" w:cs="Calibri"/>
@@ -5743,7 +5834,7 @@
           <w:b/>
           <w:bCs/>
         </w:rPr>
-        <w:t>URL pública (demo de navegador):</w:t>
+        <w:t>URL pública (demo estática):</w:t>
       </w:r>
       <w:r>
         <w:rPr>
@@ -5759,15 +5850,15 @@
           <w:sz w:val="22"/>
           <w:szCs w:val="22"/>
         </w:rPr>
-        <w:t>https://jacsa-gestion-tpo.vercel.app</w:t>
-      </w:r>
-      <w:r>
-        <w:rPr>
-          <w:rFonts w:ascii="Calibri" w:hAnsi="Calibri" w:eastAsia="Calibri" w:cs="Calibri"/>
-          <w:sz w:val="22"/>
-          <w:szCs w:val="22"/>
-        </w:rPr>
-        <w:t xml:space="preserve">, publicada en Vercel el 2026-10-30. Es un build estático sin servidor ni base en la nube: los datos se guardan en el </w:t>
+        <w:t>https://jacsa-gestion-tpo.vercel.app (https://jacsa-gestion-tpo.vercel.app)</w:t>
+      </w:r>
+      <w:r>
+        <w:rPr>
+          <w:rFonts w:ascii="Calibri" w:hAnsi="Calibri" w:eastAsia="Calibri" w:cs="Calibri"/>
+          <w:sz w:val="22"/>
+          <w:szCs w:val="22"/>
+        </w:rPr>
+        <w:t xml:space="preserve">. Se publica solo el frontend; no hay servidor ni base de datos en la nube. Los datos se guardan en </w:t>
       </w:r>
       <w:r>
         <w:rPr>
@@ -5783,24 +5874,29 @@
           <w:sz w:val="22"/>
           <w:szCs w:val="22"/>
         </w:rPr>
-        <w:t xml:space="preserve"> de cada navegador y origen, no se comparten entre dispositivos y el perfil activo es por pestaña. Los perfiles son de demostración, no un control de seguridad; usar solo datos ficticios. Se verificó con Playwright en un contexto nuevo: carga, cinco recorridos, persistencia tras recargar, reinicio confirmado y pestañas con roles distintos, sin llamadas a la API. Las cifras de QA del modo servidor no se atribuyen a esta demo. Detalle en </w:t>
-      </w:r>
-      <w:r>
-        <w:rPr>
-          <w:rFonts w:ascii="Calibri" w:hAnsi="Calibri" w:eastAsia="Calibri" w:cs="Calibri"/>
-          <w:sz w:val="22"/>
-          <w:szCs w:val="22"/>
-        </w:rPr>
-        <w:t>documentacion/despliegue-vercel.md</w:t>
-      </w:r>
-      <w:r>
-        <w:rPr>
-          <w:rFonts w:ascii="Calibri" w:hAnsi="Calibri" w:eastAsia="Calibri" w:cs="Calibri"/>
-          <w:sz w:val="22"/>
-          <w:szCs w:val="22"/>
-        </w:rPr>
-        <w:t xml:space="preserve">. </w:t>
-      </w:r>
+        <w:t xml:space="preserve"> de ese navegador y origen, no se comparten entre dispositivos y el perfil activo se guarda por pestaña. Los perfiles son de demostración, no un control de seguridad; usar solo datos ficticios. La demo fue comprobada con cinco recorridos, persistencia tras recargar, reinicio local confirmado y pestañas con roles distintos, sin llamadas a </w:t>
+      </w:r>
+      <w:r>
+        <w:rPr>
+          <w:rFonts w:ascii="Calibri" w:hAnsi="Calibri" w:eastAsia="Calibri" w:cs="Calibri"/>
+          <w:sz w:val="22"/>
+          <w:szCs w:val="22"/>
+        </w:rPr>
+        <w:t>/api/</w:t>
+      </w:r>
+      <w:r>
+        <w:rPr>
+          <w:rFonts w:ascii="Calibri" w:hAnsi="Calibri" w:eastAsia="Calibri" w:cs="Calibri"/>
+          <w:sz w:val="22"/>
+          <w:szCs w:val="22"/>
+        </w:rPr>
+        <w:t>.</w:t>
+      </w:r>
+    </w:p>
+    <w:p>
+      <w:pPr>
+        <w:spacing w:before="0" w:after="100" w:line="276" w:lineRule="auto"/>
+      </w:pPr>
       <w:r>
         <w:rPr>
           <w:rFonts w:ascii="Calibri" w:hAnsi="Calibri" w:eastAsia="Calibri" w:cs="Calibri"/>
@@ -5865,8 +5961,13 @@
           <w:sz w:val="22"/>
           <w:szCs w:val="22"/>
         </w:rPr>
-        <w:t xml:space="preserve">); se incorporan como anexo visual en los documentos de entrega. La primera muestra ART-001, dos gruesas y vista previa $21.600 + IVA $4.536 = $26.136; las demás documentan cotizaciones, faltantes, pedidos, cola/estado Listo, portal/avisos y acceso móvil. </w:t>
-      </w:r>
+        <w:t>); se incorporan como anexo visual en los documentos de entrega. La primera muestra ART-001, dos gruesas y vista previa $21.600 + IVA $4.536 = $26.136; las demás documentan cotizaciones, faltantes, pedidos, cola/estado Listo, portal/avisos y acceso móvil.</w:t>
+      </w:r>
+    </w:p>
+    <w:p>
+      <w:pPr>
+        <w:spacing w:before="0" w:after="100" w:line="276" w:lineRule="auto"/>
+      </w:pPr>
       <w:r>
         <w:rPr>
           <w:rFonts w:ascii="Calibri" w:hAnsi="Calibri" w:eastAsia="Calibri" w:cs="Calibri"/>
@@ -5883,8 +5984,13 @@
           <w:sz w:val="22"/>
           <w:szCs w:val="22"/>
         </w:rPr>
-        <w:t xml:space="preserve"> se ejecutaron pruebas E2E automatizadas; se probó la configuración de login/portal móvil a 390 × 844 px. No se midió usabilidad con operarios, no se observó a usuarios, y no se midió ni afirmó el criterio de tres toques. </w:t>
-      </w:r>
+        <w:t xml:space="preserve"> se ejecutaron pruebas E2E automatizadas; se probó la configuración de login/portal móvil a 390 × 844 px. No se midió usabilidad con operarios, no se observó a usuarios y no se midió ni afirmó el criterio de tres toques.</w:t>
+      </w:r>
+    </w:p>
+    <w:p>
+      <w:pPr>
+        <w:spacing w:before="0" w:after="100" w:line="276" w:lineRule="auto"/>
+      </w:pPr>
       <w:r>
         <w:rPr>
           <w:rFonts w:ascii="Calibri" w:hAnsi="Calibri" w:eastAsia="Calibri" w:cs="Calibri"/>
@@ -5901,7 +6007,7 @@
           <w:sz w:val="22"/>
           <w:szCs w:val="22"/>
         </w:rPr>
-        <w:t xml:space="preserve"> RF01/RF02 se usan solo en lectura de catálogo/ficha seed, sin validar CRUD completo. RF23 (orden de compra/recepción), RF24 (entrega/remito), RF25 (facturación), RF27 (reportes), exportación JSON, pagos/cobranzas bancarias, integraciones reales, IoT y datos productivos no forman parte de esta implementación ni de la corrida.</w:t>
+        <w:t xml:space="preserve"> RF01/RF02 se usan solo en lectura de catálogo/ficha seed, sin validar CRUD completo. RF23 (orden de compra/recepción), RF24 (entrega/remito), RF25 (facturación), RF27 (reportes), exportación JSON, pagos/cobranzas bancarias, integraciones reales, IoT y datos productivos no forman parte de esta implementación ni de las corridas.</w:t>
       </w:r>
     </w:p>
     <w:p>

</xml_diff>